<commit_message>
Revision de codigo aprobada (PR #9 y #10) y aceptacion del PO de las historias del Sprint 2
FS-HU-02 y FS-HU-15 a FS-HU-20 aceptadas. Revision de 2 h de Luis registrada en el Sprint Backlog del Sprint 2. Matriz de control de cambio, EDT y analisis de ingresos, Guia 2.4, control y README actualizados.
</commit_message>
<xml_diff>
--- a/FASE 2/Evidencias Grupales/2.4_GuiaEstudiante_Fase 2_DesarrolloProyecto APT (Español).docx
+++ b/FASE 2/Evidencias Grupales/2.4_GuiaEstudiante_Fase 2_DesarrolloProyecto APT (Español).docx
@@ -889,7 +889,7 @@
                 <w:color w:val="000000"/>
                 <w:sz w:val="20"/>
               </w:rPr>
-              <w:t>Inicio con sesión y búsqueda (adelanto del Sprint 3): a partir del mockup del Inicio entregado por el Product Owner, el 03-10-2026 se implementaron el Inicio con sesión, con menú lateral, barra inferior en celular y menú de la cuenta (FS-HU-21); la búsqueda de profesionales por texto con filtros, orden y cercanía (FS-HU-22 y FS-HU-05); los favoritos (FS-HU-23), y las calificaciones y reseñas (FS-HU-24). También se corrigió que el logo llevara al perfil y se quitó del encabezado el falso buscador (el acceso a Profesionales queda en el menú lateral, la barra inferior y los accesos rápidos del Inicio). El sistema suma 229 pruebas automatizadas (129 en el backend y 100 en el frontend) y 49 casos de prueba en la planilla.</w:t>
+              <w:t>Inicio con sesión y búsqueda (adelanto del Sprint 3): a partir del mockup del Inicio entregado por el Product Owner, el 03-10-2026 se implementaron el Inicio con sesión, con menú lateral, barra inferior en celular y menú de la cuenta (FS-HU-21); la búsqueda de profesionales por texto con filtros, orden y cercanía (FS-HU-22 y FS-HU-05); los favoritos (FS-HU-23), y las calificaciones y reseñas (FS-HU-24). También se corrigió que el logo llevara al perfil y se quitó del encabezado el falso buscador (el acceso a Profesionales queda en el menú lateral, la barra inferior y los accesos rápidos del Inicio). El sistema suma 229 pruebas automatizadas (129 en el backend y 100 en el frontend) y 49 casos de prueba en la planilla. El 03-10-2026 Luis Méndez aprobó la revisión de código de estas historias (PR #10, ya fusionado) y la de las historias del Sprint 2 (PR #9), y el Product Owner aceptó las historias del Sprint 2.</w:t>
             </w:r>
           </w:p>
         </w:tc>
@@ -1147,6 +1147,50 @@
                 <w:sz w:val="20"/>
               </w:rPr>
               <w:t>44 pruebas unitarias, de componentes y de integración de la API que validan los criterios de aceptación y controles de seguridad (acceso sin token, token expirado y mensaje genérico ante credenciales incorrectas), vinculadas a la competencia C1.</w:t>
+            </w:r>
+          </w:p>
+          <w:p>
+            <w:pPr>
+              <w:spacing w:after="80"/>
+            </w:pPr>
+            <w:r>
+              <w:rPr>
+                <w:rFonts w:ascii="Calibri" w:hAnsi="Calibri"/>
+                <w:b/>
+                <w:color w:val="000000"/>
+                <w:sz w:val="20"/>
+              </w:rPr>
+              <w:t xml:space="preserve">Matriz de Control de Cambio: </w:t>
+            </w:r>
+            <w:r>
+              <w:rPr>
+                <w:rFonts w:ascii="Calibri" w:hAnsi="Calibri"/>
+                <w:color w:val="000000"/>
+                <w:sz w:val="20"/>
+              </w:rPr>
+              <w:t>registra las 11 solicitudes de cambio del proyecto al 03-10-2026 (10 aceptadas y 1 rechazada), con su solicitante, tipo, urgencia, impacto, historias de usuario y casos de uso relacionados, y respalda los ajustes descritos en la sección 3 (C2).</w:t>
+            </w:r>
+          </w:p>
+          <w:p>
+            <w:pPr>
+              <w:spacing w:after="80"/>
+            </w:pPr>
+            <w:r>
+              <w:rPr>
+                <w:rFonts w:ascii="Calibri" w:hAnsi="Calibri"/>
+                <w:b/>
+                <w:color w:val="000000"/>
+                <w:sz w:val="20"/>
+              </w:rPr>
+              <w:t xml:space="preserve">EDT y análisis de ingresos: </w:t>
+            </w:r>
+            <w:r>
+              <w:rPr>
+                <w:rFonts w:ascii="Calibri" w:hAnsi="Calibri"/>
+                <w:color w:val="000000"/>
+                <w:sz w:val="20"/>
+              </w:rPr>
+              <w:t>descompone el proyecto en 48 actividades organizadas por fase y estima 957 horas-hombre por rol, valorizadas en $3.773.056 según el análisis de ingresos. Las horas del Sprint 1 son las reales y las demás historias se estiman con la relación observada en ese sprint (5,4 horas por punto de historia) (C2).</w:t>
             </w:r>
           </w:p>
           <w:p>
@@ -3578,7 +3622,7 @@
                 <w:color w:val="000000"/>
                 <w:sz w:val="16"/>
               </w:rPr>
-              <w:t>Adelantada al 03-10-2026: búsqueda por texto con filtros (FS-HU-22) y por cercanía (FS-HU-05) con la ubicación del navegador y la distancia calculada en MySQL (ST_Distance_Sphere), sin usar Geocoding. Falta la revisión de código y PR.</w:t>
+              <w:t>Adelantada al 03-10-2026: búsqueda por texto con filtros (FS-HU-22) y por cercanía (FS-HU-05) con la ubicación del navegador y la distancia calculada en MySQL (ST_Distance_Sphere), sin usar Geocoding. Revisión aprobada y fusionada en main el 03-10-2026 (PR #10).</w:t>
             </w:r>
           </w:p>
         </w:tc>
@@ -3735,7 +3779,7 @@
                 <w:color w:val="000000"/>
                 <w:sz w:val="16"/>
               </w:rPr>
-              <w:t>Filtros, orden y panel de filtros en celular listos el 03-10-2026 (FS-HU-22); el mapa (FS-HU-06) sigue pendiente para el Sprint 3.</w:t>
+              <w:t>Filtros, orden y panel de filtros en celular listos el 03-10-2026 (FS-HU-22); el mapa (FS-HU-06) sigue pendiente para el Sprint 3. Revisión aprobada y fusionada en main el 03-10-2026 (PR #10).</w:t>
             </w:r>
           </w:p>
         </w:tc>
@@ -4972,7 +5016,7 @@
                 <w:color w:val="000000"/>
                 <w:sz w:val="16"/>
               </w:rPr>
-              <w:t>En curso</w:t>
+              <w:t>Completado</w:t>
             </w:r>
           </w:p>
         </w:tc>
@@ -4991,7 +5035,7 @@
                 <w:color w:val="000000"/>
                 <w:sz w:val="16"/>
               </w:rPr>
-              <w:t>Actividad agregada: historias nuevas de la épica E1 (DAS v1.6). Al 21-09-2026: identidad visual, registro con rol, "Recordarme" y recuperación de contraseña implementados y probados (CP-008 a CP-013); acceso con Google en espera.</w:t>
+              <w:t>Actividad agregada: historias nuevas de la épica E1 (DAS v1.6). Al 21-09-2026: identidad visual, registro con rol, "Recordarme" y recuperación de contraseña implementados y probados (CP-008 a CP-013); acceso con Google en espera. 03-10-2026: revisión de código aprobada por Luis Méndez (PR #9) y aceptada por el Product Owner. Quedan pendientes el correo real (SMTP) de FS-HU-15 y los casos CP-024 y CP-025 de FS-HU-16.</w:t>
             </w:r>
           </w:p>
         </w:tc>
@@ -5129,7 +5173,7 @@
                 <w:color w:val="000000"/>
                 <w:sz w:val="16"/>
               </w:rPr>
-              <w:t>En curso</w:t>
+              <w:t>Completado</w:t>
             </w:r>
           </w:p>
         </w:tc>
@@ -5148,7 +5192,7 @@
                 <w:color w:val="000000"/>
                 <w:sz w:val="16"/>
               </w:rPr>
-              <w:t>Actividad agregada: historias nuevas de la épica E1 (DAS v1.7). Al 21-09-2026: implementadas y probadas (CP-014 a CP-019).</w:t>
+              <w:t>Actividad agregada: historias nuevas de la épica E1 (DAS v1.7). Al 21-09-2026: implementadas y probadas (CP-014 a CP-019). 03-10-2026: revisión de código aprobada por Luis Méndez (PR #9) y aceptada por el Product Owner.</w:t>
             </w:r>
           </w:p>
         </w:tc>
@@ -5286,7 +5330,7 @@
                 <w:color w:val="000000"/>
                 <w:sz w:val="16"/>
               </w:rPr>
-              <w:t>En curso</w:t>
+              <w:t>Completado</w:t>
             </w:r>
           </w:p>
         </w:tc>
@@ -5305,7 +5349,7 @@
                 <w:color w:val="000000"/>
                 <w:sz w:val="16"/>
               </w:rPr>
-              <w:t>Actividad agregada: historia nueva de la épica E1 (DAS v1.11). Al 23-09-2026: implementada y probada (CP-020 a CP-023); falta la revisión de código. El 03-10-2026 se rediseñó con la propuesta "Tu salud y bienestar, en un solo lugar" y, con la sesión iniciada, lleva al Inicio (CP-036 y CP-037).</w:t>
+              <w:t>Actividad agregada: historia nueva de la épica E1 (DAS v1.11). Al 23-09-2026: implementada y probada (CP-020 a CP-023); falta la revisión de código. El 03-10-2026 se rediseñó con la propuesta "Tu salud y bienestar, en un solo lugar" y, con la sesión iniciada, lleva al Inicio (CP-036 y CP-037). 03-10-2026: revisión de código aprobada por Luis Méndez (PR #9) y aceptada por el Product Owner.</w:t>
             </w:r>
           </w:p>
         </w:tc>
@@ -5462,7 +5506,7 @@
                 <w:color w:val="000000"/>
                 <w:sz w:val="16"/>
               </w:rPr>
-              <w:t>Actividad agregada: historias nuevas del 03-10-2026 (DAS v1.14), implementadas y probadas antes del inicio del Sprint 3 (CP-036 a CP-049); falta la revisión de código y PR.</w:t>
+              <w:t>Actividad agregada: historias nuevas del 03-10-2026 (DAS v1.14), implementadas y probadas antes del inicio del Sprint 3 (CP-036 a CP-049); revisión aprobada por Luis Méndez y fusionadas en main el 03-10-2026 (PR #10).</w:t>
             </w:r>
           </w:p>
         </w:tc>
@@ -7165,7 +7209,7 @@
                 <w:color w:val="000000"/>
                 <w:sz w:val="20"/>
               </w:rPr>
-              <w:t>Sprint 2: en ejecución dentro de su período (semanas 7 y 8, hasta el 04-10-2026). Están implementadas y probadas FS-HU-15 a FS-HU-20 y FS-HU-03 (fusionada el 02-10-2026, PR #8). FS-HU-04 y FS-HU-13 no se han iniciado; el equipo definirá en la planificación del Sprint 3 cuándo se abordan.</w:t>
+              <w:t>Sprint 2: en ejecución dentro de su período (termina el 04-10-2026). FS-HU-02 (tipo de cuenta) y FS-HU-15 a FS-HU-20 tienen la revisión de código aprobada (PR #9, Luis Méndez) y el Product Owner las aceptó el 03-10-2026; FS-HU-15 queda con la observación de configurar el correo real y FS-HU-16 con los casos CP-024 y CP-025 pendientes. FS-HU-03 está fusionada (PR #8, revisada por el Product Owner) y falta su aceptación. FS-HU-04 y FS-HU-13 no se han iniciado; el equipo definirá en la planificación del Sprint 3 cuándo se abordan.</w:t>
             </w:r>
           </w:p>
           <w:p>
@@ -7179,7 +7223,7 @@
                 <w:color w:val="000000"/>
                 <w:sz w:val="20"/>
               </w:rPr>
-              <w:t>Sprint 3 (desde el 05-10-2026): FS-HU-05 y FS-HU-21 a FS-HU-24 ya se implementaron el 03-10-2026 y quedan pendientes de revisión de código; FS-HU-06 y FS-HU-14 se inician en el sprint. Sprints 4 y 5: aún no se inician porque corresponden a semanas posteriores según la Carta Gantt.</w:t>
+              <w:t>Sprint 3 (desde el 05-10-2026): FS-HU-05 y FS-HU-21 a FS-HU-24 ya se implementaron, revisaron y fusionaron el 03-10-2026 (PR #10) y falta su aceptación; FS-HU-06 y FS-HU-14 se inician en el sprint. Sprints 4 y 5: aún no se inician porque corresponden a semanas posteriores según la Carta Gantt.</w:t>
             </w:r>
           </w:p>
           <w:p>

</xml_diff>

<commit_message>
FS-HU-03 aceptada por el PO (PR #8 revisado)
Product Backlog, Sprint Backlog del Sprint 2, Guia 2.4 y control actualizados.
</commit_message>
<xml_diff>
--- a/FASE 2/Evidencias Grupales/2.4_GuiaEstudiante_Fase 2_DesarrolloProyecto APT (Español).docx
+++ b/FASE 2/Evidencias Grupales/2.4_GuiaEstudiante_Fase 2_DesarrolloProyecto APT (Español).docx
@@ -3308,7 +3308,7 @@
                 <w:color w:val="000000"/>
                 <w:sz w:val="16"/>
               </w:rPr>
-              <w:t>FS-HU-03 la implementó Nicolás Silva y se fusionó el 02-10-2026 (PR #8): tablas profesionales y establecimientos y API del listado. El 03-10-2026 se agregaron comuna, modalidad, favoritos y reseñas. La edición de la ficha (FS-HU-04) no se ha iniciado.</w:t>
+              <w:t>FS-HU-03 la implementó Nicolás Silva y se fusionó el 02-10-2026 (PR #8): tablas profesionales y establecimientos y API del listado. El 03-10-2026 se agregaron comuna, modalidad, favoritos y reseñas. La edición de la ficha (FS-HU-04) no se ha iniciado. FS-HU-03 aceptada por el Product Owner el 03-10-2026.</w:t>
             </w:r>
           </w:p>
         </w:tc>
@@ -7209,7 +7209,7 @@
                 <w:color w:val="000000"/>
                 <w:sz w:val="20"/>
               </w:rPr>
-              <w:t>Sprint 2: en ejecución dentro de su período (termina el 04-10-2026). FS-HU-02 (tipo de cuenta) y FS-HU-15 a FS-HU-20 tienen la revisión de código aprobada (PR #9, Luis Méndez) y el Product Owner las aceptó el 03-10-2026; FS-HU-15 queda con la observación de configurar el correo real y FS-HU-16 con los casos CP-024 y CP-025 pendientes. FS-HU-03 está fusionada (PR #8, revisada por el Product Owner) y falta su aceptación. FS-HU-04 y FS-HU-13 no se han iniciado; el equipo definirá en la planificación del Sprint 3 cuándo se abordan.</w:t>
+              <w:t>Sprint 2: en ejecución dentro de su período (termina el 04-10-2026). FS-HU-02 (tipo de cuenta) y FS-HU-15 a FS-HU-20 tienen la revisión de código aprobada (PR #9, Luis Méndez) y el Product Owner las aceptó el 03-10-2026; FS-HU-15 queda con la observación de configurar el correo real y FS-HU-16 con los casos CP-024 y CP-025 pendientes. FS-HU-03 está fusionada (PR #8, revisada por el Product Owner) y fue aceptada el 03-10-2026. FS-HU-04 y FS-HU-13 no se han iniciado; el equipo definirá en la planificación del Sprint 3 cuándo se abordan.</w:t>
             </w:r>
           </w:p>
           <w:p>

</xml_diff>

<commit_message>
Concilia backlogs tras el PR #21 y sube el cierre del Sprint 2
Sprint 2: restaura la versión oficial de cierre del 06-10-2026 (30 tareas, 92 h reales), la misma del Drive. Sprint 3: agrega las tareas arrastradas de FS-HU-04 y FS-HU-15 (SMTP). Product Backlog: FS-HU-04 en el Sprint 3. Agrega el Documento del Sprint Backlog 2, el Documento validando, los burndown y su plantilla; Guía 2.4 y control con el cierre del Sprint 2.
</commit_message>
<xml_diff>
--- a/FASE 2/Evidencias Grupales/2.4_GuiaEstudiante_Fase 2_DesarrolloProyecto APT (Español).docx
+++ b/FASE 2/Evidencias Grupales/2.4_GuiaEstudiante_Fase 2_DesarrolloProyecto APT (Español).docx
@@ -636,7 +636,7 @@
                 <w:color w:val="000000"/>
                 <w:sz w:val="20"/>
               </w:rPr>
-              <w:t>Borrador en construcción — actualizado al 03-10-2026.</w:t>
+              <w:t xml:space="preserve">Borrador en construcción — actualizado al 06-10-2026.</w:t>
             </w:r>
           </w:p>
           <w:p>
@@ -3308,7 +3308,7 @@
                 <w:color w:val="000000"/>
                 <w:sz w:val="16"/>
               </w:rPr>
-              <w:t>FS-HU-03 la implementó Nicolás Silva y se fusionó el 02-10-2026 (PR #8): tablas profesionales y establecimientos y API del listado. El 03-10-2026 se agregaron comuna, modalidad, favoritos y reseñas. La edición de la ficha (FS-HU-04) no se ha iniciado. FS-HU-03 aceptada por el Product Owner el 03-10-2026.</w:t>
+              <w:t xml:space="preserve">FS-HU-03 la implementó Nicolás Silva y se fusionó el 02-10-2026 (PR #8): tablas profesionales y establecimientos y API del listado. El 03-10-2026 se agregaron comuna, modalidad, favoritos y reseñas. La edición de la ficha (FS-HU-04) la implementó Luis Méndez en el PR #11 (03-10-2026), en corrección antes de fusionar; pasa al Sprint 3. FS-HU-03 aceptada por el Product Owner el 03-10-2026.</w:t>
             </w:r>
           </w:p>
         </w:tc>
@@ -3465,7 +3465,7 @@
                 <w:color w:val="000000"/>
                 <w:sz w:val="16"/>
               </w:rPr>
-              <w:t>Listado listo (PR #8). El 03-10-2026 se agregó la ficha de cada profesional con sus reseñas; el perfil editable por el profesional (FS-HU-04) no se ha iniciado.</w:t>
+              <w:t xml:space="preserve">Listado listo (PR #8). El 03-10-2026 se agregó la ficha de cada profesional con sus reseñas; el perfil editable por el profesional (FS-HU-04) está en el PR #11 de Luis Méndez, en corrección antes de fusionar; pasa al Sprint 3.</w:t>
             </w:r>
           </w:p>
         </w:tc>
@@ -4821,7 +4821,7 @@
                 <w:color w:val="000000"/>
                 <w:sz w:val="16"/>
               </w:rPr>
-              <w:t>Por asignar en la planificación del Sprint 2</w:t>
+              <w:t xml:space="preserve">Por asignar en la planificación del Sprint 3</w:t>
             </w:r>
           </w:p>
         </w:tc>
@@ -4878,7 +4878,7 @@
                 <w:color w:val="000000"/>
                 <w:sz w:val="16"/>
               </w:rPr>
-              <w:t>Actividad agregada: épica E7 Reservas.</w:t>
+              <w:t xml:space="preserve">Actividad agregada: épica E7 Reservas. No se inició en el Sprint 2; pasa al Sprint 3.</w:t>
             </w:r>
           </w:p>
         </w:tc>
@@ -4978,7 +4978,7 @@
                 <w:color w:val="000000"/>
                 <w:sz w:val="16"/>
               </w:rPr>
-              <w:t>Por asignar en la planificación del Sprint 2</w:t>
+              <w:t xml:space="preserve">Rodrigo Cárcamo Rojas</w:t>
             </w:r>
           </w:p>
         </w:tc>
@@ -5135,7 +5135,7 @@
                 <w:color w:val="000000"/>
                 <w:sz w:val="16"/>
               </w:rPr>
-              <w:t>Por asignar en la planificación del Sprint 2</w:t>
+              <w:t xml:space="preserve">Rodrigo Cárcamo Rojas</w:t>
             </w:r>
           </w:p>
         </w:tc>
@@ -7209,7 +7209,7 @@
                 <w:color w:val="000000"/>
                 <w:sz w:val="20"/>
               </w:rPr>
-              <w:t>Sprint 2: en ejecución dentro de su período (termina el 04-10-2026). FS-HU-02 (tipo de cuenta) y FS-HU-15 a FS-HU-20 tienen la revisión de código aprobada (PR #9, Luis Méndez) y el Product Owner las aceptó el 03-10-2026; FS-HU-15 queda con la observación de configurar el correo real y FS-HU-16 con los casos CP-024 y CP-025 pendientes. FS-HU-03 está fusionada (PR #8, revisada por el Product Owner) y fue aceptada el 03-10-2026. FS-HU-04 y FS-HU-13 no se han iniciado; el equipo definirá en la planificación del Sprint 3 cuándo se abordan.</w:t>
+              <w:t xml:space="preserve">Sprint 2: cerrado el 04-10-2026, dentro de su período. Se realizaron 92 de las 110 horas estimadas (Rodrigo Cárcamo Rojas 51, Nicolás Silva 23 y Luis Méndez 18), registradas al cierre según el trabajo entregado en GitHub. El Product Owner aceptó el 03-10-2026 FS-HU-02 (tipo de cuenta), FS-HU-03 y FS-HU-15 a FS-HU-20, con la revisión de código aprobada en los PR #8 y #9; FS-HU-15 queda con la observación de configurar el correo real y FS-HU-16 con los casos CP-024 y CP-025 pendientes. FS-HU-04 (implementada por Luis Méndez en el PR #11, en corrección antes de fusionar) y FS-HU-13 (no iniciada) pasan al Sprint 3. Evidencias: Documento Sprint Backlog 2, Documento Validando Sprint 2 y burndown del Sprint 2; la retrospectiva del Sprint 2 está pendiente de las respuestas del equipo.</w:t>
             </w:r>
           </w:p>
           <w:p>
@@ -7223,7 +7223,7 @@
                 <w:color w:val="000000"/>
                 <w:sz w:val="20"/>
               </w:rPr>
-              <w:t>Sprint 3 (desde el 05-10-2026): FS-HU-05 y FS-HU-21 a FS-HU-24 ya se implementaron, revisaron y fusionaron el 03-10-2026 (PR #10) y falta su aceptación; FS-HU-06 y FS-HU-14 se inician en el sprint. Sprints 4 y 5: aún no se inician porque corresponden a semanas posteriores según la Carta Gantt.</w:t>
+              <w:t xml:space="preserve">Sprint 3 (desde el 05-10-2026): FS-HU-05 y FS-HU-21 a FS-HU-24 ya se implementaron, revisaron y fusionaron el 03-10-2026 (PR #10) y falta su aceptación; FS-HU-04 y FS-HU-13 vienen del Sprint 2, y FS-HU-06 y FS-HU-14 se inician en el sprint. Sprints 4 y 5: aún no se inician porque corresponden a semanas posteriores según la Carta Gantt.</w:t>
             </w:r>
           </w:p>
           <w:p>

</xml_diff>

<commit_message>
Registra decisiones del PO, casos CP-069 a CP-078 y defectos 25 y 26
FS-HU-04 aceptada por el PO; FS-HU-12 en proceso en el Sprint 3. Planilla con 78 casos (75 aprobados) y celdas de CP-061 a CP-068 ordenadas. Registro de Defectos con los defectos 25 (corregido) y 26 (abierto, PR #22). Guía 2.4 y control actualizados al 12-10-2026.
</commit_message>
<xml_diff>
--- a/FASE 2/Evidencias Grupales/2.4_GuiaEstudiante_Fase 2_DesarrolloProyecto APT (Español).docx
+++ b/FASE 2/Evidencias Grupales/2.4_GuiaEstudiante_Fase 2_DesarrolloProyecto APT (Español).docx
@@ -636,7 +636,7 @@
                 <w:color w:val="000000"/>
                 <w:sz w:val="20"/>
               </w:rPr>
-              <w:t xml:space="preserve">Borrador en construcción — actualizado al 06-10-2026.</w:t>
+              <w:t>Borrador en construcción — actualizado al 12-10-2026.</w:t>
             </w:r>
           </w:p>
           <w:p>
@@ -685,7 +685,7 @@
                 <w:color w:val="000000"/>
                 <w:sz w:val="20"/>
               </w:rPr>
-              <w:t>Documento de Arquitectura del Sistema (DAS) v1.14: se documentó la arquitectura con el modelo 4+1 (casos de uso, vista lógica, procesos, desarrollo y física), escenarios de calidad, decisiones de diseño con alternativas evaluadas y análisis de reutilización.</w:t>
+              <w:t>Documento de Arquitectura del Sistema (DAS) v1.21: se documentó la arquitectura con el modelo 4+1 (casos de uso, vista lógica, procesos, desarrollo y física), escenarios de calidad, decisiones de diseño con alternativas evaluadas y análisis de reutilización.</w:t>
             </w:r>
           </w:p>
           <w:p>
@@ -699,7 +699,7 @@
                 <w:color w:val="000000"/>
                 <w:sz w:val="20"/>
               </w:rPr>
-              <w:t>Modelo de datos: se definió el modelo relacional completo del MVP (14 tablas, incluidas las de reservas, la de códigos de recuperación de contraseña, la de información de salud y, desde el 03-10-2026, las de favoritos y reseñas) con su diccionario de datos, restricciones, índices y reglas de integridad referencial. Esto avanza el objetivo específico "Diseñar un modelo de datos relacional y escalable en MySQL".</w:t>
+              <w:t>Modelo de datos: se definió el modelo relacional completo del MVP (15 tablas, 12 de ellas ya implementadas al 12-10-2026, incluidas las de reservas, la de códigos de recuperación de contraseña, la de información de salud y, desde el 03-10-2026, las de favoritos y reseñas) con su diccionario de datos, restricciones, índices y reglas de integridad referencial. Esto avanza el objetivo específico "Diseñar un modelo de datos relacional y escalable en MySQL".</w:t>
             </w:r>
           </w:p>
           <w:p>
@@ -890,6 +890,62 @@
                 <w:sz w:val="20"/>
               </w:rPr>
               <w:t>Inicio con sesión y búsqueda (adelanto del Sprint 3): a partir del mockup del Inicio entregado por el Product Owner, el 03-10-2026 se implementaron el Inicio con sesión, con menú lateral, barra inferior en celular y menú de la cuenta (FS-HU-21); la búsqueda de profesionales por texto con filtros, orden y cercanía (FS-HU-22 y FS-HU-05); los favoritos (FS-HU-23), y las calificaciones y reseñas (FS-HU-24). También se corrigió que el logo llevara al perfil y se quitó del encabezado el falso buscador (el acceso a Profesionales queda en el menú lateral, la barra inferior y los accesos rápidos del Inicio). El sistema suma 229 pruebas automatizadas (129 en el backend y 100 en el frontend) y 49 casos de prueba en la planilla. El 03-10-2026 Luis Méndez aprobó la revisión de código de estas historias (PR #10, ya fusionado) y la de las historias del Sprint 2 (PR #9), y el Product Owner aceptó las historias del Sprint 2.</w:t>
+            </w:r>
+          </w:p>
+          <w:p>
+            <w:pPr>
+              <w:spacing w:after="80"/>
+            </w:pPr>
+            <w:r>
+              <w:rPr>
+                <w:rFonts w:ascii="Calibri" w:hAnsi="Calibri"/>
+                <w:b/>
+                <w:color w:val="000000"/>
+                <w:sz w:val="20"/>
+              </w:rPr>
+              <w:t>Perfil y espacio del profesional (Sprint 3): la ficha editable del profesional (FS-HU-04) se fusionó el 08-10-2026 (PR #12, de Luis Méndez con ajustes de Rodrigo Cárcamo Rojas) y el 09-10-2026 se agregó la elección del perfil después del registro y un espacio propio para el profesional (PR #13). El Product Owner aceptó FS-HU-04 el 12-10-2026.</w:t>
+            </w:r>
+          </w:p>
+          <w:p>
+            <w:pPr>
+              <w:spacing w:after="80"/>
+            </w:pPr>
+            <w:r>
+              <w:rPr>
+                <w:rFonts w:ascii="Calibri" w:hAnsi="Calibri"/>
+                <w:b/>
+                <w:color w:val="000000"/>
+                <w:sz w:val="20"/>
+              </w:rPr>
+              <w:t>Verificación de profesionales y panel del administrador (FS-HU-12): Luis Méndez la implementó durante el Sprint 3 (PR #15, #19 y #20, fusionados el 10 y el 11-10-2026): solicitud de verificación con documentos, revisión con aprobación, rechazo o revocación con motivo, insignia «Verificado» y un panel con Dashboard, Profesionales, Verificaciones, Usuarios y Reportes. El Product Owner la reubicó del Sprint 5 al Sprint 3; falta su aceptación.</w:t>
+            </w:r>
+          </w:p>
+          <w:p>
+            <w:pPr>
+              <w:spacing w:after="80"/>
+            </w:pPr>
+            <w:r>
+              <w:rPr>
+                <w:rFonts w:ascii="Calibri" w:hAnsi="Calibri"/>
+                <w:b/>
+                <w:color w:val="000000"/>
+                <w:sz w:val="20"/>
+              </w:rPr>
+              <w:t>Agenda, reservas y mapa (FS-HU-13, FS-HU-14 y FS-HU-06): Luis Méndez las implementó y se fusionaron el 12-10-2026 (PR #21). El profesional publica horarios sin superposiciones, el usuario reserva con un mensaje obligatorio, el profesional confirma y cualquiera de los dos puede cancelar; si dos personas reservan el mismo horario a la vez, solo una lo obtiene. La búsqueda alterna entre lista y mapa. Se verificó contra MySQL real con 39 comprobaciones; en la revisión se detectó y corrigió un error con las horas en punto (defecto 25). Las correcciones posteriores y el límite de una reserva activa por usuario con cada profesional están en revisión (PR #22).</w:t>
+            </w:r>
+          </w:p>
+          <w:p>
+            <w:pPr>
+              <w:spacing w:after="80"/>
+            </w:pPr>
+            <w:r>
+              <w:rPr>
+                <w:rFonts w:ascii="Calibri" w:hAnsi="Calibri"/>
+                <w:b/>
+                <w:color w:val="000000"/>
+                <w:sz w:val="20"/>
+              </w:rPr>
+              <w:t>Estado al 12-10-2026: el sistema suma 404 pruebas automatizadas (231 en el backend y 173 en el frontend) y 78 casos de prueba en la planilla (75 aprobados y 3 pendientes de ejecutar: CP-024, CP-025 y CP-078). Las evidencias se versionan en GitHub, se publican en el Drive del equipo y su avance se sigue en el tablero Trello.</w:t>
             </w:r>
           </w:p>
         </w:tc>
@@ -1191,6 +1247,50 @@
                 <w:sz w:val="20"/>
               </w:rPr>
               <w:t>descompone el proyecto en 48 actividades organizadas por fase y estima 957 horas-hombre por rol, valorizadas en $3.773.056 según el análisis de ingresos. Las horas del Sprint 1 son las reales y las demás historias se estiman con la relación observada en ese sprint (5,4 horas por punto de historia) (C2).</w:t>
+            </w:r>
+          </w:p>
+          <w:p>
+            <w:pPr>
+              <w:spacing w:after="80"/>
+            </w:pPr>
+            <w:r>
+              <w:rPr>
+                <w:rFonts w:ascii="Calibri" w:hAnsi="Calibri"/>
+                <w:b/>
+                <w:color w:val="000000"/>
+                <w:sz w:val="20"/>
+              </w:rPr>
+              <w:t xml:space="preserve">Cierre del Sprint 2 y seguimiento del Sprint 3: </w:t>
+            </w:r>
+            <w:r>
+              <w:rPr>
+                <w:rFonts w:ascii="Calibri" w:hAnsi="Calibri"/>
+                <w:color w:val="000000"/>
+                <w:sz w:val="20"/>
+              </w:rPr>
+              <w:t>el Sprint Backlog del Sprint 2 se cerró el 06-10-2026 con 30 tareas, 110 horas estimadas y 92 reales, su burndown, el Documento Sprint Backlog 2 y el Documento Validando Sprint 2; el Sprint Backlog del Sprint 3 registra las tareas en curso (C2).</w:t>
+            </w:r>
+          </w:p>
+          <w:p>
+            <w:pPr>
+              <w:spacing w:after="80"/>
+            </w:pPr>
+            <w:r>
+              <w:rPr>
+                <w:rFonts w:ascii="Calibri" w:hAnsi="Calibri"/>
+                <w:b/>
+                <w:color w:val="000000"/>
+                <w:sz w:val="20"/>
+              </w:rPr>
+              <w:t xml:space="preserve">Pruebas y defectos: </w:t>
+            </w:r>
+            <w:r>
+              <w:rPr>
+                <w:rFonts w:ascii="Calibri" w:hAnsi="Calibri"/>
+                <w:color w:val="000000"/>
+                <w:sz w:val="20"/>
+              </w:rPr>
+              <w:t>al 12-10-2026 hay 404 pruebas automatizadas y comprobaciones con MySQL real (npm run test:mysql:agenda, 39/39); la Planilla de Casos de Prueba tiene 78 casos (75 aprobados y 3 pendientes de ejecutar) y el Registro de Defectos 26 defectos (25 corregidos y 1 abierto) (C1).</w:t>
             </w:r>
           </w:p>
           <w:p>
@@ -2683,6 +2783,20 @@
               <w:t>Actividad agregada: evidencia del Informe de Avance (semana 9). Versión 1.14 al 03-10-2026.</w:t>
             </w:r>
           </w:p>
+          <w:p>
+            <w:pPr>
+              <w:spacing w:after="80"/>
+              <w:jc w:val="both"/>
+            </w:pPr>
+            <w:r>
+              <w:rPr>
+                <w:rFonts w:ascii="Calibri" w:hAnsi="Calibri"/>
+                <w:color w:val="000000"/>
+                <w:sz w:val="16"/>
+              </w:rPr>
+              <w:t>12-10-2026: versión 1.21 en main (agenda, reservas, verificación y panel del administrador); la versión 1.22 está en revisión en el PR #22.</w:t>
+            </w:r>
+          </w:p>
         </w:tc>
       </w:tr>
       <w:tr>
@@ -3311,6 +3425,20 @@
               <w:t xml:space="preserve">FS-HU-03 la implementó Nicolás Silva y se fusionó el 02-10-2026 (PR #8): tablas profesionales y establecimientos y API del listado. El 03-10-2026 se agregaron comuna, modalidad, favoritos y reseñas. La edición de la ficha (FS-HU-04) la implementó Luis Méndez en el PR #11 (03-10-2026), en corrección antes de fusionar; pasa al Sprint 3. FS-HU-03 aceptada por el Product Owner el 03-10-2026.</w:t>
             </w:r>
           </w:p>
+          <w:p>
+            <w:pPr>
+              <w:spacing w:after="80"/>
+              <w:jc w:val="both"/>
+            </w:pPr>
+            <w:r>
+              <w:rPr>
+                <w:rFonts w:ascii="Calibri" w:hAnsi="Calibri"/>
+                <w:color w:val="000000"/>
+                <w:sz w:val="16"/>
+              </w:rPr>
+              <w:t>12-10-2026: FS-HU-04 se fusionó el 08-10-2026 (PR #12, con ajustes de Rodrigo Cárcamo Rojas) y el Product Owner la aceptó el 12-10-2026. Los centros de salud y gimnasios siguen como «Próximamente».</w:t>
+            </w:r>
+          </w:p>
         </w:tc>
       </w:tr>
       <w:tr>
@@ -3446,7 +3574,7 @@
                 <w:color w:val="000000"/>
                 <w:sz w:val="16"/>
               </w:rPr>
-              <w:t>En curso</w:t>
+              <w:t>Completado</w:t>
             </w:r>
           </w:p>
         </w:tc>
@@ -3466,6 +3594,20 @@
                 <w:sz w:val="16"/>
               </w:rPr>
               <w:t xml:space="preserve">Listado listo (PR #8). El 03-10-2026 se agregó la ficha de cada profesional con sus reseñas; el perfil editable por el profesional (FS-HU-04) está en el PR #11 de Luis Méndez, en corrección antes de fusionar; pasa al Sprint 3.</w:t>
+            </w:r>
+          </w:p>
+          <w:p>
+            <w:pPr>
+              <w:spacing w:after="80"/>
+              <w:jc w:val="both"/>
+            </w:pPr>
+            <w:r>
+              <w:rPr>
+                <w:rFonts w:ascii="Calibri" w:hAnsi="Calibri"/>
+                <w:color w:val="000000"/>
+                <w:sz w:val="16"/>
+              </w:rPr>
+              <w:t>12-10-2026: el perfil editable por el profesional (FS-HU-04) se fusionó el 08-10-2026 (PR #12) y el Product Owner lo aceptó el 12-10-2026.</w:t>
             </w:r>
           </w:p>
         </w:tc>
@@ -3782,6 +3924,20 @@
               <w:t>Filtros, orden y panel de filtros en celular listos el 03-10-2026 (FS-HU-22); el mapa (FS-HU-06) sigue pendiente para el Sprint 3. Revisión aprobada y fusionada en main el 03-10-2026 (PR #10).</w:t>
             </w:r>
           </w:p>
+          <w:p>
+            <w:pPr>
+              <w:spacing w:after="80"/>
+              <w:jc w:val="both"/>
+            </w:pPr>
+            <w:r>
+              <w:rPr>
+                <w:rFonts w:ascii="Calibri" w:hAnsi="Calibri"/>
+                <w:color w:val="000000"/>
+                <w:sz w:val="16"/>
+              </w:rPr>
+              <w:t>12-10-2026: la vista de mapa y lista (FS-HU-06) la implementó Luis Méndez y se fusionó en el PR #21. Falta probarla en main con una clave real de Google Maps (CP-078) y su aceptación.</w:t>
+            </w:r>
+          </w:p>
         </w:tc>
       </w:tr>
       <w:tr>
@@ -4821,7 +4977,7 @@
                 <w:color w:val="000000"/>
                 <w:sz w:val="16"/>
               </w:rPr>
-              <w:t xml:space="preserve">Por asignar en la planificación del Sprint 3</w:t>
+              <w:t>Luis Méndez</w:t>
             </w:r>
           </w:p>
         </w:tc>
@@ -4859,7 +5015,7 @@
                 <w:color w:val="000000"/>
                 <w:sz w:val="16"/>
               </w:rPr>
-              <w:t>No iniciado</w:t>
+              <w:t>En curso</w:t>
             </w:r>
           </w:p>
         </w:tc>
@@ -4879,6 +5035,20 @@
                 <w:sz w:val="16"/>
               </w:rPr>
               <w:t xml:space="preserve">Actividad agregada: épica E7 Reservas. No se inició en el Sprint 2; pasa al Sprint 3.</w:t>
+            </w:r>
+          </w:p>
+          <w:p>
+            <w:pPr>
+              <w:spacing w:after="80"/>
+              <w:jc w:val="both"/>
+            </w:pPr>
+            <w:r>
+              <w:rPr>
+                <w:rFonts w:ascii="Calibri" w:hAnsi="Calibri"/>
+                <w:color w:val="000000"/>
+                <w:sz w:val="16"/>
+              </w:rPr>
+              <w:t>12-10-2026: implementada por Luis Méndez y fusionada en el PR #21; verificada contra MySQL real (CP-069 a CP-071). Falta la aceptación del Product Owner.</w:t>
             </w:r>
           </w:p>
         </w:tc>
@@ -5038,6 +5208,20 @@
               <w:t>Actividad agregada: historias nuevas de la épica E1 (DAS v1.6). Al 21-09-2026: identidad visual, registro con rol, "Recordarme" y recuperación de contraseña implementados y probados (CP-008 a CP-013); acceso con Google en espera. 03-10-2026: revisión de código aprobada por Luis Méndez (PR #9) y aceptada por el Product Owner. Quedan pendientes el correo real (SMTP) de FS-HU-15 y los casos CP-024 y CP-025 de FS-HU-16.</w:t>
             </w:r>
           </w:p>
+          <w:p>
+            <w:pPr>
+              <w:spacing w:after="80"/>
+              <w:jc w:val="both"/>
+            </w:pPr>
+            <w:r>
+              <w:rPr>
+                <w:rFonts w:ascii="Calibri" w:hAnsi="Calibri"/>
+                <w:color w:val="000000"/>
+                <w:sz w:val="16"/>
+              </w:rPr>
+              <w:t>12-10-2026: Luis Méndez comprobó el envío real del correo de recuperación con Gmail (SMTP) y el restablecimiento completo de la contraseña; la evidencia está en el PR #22, en revisión. El acceso real con Google se bloqueó porque el origen localhost no está autorizado en el cliente OAuth, por lo que CP-024 y CP-025 siguen pendientes.</w:t>
+            </w:r>
+          </w:p>
         </w:tc>
       </w:tr>
       <w:tr>
@@ -5606,7 +5790,7 @@
                 <w:color w:val="000000"/>
                 <w:sz w:val="16"/>
               </w:rPr>
-              <w:t>Por asignar en la planificación del Sprint 3</w:t>
+              <w:t>Luis Méndez</w:t>
             </w:r>
           </w:p>
         </w:tc>
@@ -5644,7 +5828,7 @@
                 <w:color w:val="000000"/>
                 <w:sz w:val="16"/>
               </w:rPr>
-              <w:t>No iniciado</w:t>
+              <w:t>En curso</w:t>
             </w:r>
           </w:p>
         </w:tc>
@@ -5664,6 +5848,20 @@
                 <w:sz w:val="16"/>
               </w:rPr>
               <w:t>Actividad agregada: épica E7 Reservas.</w:t>
+            </w:r>
+          </w:p>
+          <w:p>
+            <w:pPr>
+              <w:spacing w:after="80"/>
+              <w:jc w:val="both"/>
+            </w:pPr>
+            <w:r>
+              <w:rPr>
+                <w:rFonts w:ascii="Calibri" w:hAnsi="Calibri"/>
+                <w:color w:val="000000"/>
+                <w:sz w:val="16"/>
+              </w:rPr>
+              <w:t>12-10-2026: implementada por Luis Méndez y fusionada en el PR #21; verificada contra MySQL real, incluidas dos reservas simultáneas (CP-072 a CP-075). El límite de una reserva activa por usuario con cada profesional, decidido por el Product Owner el 12-10-2026, está en revisión en el PR #22. Falta la aceptación del Product Owner.</w:t>
             </w:r>
           </w:p>
         </w:tc>
@@ -5744,7 +5942,7 @@
                 <w:color w:val="000000"/>
                 <w:sz w:val="16"/>
               </w:rPr>
-              <w:t>Semanas 13-15 (si hay capacidad)</w:t>
+              <w:t>Semanas 9-10 (adelantada; prevista para las semanas 13-15)</w:t>
             </w:r>
           </w:p>
         </w:tc>
@@ -5763,7 +5961,7 @@
                 <w:color w:val="000000"/>
                 <w:sz w:val="16"/>
               </w:rPr>
-              <w:t>Por asignar</w:t>
+              <w:t>Luis Méndez</w:t>
             </w:r>
           </w:p>
         </w:tc>
@@ -5801,7 +5999,7 @@
                 <w:color w:val="000000"/>
                 <w:sz w:val="16"/>
               </w:rPr>
-              <w:t>No iniciado</w:t>
+              <w:t>En curso</w:t>
             </w:r>
           </w:p>
         </w:tc>
@@ -5821,6 +6019,20 @@
                 <w:sz w:val="16"/>
               </w:rPr>
               <w:t>Actividad agregada: cubre el caso de uso de administración de la plataforma.</w:t>
+            </w:r>
+          </w:p>
+          <w:p>
+            <w:pPr>
+              <w:spacing w:after="80"/>
+              <w:jc w:val="both"/>
+            </w:pPr>
+            <w:r>
+              <w:rPr>
+                <w:rFonts w:ascii="Calibri" w:hAnsi="Calibri"/>
+                <w:color w:val="000000"/>
+                <w:sz w:val="16"/>
+              </w:rPr>
+              <w:t>12-10-2026: implementada por Luis Méndez durante el Sprint 3 (PR #15, #19 y #20): verificación con documentos y panel del administrador. El Product Owner la reubicó del Sprint 5 al Sprint 3; falta su aceptación.</w:t>
             </w:r>
           </w:p>
         </w:tc>
@@ -6517,6 +6729,28 @@
               <w:t>la coordinación de tiempos entre los integrantes, cuyos horarios disponibles no siempre coinciden. Se aborda con las reuniones fijas semanales definidas en la Fase 1 y con la asignación de cada tarea a un responsable en el Sprint Backlog, lo que permite avanzar en paralelo y revisar el avance en conjunto.</w:t>
             </w:r>
           </w:p>
+          <w:p>
+            <w:pPr>
+              <w:spacing w:after="80"/>
+            </w:pPr>
+            <w:r>
+              <w:rPr>
+                <w:rFonts w:ascii="Calibri" w:hAnsi="Calibri"/>
+                <w:b/>
+                <w:color w:val="000000"/>
+                <w:sz w:val="20"/>
+              </w:rPr>
+              <w:t xml:space="preserve">Facilitadores (Sprint 3): </w:t>
+            </w:r>
+            <w:r>
+              <w:rPr>
+                <w:rFonts w:ascii="Calibri" w:hAnsi="Calibri"/>
+                <w:color w:val="000000"/>
+                <w:sz w:val="20"/>
+              </w:rPr>
+              <w:t>la revisión de cada pull request con pruebas automatizadas y comprobaciones contra MySQL real permitió detectar errores antes de integrarlos o antes de fusionar (defectos 25 y 26), y las decisiones del Product Owner quedan registradas en el Product Backlog, el DAS y Trello.</w:t>
+            </w:r>
+          </w:p>
         </w:tc>
       </w:tr>
     </w:tbl>
@@ -6924,6 +7158,72 @@
                 <w:sz w:val="20"/>
               </w:rPr>
               <w:t>se definió Prisma como ORM, bcryptjs como implementación de bcrypt y Vitest para las pruebas del frontend, registradas como decisiones de diseño en el DAS.</w:t>
+            </w:r>
+          </w:p>
+          <w:p>
+            <w:pPr>
+              <w:spacing w:after="80"/>
+            </w:pPr>
+            <w:r>
+              <w:rPr>
+                <w:rFonts w:ascii="Calibri" w:hAnsi="Calibri"/>
+                <w:b/>
+                <w:color w:val="000000"/>
+                <w:sz w:val="20"/>
+              </w:rPr>
+              <w:t xml:space="preserve">Elección del perfil y espacio del profesional (05 y 08-10-2026): </w:t>
+            </w:r>
+            <w:r>
+              <w:rPr>
+                <w:rFonts w:ascii="Calibri" w:hAnsi="Calibri"/>
+                <w:color w:val="000000"/>
+                <w:sz w:val="20"/>
+              </w:rPr>
+              <w:t>el rol se elige una sola vez en una pantalla propia después del registro (ya no dentro del asistente del perfil); el profesional tiene su propio espacio (Inicio con clima, perfil profesional con pestañas y secciones «Próximamente») y no completa los datos personales, objetivos ni salud del usuario. En el menú del usuario se quitaron Farmacias e Historial de chats (el historial irá dentro del asistente) y se agregó Comidas como «Próximamente».</w:t>
+            </w:r>
+          </w:p>
+          <w:p>
+            <w:pPr>
+              <w:spacing w:after="80"/>
+            </w:pPr>
+            <w:r>
+              <w:rPr>
+                <w:rFonts w:ascii="Calibri" w:hAnsi="Calibri"/>
+                <w:b/>
+                <w:color w:val="000000"/>
+                <w:sz w:val="20"/>
+              </w:rPr>
+              <w:t xml:space="preserve">FS-HU-12 adelantada (12-10-2026): </w:t>
+            </w:r>
+            <w:r>
+              <w:rPr>
+                <w:rFonts w:ascii="Calibri" w:hAnsi="Calibri"/>
+                <w:color w:val="000000"/>
+                <w:sz w:val="20"/>
+              </w:rPr>
+              <w:t>estaba prevista para el Sprint 5 «si hay capacidad», pero Luis Méndez la implementó durante el Sprint 3 con el alcance que el Product Owner autorizó para el panel del administrador (Dashboard, Profesionales, Verificaciones, Usuarios y Reportes; quedan fuera Configuración y Contenido). El Product Owner la reubicó en el Sprint 3.</w:t>
+            </w:r>
+          </w:p>
+          <w:p>
+            <w:pPr>
+              <w:spacing w:after="80"/>
+            </w:pPr>
+            <w:r>
+              <w:rPr>
+                <w:rFonts w:ascii="Calibri" w:hAnsi="Calibri"/>
+                <w:b/>
+                <w:color w:val="000000"/>
+                <w:sz w:val="20"/>
+              </w:rPr>
+              <w:t xml:space="preserve">Límite de reservas (12-10-2026): </w:t>
+            </w:r>
+            <w:r>
+              <w:rPr>
+                <w:rFonts w:ascii="Calibri" w:hAnsi="Calibri"/>
+                <w:color w:val="000000"/>
+                <w:sz w:val="20"/>
+              </w:rPr>
+              <w:t>el Product Owner definió que un usuario puede tener como máximo una reserva activa (pendiente o confirmada) con cada profesional, para evitar que una sola cuenta ocupe toda la agenda. Se implementa en el PR #22, en revisión.</w:t>
             </w:r>
           </w:p>
           <w:p>
@@ -7237,7 +7537,35 @@
                 <w:color w:val="000000"/>
                 <w:sz w:val="20"/>
               </w:rPr>
+              <w:t>Actualización del 12-10-2026: el Product Owner aceptó FS-HU-04; FS-HU-06, FS-HU-13 y FS-HU-14 están implementadas y fusionadas (PR #21) y FS-HU-12 implementada (PR #15, #19 y #20), las cuatro pendientes de aceptación, igual que FS-HU-05 y FS-HU-21 a FS-HU-24. Las horas reales del Sprint 3 aún no se registran y la retrospectiva del Sprint 2 sigue pendiente de las respuestas del equipo.</w:t>
+            </w:r>
+          </w:p>
+          <w:p>
+            <w:pPr>
+              <w:spacing w:after="80"/>
+            </w:pPr>
+            <w:r>
+              <w:rPr>
+                <w:rFonts w:ascii="Calibri" w:hAnsi="Calibri"/>
+                <w:b/>
+                <w:color w:val="000000"/>
+                <w:sz w:val="20"/>
+              </w:rPr>
               <w:t>Acceso con Google (FS-HU-16): implementada el 24-09-2026 con el ID de cliente OAuth de la cuenta del proyecto; quedan pendientes los casos de prueba manuales CP-024 y CP-025, que requieren iniciar sesión con una cuenta de Google del equipo.</w:t>
+            </w:r>
+          </w:p>
+          <w:p>
+            <w:pPr>
+              <w:spacing w:after="80"/>
+            </w:pPr>
+            <w:r>
+              <w:rPr>
+                <w:rFonts w:ascii="Calibri" w:hAnsi="Calibri"/>
+                <w:b/>
+                <w:color w:val="000000"/>
+                <w:sz w:val="20"/>
+              </w:rPr>
+              <w:t>El 12-10-2026 la prueba real con Google se bloqueó porque el origen localhost no está autorizado en el cliente OAuth. El Product Owner debe agregar http://localhost y http://localhost:5173 como orígenes autorizados en Google Cloud y repetir CP-024 y CP-025.</w:t>
             </w:r>
           </w:p>
         </w:tc>

</xml_diff>

<commit_message>
Documenta la fusión del PR #22: defecto 26 corregido, CP-079 y CP-080 y límite de reservas
Registro de Defectos con los 26 corregidos. Planilla con 80 casos (77 aprobados). Escenario 4 de FS-HU-14 en la planilla de historias y nota en el Product Backlog. DAS 1.22 sin referencias a revisión pendiente. Guía 2.4 y control actualizados (diagrama UML de componentes implementado).
</commit_message>
<xml_diff>
--- a/FASE 2/Evidencias Grupales/2.4_GuiaEstudiante_Fase 2_DesarrolloProyecto APT (Español).docx
+++ b/FASE 2/Evidencias Grupales/2.4_GuiaEstudiante_Fase 2_DesarrolloProyecto APT (Español).docx
@@ -685,7 +685,7 @@
                 <w:color w:val="000000"/>
                 <w:sz w:val="20"/>
               </w:rPr>
-              <w:t>Documento de Arquitectura del Sistema (DAS) v1.21: se documentó la arquitectura con el modelo 4+1 (casos de uso, vista lógica, procesos, desarrollo y física), escenarios de calidad, decisiones de diseño con alternativas evaluadas y análisis de reutilización.</w:t>
+              <w:t>Documento de Arquitectura del Sistema (DAS) v1.22: se documentó la arquitectura con el modelo 4+1 (casos de uso, vista lógica, procesos, desarrollo y física), escenarios de calidad, decisiones de diseño con alternativas evaluadas y análisis de reutilización.</w:t>
             </w:r>
           </w:p>
           <w:p>
@@ -931,7 +931,7 @@
                 <w:color w:val="000000"/>
                 <w:sz w:val="20"/>
               </w:rPr>
-              <w:t>Agenda, reservas y mapa (FS-HU-13, FS-HU-14 y FS-HU-06): Luis Méndez las implementó y se fusionaron el 12-10-2026 (PR #21). El profesional publica horarios sin superposiciones, el usuario reserva con un mensaje obligatorio, el profesional confirma y cualquiera de los dos puede cancelar; si dos personas reservan el mismo horario a la vez, solo una lo obtiene. La búsqueda alterna entre lista y mapa. Se verificó contra MySQL real con 39 comprobaciones; en la revisión se detectó y corrigió un error con las horas en punto (defecto 25). Las correcciones posteriores y el límite de una reserva activa por usuario con cada profesional están en revisión (PR #22).</w:t>
+              <w:t>Agenda, reservas y mapa (FS-HU-13, FS-HU-14 y FS-HU-06): Luis Méndez las implementó y se fusionaron el 12-10-2026 (PR #21). El profesional publica horarios sin superposiciones, el usuario reserva con un mensaje obligatorio, el profesional confirma y cualquiera de los dos puede cancelar; si dos personas reservan el mismo horario a la vez, solo una lo obtiene. La búsqueda alterna entre lista y mapa. Se verificó contra MySQL real con 39 comprobaciones; en la revisión se detectó y corrigió un error con las horas en punto (defecto 25). Las correcciones posteriores y el límite de una reserva activa por usuario con cada profesional (sin contar las citas pasadas, defecto 26) se fusionaron el 12-10-2026 (PR #22).</w:t>
             </w:r>
           </w:p>
           <w:p>
@@ -945,7 +945,7 @@
                 <w:color w:val="000000"/>
                 <w:sz w:val="20"/>
               </w:rPr>
-              <w:t>Estado al 12-10-2026: el sistema suma 404 pruebas automatizadas (231 en el backend y 173 en el frontend) y 78 casos de prueba en la planilla (75 aprobados y 3 pendientes de ejecutar: CP-024, CP-025 y CP-078). Las evidencias se versionan en GitHub, se publican en el Drive del equipo y su avance se sigue en el tablero Trello.</w:t>
+              <w:t>Estado al 12-10-2026: el sistema suma 416 pruebas automatizadas (233 en el backend y 183 en el frontend) y 80 casos de prueba en la planilla (77 aprobados y 3 pendientes de ejecutar: CP-024, CP-025 y CP-078). Las evidencias se versionan en GitHub, se publican en el Drive del equipo y su avance se sigue en el tablero Trello.</w:t>
             </w:r>
           </w:p>
         </w:tc>
@@ -1290,7 +1290,7 @@
                 <w:color w:val="000000"/>
                 <w:sz w:val="20"/>
               </w:rPr>
-              <w:t>al 12-10-2026 hay 404 pruebas automatizadas y comprobaciones con MySQL real (npm run test:mysql:agenda, 39/39); la Planilla de Casos de Prueba tiene 78 casos (75 aprobados y 3 pendientes de ejecutar) y el Registro de Defectos 26 defectos (25 corregidos y 1 abierto) (C1).</w:t>
+              <w:t>al 12-10-2026 hay 416 pruebas automatizadas y comprobaciones con MySQL real (npm run test:mysql:agenda, 55/55); la Planilla de Casos de Prueba tiene 80 casos (77 aprobados y 3 pendientes de ejecutar) y el Registro de Defectos 26 defectos, todos corregidos (C1).</w:t>
             </w:r>
           </w:p>
           <w:p>
@@ -2794,7 +2794,7 @@
                 <w:color w:val="000000"/>
                 <w:sz w:val="16"/>
               </w:rPr>
-              <w:t>12-10-2026: versión 1.21 en main (agenda, reservas, verificación y panel del administrador); la versión 1.22 está en revisión en el PR #22.</w:t>
+              <w:t>12-10-2026: versión 1.21 en main (agenda, reservas, verificación y panel del administrador); la versión 1.22 (diagrama UML de componentes y límite de reservas) se fusionó el 12-10-2026 en el PR #22.</w:t>
             </w:r>
           </w:p>
         </w:tc>
@@ -5219,7 +5219,7 @@
                 <w:color w:val="000000"/>
                 <w:sz w:val="16"/>
               </w:rPr>
-              <w:t>12-10-2026: Luis Méndez comprobó el envío real del correo de recuperación con Gmail (SMTP) y el restablecimiento completo de la contraseña; la evidencia está en el PR #22, en revisión. El acceso real con Google se bloqueó porque el origen localhost no está autorizado en el cliente OAuth, por lo que CP-024 y CP-025 siguen pendientes.</w:t>
+              <w:t>12-10-2026: Luis Méndez comprobó el envío real del correo de recuperación con Gmail (SMTP) y el restablecimiento completo de la contraseña; la evidencia quedó en main con el PR #22. El acceso real con Google se bloqueó porque el origen localhost no está autorizado en el cliente OAuth, por lo que CP-024 y CP-025 siguen pendientes.</w:t>
             </w:r>
           </w:p>
         </w:tc>
@@ -5861,7 +5861,7 @@
                 <w:color w:val="000000"/>
                 <w:sz w:val="16"/>
               </w:rPr>
-              <w:t>12-10-2026: implementada por Luis Méndez y fusionada en el PR #21; verificada contra MySQL real, incluidas dos reservas simultáneas (CP-072 a CP-075). El límite de una reserva activa por usuario con cada profesional, decidido por el Product Owner el 12-10-2026, está en revisión en el PR #22. Falta la aceptación del Product Owner.</w:t>
+              <w:t>12-10-2026: implementada por Luis Méndez y fusionada en el PR #21; verificada contra MySQL real, incluidas dos reservas simultáneas (CP-072 a CP-075). El límite de una reserva activa por usuario con cada profesional, decidido por el Product Owner el 12-10-2026, se fusionó el mismo día en el PR #22 (CP-079 y CP-080). Falta la aceptación del Product Owner.</w:t>
             </w:r>
           </w:p>
         </w:tc>
@@ -7223,7 +7223,7 @@
                 <w:color w:val="000000"/>
                 <w:sz w:val="20"/>
               </w:rPr>
-              <w:t>el Product Owner definió que un usuario puede tener como máximo una reserva activa (pendiente o confirmada) con cada profesional, para evitar que una sola cuenta ocupe toda la agenda. Se implementa en el PR #22, en revisión.</w:t>
+              <w:t>el Product Owner definió que un usuario puede tener como máximo una reserva activa (pendiente o confirmada) con cada profesional, para evitar que una sola cuenta ocupe toda la agenda. Se implementó en el PR #22, fusionado el 12-10-2026; las citas que ya pasaron no cuentan para el límite.</w:t>
             </w:r>
           </w:p>
           <w:p>

</xml_diff>

<commit_message>
Retrospectiva del Sprint 2, horas y documento del Sprint Backlog 3 con burndown, diario de Nicolas renombrado y planilla duplicada eliminada
</commit_message>
<xml_diff>
--- a/FASE 2/Evidencias Grupales/2.4_GuiaEstudiante_Fase 2_DesarrolloProyecto APT (Español).docx
+++ b/FASE 2/Evidencias Grupales/2.4_GuiaEstudiante_Fase 2_DesarrolloProyecto APT (Español).docx
@@ -7509,7 +7509,7 @@
                 <w:color w:val="000000"/>
                 <w:sz w:val="20"/>
               </w:rPr>
-              <w:t xml:space="preserve">Sprint 2: cerrado el 04-10-2026, dentro de su período. Se realizaron 92 de las 110 horas estimadas (Rodrigo Cárcamo Rojas 51, Nicolás Silva 23 y Luis Méndez 18), registradas al cierre según el trabajo entregado en GitHub. El Product Owner aceptó el 03-10-2026 FS-HU-02 (tipo de cuenta), FS-HU-03 y FS-HU-15 a FS-HU-20, con la revisión de código aprobada en los PR #8 y #9; FS-HU-15 queda con la observación de configurar el correo real y FS-HU-16 con los casos CP-024 y CP-025 pendientes. FS-HU-04 (implementada por Luis Méndez en el PR #11, en corrección antes de fusionar) y FS-HU-13 (no iniciada) pasan al Sprint 3. Evidencias: Documento Sprint Backlog 2, Documento Validando Sprint 2 y burndown del Sprint 2; la retrospectiva del Sprint 2 está pendiente de las respuestas del equipo.</w:t>
+              <w:t>Sprint 2: cerrado el 04-10-2026, dentro de su período. Se realizaron 92 de las 110 horas estimadas (Rodrigo Cárcamo Rojas 51, Nicolás Silva 23 y Luis Méndez 18), registradas al cierre según el trabajo entregado en GitHub. El Product Owner aceptó el 03-10-2026 FS-HU-02 (tipo de cuenta), FS-HU-03 y FS-HU-15 a FS-HU-20, con la revisión de código aprobada en los PR #8 y #9; FS-HU-15 queda con la observación de configurar el correo real y FS-HU-16 con los casos CP-024 y CP-025 pendientes. FS-HU-04 (implementada por Luis Méndez en el PR #11, en corrección antes de fusionar) y FS-HU-13 (no iniciada) pasan al Sprint 3. Evidencias: Documento Sprint Backlog 2, Documento Validando Sprint 2, burndown del Sprint 2 y la retrospectiva del Sprint 2, registrada por escrito el 12-10-2026 con las respuestas de los tres integrantes.</w:t>
             </w:r>
           </w:p>
           <w:p>
@@ -7537,7 +7537,7 @@
                 <w:color w:val="000000"/>
                 <w:sz w:val="20"/>
               </w:rPr>
-              <w:t>Actualización del 12-10-2026: el Product Owner aceptó FS-HU-04; FS-HU-06, FS-HU-13 y FS-HU-14 están implementadas y fusionadas (PR #21) y FS-HU-12 implementada (PR #15, #19 y #20), las cuatro pendientes de aceptación, igual que FS-HU-05 y FS-HU-21 a FS-HU-24. Las horas reales del Sprint 3 aún no se registran y la retrospectiva del Sprint 2 sigue pendiente de las respuestas del equipo.</w:t>
+              <w:t>Actualización del 12-10-2026: el Product Owner aceptó FS-HU-04; FS-HU-06, FS-HU-13 y FS-HU-14 están implementadas y fusionadas (PR #21 y #22) y FS-HU-12 implementada (PR #15, #19 y #20), las cuatro pendientes de aceptación, igual que FS-HU-05 y FS-HU-21 a FS-HU-24. Las horas del Sprint 3 se registraron el 12-10-2026 según el trabajo entregado en GitHub: 32 tareas, 97 h estimadas y 95 h registradas al día 8 (Rodrigo Cárcamo Rojas 52, Luis Méndez 40 y Nicolás Silva 3), con su Documento Sprint Backlog 3 y su burndown. La retrospectiva del Sprint 2 quedó registrada el mismo día.</w:t>
             </w:r>
           </w:p>
           <w:p>

</xml_diff>

<commit_message>
Aceptacion del PO de 8 historias del Sprint 3 y horas del Sprint 3 con tope de 5 h diarias
</commit_message>
<xml_diff>
--- a/FASE 2/Evidencias Grupales/2.4_GuiaEstudiante_Fase 2_DesarrolloProyecto APT (Español).docx
+++ b/FASE 2/Evidencias Grupales/2.4_GuiaEstudiante_Fase 2_DesarrolloProyecto APT (Español).docx
@@ -917,7 +917,7 @@
                 <w:color w:val="000000"/>
                 <w:sz w:val="20"/>
               </w:rPr>
-              <w:t>Verificación de profesionales y panel del administrador (FS-HU-12): Luis Méndez la implementó durante el Sprint 3 (PR #15, #19 y #20, fusionados el 10 y el 11-10-2026): solicitud de verificación con documentos, revisión con aprobación, rechazo o revocación con motivo, insignia «Verificado» y un panel con Dashboard, Profesionales, Verificaciones, Usuarios y Reportes. El Product Owner la reubicó del Sprint 5 al Sprint 3; falta su aceptación.</w:t>
+              <w:t>Verificación de profesionales y panel del administrador (FS-HU-12): Luis Méndez la implementó durante el Sprint 3 (PR #15, #19 y #20, fusionados el 10 y el 11-10-2026): solicitud de verificación con documentos, revisión con aprobación, rechazo o revocación con motivo, insignia «Verificado» y un panel con Dashboard, Profesionales, Verificaciones, Usuarios y Reportes. El Product Owner la reubicó del Sprint 5 al Sprint 3 y la aceptó el 12-10-2026, con observación.</w:t>
             </w:r>
           </w:p>
           <w:p>
@@ -3745,7 +3745,7 @@
                 <w:color w:val="000000"/>
                 <w:sz w:val="16"/>
               </w:rPr>
-              <w:t>En curso</w:t>
+              <w:t>Completado</w:t>
             </w:r>
           </w:p>
         </w:tc>
@@ -3764,7 +3764,7 @@
                 <w:color w:val="000000"/>
                 <w:sz w:val="16"/>
               </w:rPr>
-              <w:t>Adelantada al 03-10-2026: búsqueda por texto con filtros (FS-HU-22) y por cercanía (FS-HU-05) con la ubicación del navegador y la distancia calculada en MySQL (ST_Distance_Sphere), sin usar Geocoding. Revisión aprobada y fusionada en main el 03-10-2026 (PR #10).</w:t>
+              <w:t>Adelantada al 03-10-2026: búsqueda por texto con filtros (FS-HU-22) y por cercanía (FS-HU-05) con la ubicación del navegador y la distancia calculada en MySQL (ST_Distance_Sphere), sin usar Geocoding. Revisión aprobada y fusionada en main el 03-10-2026 (PR #10). El Product Owner aceptó FS-HU-05 y FS-HU-22 el 12-10-2026.</w:t>
             </w:r>
           </w:p>
         </w:tc>
@@ -5015,7 +5015,7 @@
                 <w:color w:val="000000"/>
                 <w:sz w:val="16"/>
               </w:rPr>
-              <w:t>En curso</w:t>
+              <w:t>Completado</w:t>
             </w:r>
           </w:p>
         </w:tc>
@@ -5048,7 +5048,7 @@
                 <w:color w:val="000000"/>
                 <w:sz w:val="16"/>
               </w:rPr>
-              <w:t>12-10-2026: implementada por Luis Méndez y fusionada en el PR #21; verificada contra MySQL real (CP-069 a CP-071). Falta la aceptación del Product Owner.</w:t>
+              <w:t>12-10-2026: implementada por Luis Méndez y fusionada en el PR #21; verificada contra MySQL real (CP-069 a CP-071). El Product Owner la aceptó el 12-10-2026.</w:t>
             </w:r>
           </w:p>
         </w:tc>
@@ -5671,7 +5671,7 @@
                 <w:color w:val="000000"/>
                 <w:sz w:val="16"/>
               </w:rPr>
-              <w:t>En curso</w:t>
+              <w:t>Completado</w:t>
             </w:r>
           </w:p>
         </w:tc>
@@ -5690,7 +5690,7 @@
                 <w:color w:val="000000"/>
                 <w:sz w:val="16"/>
               </w:rPr>
-              <w:t>Actividad agregada: historias nuevas del 03-10-2026 (DAS v1.14), implementadas y probadas antes del inicio del Sprint 3 (CP-036 a CP-049); revisión aprobada por Luis Méndez y fusionadas en main el 03-10-2026 (PR #10).</w:t>
+              <w:t>Actividad agregada: historias nuevas del 03-10-2026 (DAS v1.14), implementadas y probadas antes del inicio del Sprint 3 (CP-036 a CP-049); revisión aprobada por Luis Méndez y fusionadas en main el 03-10-2026 (PR #10). El Product Owner las aceptó el 12-10-2026.</w:t>
             </w:r>
           </w:p>
         </w:tc>
@@ -5828,7 +5828,7 @@
                 <w:color w:val="000000"/>
                 <w:sz w:val="16"/>
               </w:rPr>
-              <w:t>En curso</w:t>
+              <w:t>Completado</w:t>
             </w:r>
           </w:p>
         </w:tc>
@@ -5861,7 +5861,7 @@
                 <w:color w:val="000000"/>
                 <w:sz w:val="16"/>
               </w:rPr>
-              <w:t>12-10-2026: implementada por Luis Méndez y fusionada en el PR #21; verificada contra MySQL real, incluidas dos reservas simultáneas (CP-072 a CP-075). El límite de una reserva activa por usuario con cada profesional, decidido por el Product Owner el 12-10-2026, se fusionó el mismo día en el PR #22 (CP-079 y CP-080). Falta la aceptación del Product Owner.</w:t>
+              <w:t>12-10-2026: implementada por Luis Méndez y fusionada en el PR #21; verificada contra MySQL real, incluidas dos reservas simultáneas (CP-072 a CP-075). El límite de una reserva activa por usuario con cada profesional, decidido por el Product Owner el 12-10-2026, se fusionó el mismo día en el PR #22 (CP-079 y CP-080). El Product Owner la aceptó el 12-10-2026.</w:t>
             </w:r>
           </w:p>
         </w:tc>
@@ -5999,7 +5999,7 @@
                 <w:color w:val="000000"/>
                 <w:sz w:val="16"/>
               </w:rPr>
-              <w:t>En curso</w:t>
+              <w:t>Completado</w:t>
             </w:r>
           </w:p>
         </w:tc>
@@ -6032,7 +6032,7 @@
                 <w:color w:val="000000"/>
                 <w:sz w:val="16"/>
               </w:rPr>
-              <w:t>12-10-2026: implementada por Luis Méndez durante el Sprint 3 (PR #15, #19 y #20): verificación con documentos y panel del administrador. El Product Owner la reubicó del Sprint 5 al Sprint 3; falta su aceptación.</w:t>
+              <w:t>12-10-2026: implementada por Luis Méndez durante el Sprint 3 (PR #15, #19 y #20): verificación con documentos y panel del administrador. El Product Owner la reubicó del Sprint 5 al Sprint 3 y la aceptó el 12-10-2026, con observación.</w:t>
             </w:r>
           </w:p>
         </w:tc>
@@ -7537,7 +7537,7 @@
                 <w:color w:val="000000"/>
                 <w:sz w:val="20"/>
               </w:rPr>
-              <w:t>Actualización del 12-10-2026: el Product Owner aceptó FS-HU-04; FS-HU-06, FS-HU-13 y FS-HU-14 están implementadas y fusionadas (PR #21 y #22) y FS-HU-12 implementada (PR #15, #19 y #20), las cuatro pendientes de aceptación, igual que FS-HU-05 y FS-HU-21 a FS-HU-24. Las horas del Sprint 3 se registraron el 12-10-2026 según el trabajo entregado en GitHub: 32 tareas, 97 h estimadas y 95 h registradas al día 8 (Rodrigo Cárcamo Rojas 52, Luis Méndez 40 y Nicolás Silva 3), con su Documento Sprint Backlog 3 y su burndown. La retrospectiva del Sprint 2 quedó registrada el mismo día.</w:t>
+              <w:t>Actualización del 12-10-2026: el Product Owner aceptó FS-HU-04 y, al cierre del día, FS-HU-05, FS-HU-12, FS-HU-13, FS-HU-14 y FS-HU-21 a FS-HU-24 (FS-HU-12 y FS-HU-14 con observaciones registradas en el Product Backlog): quedan aceptadas 18 historias y 83 de los 117 puntos. FS-HU-06 está implementada y fusionada (PR #21 y #22) y queda pendiente de CP-078 con el mapa real sobre main. Las horas del Sprint 3 se registraron el 12-10-2026 según el trabajo entregado en GitHub: 33 tareas, 65 h estimadas y 63 h registradas al día 8, con un máximo de 5 h por persona y día (Rodrigo Cárcamo Rojas 37, Luis Méndez 23 y Nicolás Silva 3), con su Documento Sprint Backlog 3 y su burndown. La retrospectiva del Sprint 2 quedó registrada el mismo día.</w:t>
             </w:r>
           </w:p>
           <w:p>

</xml_diff>

<commit_message>
Guia 2.4 de la Fase 2 lista para la entrega
- Quita "Borrador en construccion" del resumen de avance.
- La fila Objetivos detalla el objetivo general y los ocho objetivos especificos (siete de la Fase 1 y uno nuevo por la epica E7 Reservas).
- Deja en negrita solo la etiqueta de cada parrafo.
- Responsables del directorio y de la integracion de mapa y filtros coherentes con la columna Ajustes.
- Columna Ajustes del plan de trabajo mas ancha, tablas de las secciones 2 y 3 en linea con el texto y del mismo ancho: el documento pasa de 20 a 14 paginas.
</commit_message>
<xml_diff>
--- a/FASE 2/Evidencias Grupales/2.4_GuiaEstudiante_Fase 2_DesarrolloProyecto APT (Español).docx
+++ b/FASE 2/Evidencias Grupales/2.4_GuiaEstudiante_Fase 2_DesarrolloProyecto APT (Español).docx
@@ -98,52 +98,7 @@
                                   <w:sz w:val="48"/>
                                   <w:szCs w:val="48"/>
                                 </w:rPr>
-                                <w:t>Guía</w:t>
-                              </w:r>
-                              <w:r>
-                                <w:rPr>
-                                  <w:b/>
-                                  <w:color w:val="1F3864" w:themeColor="accent1" w:themeShade="80"/>
-                                  <w:sz w:val="48"/>
-                                  <w:szCs w:val="48"/>
-                                </w:rPr>
-                                <w:t>2.</w:t>
-                              </w:r>
-                              <w:r>
-                                <w:rPr>
-                                  <w:b/>
-                                  <w:color w:val="1F3864" w:themeColor="accent1" w:themeShade="80"/>
-                                  <w:sz w:val="48"/>
-                                  <w:szCs w:val="48"/>
-                                </w:rPr>
-                                <w:t xml:space="preserve"> </w:t>
-                              </w:r>
-                              <w:r>
-                                <w:rPr>
-                                  <w:b/>
-                                  <w:color w:val="1F3864" w:themeColor="accent1" w:themeShade="80"/>
-                                  <w:sz w:val="48"/>
-                                  <w:szCs w:val="48"/>
-                                </w:rPr>
-                                <w:t>Desarrollo P</w:t>
-                              </w:r>
-                              <w:r>
-                                <w:rPr>
-                                  <w:b/>
-                                  <w:color w:val="1F3864" w:themeColor="accent1" w:themeShade="80"/>
-                                  <w:sz w:val="48"/>
-                                  <w:szCs w:val="48"/>
-                                </w:rPr>
-                                <w:t xml:space="preserve">royecto </w:t>
-                              </w:r>
-                              <w:r>
-                                <w:rPr>
-                                  <w:b/>
-                                  <w:color w:val="1F3864" w:themeColor="accent1" w:themeShade="80"/>
-                                  <w:sz w:val="48"/>
-                                  <w:szCs w:val="48"/>
-                                </w:rPr>
-                                <w:t xml:space="preserve">APT </w:t>
+                                <w:t xml:space="preserve">Guía2. Desarrollo Proyecto APT </w:t>
                               </w:r>
                             </w:p>
                             <w:p>
@@ -163,16 +118,7 @@
                                   <w:sz w:val="48"/>
                                   <w:szCs w:val="48"/>
                                 </w:rPr>
-                                <w:t xml:space="preserve">Asignatura </w:t>
-                              </w:r>
-                              <w:r>
-                                <w:rPr>
-                                  <w:b/>
-                                  <w:color w:val="1F3864" w:themeColor="accent1" w:themeShade="80"/>
-                                  <w:sz w:val="48"/>
-                                  <w:szCs w:val="48"/>
-                                </w:rPr>
-                                <w:t>Capstone</w:t>
+                                <w:t xml:space="preserve">Asignatura Capstone</w:t>
                               </w:r>
                             </w:p>
                           </w:txbxContent>
@@ -274,52 +220,7 @@
                             <w:sz w:val="48"/>
                             <w:szCs w:val="48"/>
                           </w:rPr>
-                          <w:t>Guía</w:t>
-                        </w:r>
-                        <w:r>
-                          <w:rPr>
-                            <w:b/>
-                            <w:color w:val="1F3864" w:themeColor="accent1" w:themeShade="80"/>
-                            <w:sz w:val="48"/>
-                            <w:szCs w:val="48"/>
-                          </w:rPr>
-                          <w:t>2.</w:t>
-                        </w:r>
-                        <w:r>
-                          <w:rPr>
-                            <w:b/>
-                            <w:color w:val="1F3864" w:themeColor="accent1" w:themeShade="80"/>
-                            <w:sz w:val="48"/>
-                            <w:szCs w:val="48"/>
-                          </w:rPr>
-                          <w:t xml:space="preserve"> </w:t>
-                        </w:r>
-                        <w:r>
-                          <w:rPr>
-                            <w:b/>
-                            <w:color w:val="1F3864" w:themeColor="accent1" w:themeShade="80"/>
-                            <w:sz w:val="48"/>
-                            <w:szCs w:val="48"/>
-                          </w:rPr>
-                          <w:t>Desarrollo P</w:t>
-                        </w:r>
-                        <w:r>
-                          <w:rPr>
-                            <w:b/>
-                            <w:color w:val="1F3864" w:themeColor="accent1" w:themeShade="80"/>
-                            <w:sz w:val="48"/>
-                            <w:szCs w:val="48"/>
-                          </w:rPr>
-                          <w:t xml:space="preserve">royecto </w:t>
-                        </w:r>
-                        <w:r>
-                          <w:rPr>
-                            <w:b/>
-                            <w:color w:val="1F3864" w:themeColor="accent1" w:themeShade="80"/>
-                            <w:sz w:val="48"/>
-                            <w:szCs w:val="48"/>
-                          </w:rPr>
-                          <w:t xml:space="preserve">APT </w:t>
+                          <w:t xml:space="preserve">Guía2. Desarrollo Proyecto APT </w:t>
                         </w:r>
                       </w:p>
                       <w:p>
@@ -339,16 +240,7 @@
                             <w:sz w:val="48"/>
                             <w:szCs w:val="48"/>
                           </w:rPr>
-                          <w:t xml:space="preserve">Asignatura </w:t>
-                        </w:r>
-                        <w:r>
-                          <w:rPr>
-                            <w:b/>
-                            <w:color w:val="1F3864" w:themeColor="accent1" w:themeShade="80"/>
-                            <w:sz w:val="48"/>
-                            <w:szCs w:val="48"/>
-                          </w:rPr>
-                          <w:t>Capstone</w:t>
+                          <w:t xml:space="preserve">Asignatura Capstone</w:t>
                         </w:r>
                       </w:p>
                     </w:txbxContent>
@@ -471,43 +363,7 @@
                 <w:sz w:val="28"/>
                 <w:szCs w:val="28"/>
               </w:rPr>
-              <w:t>1</w:t>
-            </w:r>
-            <w:r>
-              <w:rPr>
-                <w:b/>
-                <w:color w:val="1F3864" w:themeColor="accent1" w:themeShade="80"/>
-                <w:sz w:val="28"/>
-                <w:szCs w:val="28"/>
-              </w:rPr>
-              <w:t xml:space="preserve">. </w:t>
-            </w:r>
-            <w:r>
-              <w:rPr>
-                <w:b/>
-                <w:color w:val="1F3864" w:themeColor="accent1" w:themeShade="80"/>
-                <w:sz w:val="28"/>
-                <w:szCs w:val="28"/>
-              </w:rPr>
-              <w:t xml:space="preserve">Resumen </w:t>
-            </w:r>
-            <w:r>
-              <w:rPr>
-                <w:b/>
-                <w:color w:val="1F3864" w:themeColor="accent1" w:themeShade="80"/>
-                <w:sz w:val="28"/>
-                <w:szCs w:val="28"/>
-              </w:rPr>
-              <w:t xml:space="preserve">avance </w:t>
-            </w:r>
-            <w:r>
-              <w:rPr>
-                <w:b/>
-                <w:color w:val="1F3864" w:themeColor="accent1" w:themeShade="80"/>
-                <w:sz w:val="28"/>
-                <w:szCs w:val="28"/>
-              </w:rPr>
-              <w:t>Proyecto APT</w:t>
+              <w:t xml:space="preserve">1. Resumen avance Proyecto APT</w:t>
             </w:r>
           </w:p>
         </w:tc>
@@ -603,21 +459,7 @@
                 <w:rFonts w:ascii="Calibri" w:hAnsi="Calibri"/>
                 <w:color w:val="1F3864" w:themeColor="accent1" w:themeShade="80"/>
               </w:rPr>
-              <w:t>Resumen</w:t>
-            </w:r>
-            <w:r>
-              <w:rPr>
-                <w:rFonts w:ascii="Calibri" w:hAnsi="Calibri"/>
-                <w:color w:val="1F3864" w:themeColor="accent1" w:themeShade="80"/>
-              </w:rPr>
-              <w:t xml:space="preserve"> de</w:t>
-            </w:r>
-            <w:r>
-              <w:rPr>
-                <w:rFonts w:ascii="Calibri" w:hAnsi="Calibri"/>
-                <w:color w:val="1F3864" w:themeColor="accent1" w:themeShade="80"/>
-              </w:rPr>
-              <w:t xml:space="preserve"> avance proyecto APT</w:t>
+              <w:t xml:space="preserve">Resumen de avance proyecto APT</w:t>
             </w:r>
           </w:p>
         </w:tc>
@@ -636,7 +478,7 @@
                 <w:color w:val="000000"/>
                 <w:sz w:val="20"/>
               </w:rPr>
-              <w:t>Borrador en construcción — actualizado al 12-10-2026.</w:t>
+              <w:t>Actualizado al 12-10-2026.</w:t>
             </w:r>
           </w:p>
           <w:p>
@@ -685,7 +527,15 @@
                 <w:color w:val="000000"/>
                 <w:sz w:val="20"/>
               </w:rPr>
-              <w:t>Documento de Arquitectura del Sistema (DAS) v1.22: se documentó la arquitectura con el modelo 4+1 (casos de uso, vista lógica, procesos, desarrollo y física), escenarios de calidad, decisiones de diseño con alternativas evaluadas y análisis de reutilización.</w:t>
+              <w:t xml:space="preserve">Documento de Arquitectura del Sistema (DAS) v1.22: </w:t>
+            </w:r>
+            <w:r>
+              <w:rPr>
+                <w:rFonts w:ascii="Calibri" w:hAnsi="Calibri"/>
+                <w:color w:val="000000"/>
+                <w:sz w:val="20"/>
+              </w:rPr>
+              <w:t xml:space="preserve">se documentó la arquitectura con el modelo 4+1 (casos de uso, vista lógica, procesos, desarrollo y física), escenarios de calidad, decisiones de diseño con alternativas evaluadas y análisis de reutilización.</w:t>
             </w:r>
           </w:p>
           <w:p>
@@ -699,7 +549,15 @@
                 <w:color w:val="000000"/>
                 <w:sz w:val="20"/>
               </w:rPr>
-              <w:t>Modelo de datos: se definió el modelo relacional completo del MVP (15 tablas, 12 de ellas ya implementadas al 12-10-2026, incluidas las de reservas, la de códigos de recuperación de contraseña, la de información de salud y, desde el 03-10-2026, las de favoritos y reseñas) con su diccionario de datos, restricciones, índices y reglas de integridad referencial. Esto avanza el objetivo específico "Diseñar un modelo de datos relacional y escalable en MySQL".</w:t>
+              <w:t xml:space="preserve">Modelo de datos: </w:t>
+            </w:r>
+            <w:r>
+              <w:rPr>
+                <w:rFonts w:ascii="Calibri" w:hAnsi="Calibri"/>
+                <w:color w:val="000000"/>
+                <w:sz w:val="20"/>
+              </w:rPr>
+              <w:t xml:space="preserve">se definió el modelo relacional completo del MVP (15 tablas, 12 de ellas ya implementadas al 12-10-2026, incluidas las de reservas, la de códigos de recuperación de contraseña, la de información de salud y, desde el 03-10-2026, las de favoritos y reseñas) con su diccionario de datos, restricciones, índices y reglas de integridad referencial. Esto avanza el objetivo específico "Diseñar un modelo de datos relacional y escalable en MySQL".</w:t>
             </w:r>
           </w:p>
           <w:p>
@@ -889,7 +747,15 @@
                 <w:color w:val="000000"/>
                 <w:sz w:val="20"/>
               </w:rPr>
-              <w:t>Inicio con sesión y búsqueda (adelanto del Sprint 3): a partir del mockup del Inicio entregado por el Product Owner, el 03-10-2026 se implementaron el Inicio con sesión, con menú lateral, barra inferior en celular y menú de la cuenta (FS-HU-21); la búsqueda de profesionales por texto con filtros, orden y cercanía (FS-HU-22 y FS-HU-05); los favoritos (FS-HU-23), y las calificaciones y reseñas (FS-HU-24). También se corrigió que el logo llevara al perfil y se quitó del encabezado el falso buscador (el acceso a Profesionales queda en el menú lateral, la barra inferior y los accesos rápidos del Inicio). El sistema suma 229 pruebas automatizadas (129 en el backend y 100 en el frontend) y 49 casos de prueba en la planilla. El 03-10-2026 Luis Méndez aprobó la revisión de código de estas historias (PR #10, ya fusionado) y la de las historias del Sprint 2 (PR #9), y el Product Owner aceptó las historias del Sprint 2.</w:t>
+              <w:t xml:space="preserve">Inicio con sesión y búsqueda (adelanto del Sprint 3): </w:t>
+            </w:r>
+            <w:r>
+              <w:rPr>
+                <w:rFonts w:ascii="Calibri" w:hAnsi="Calibri"/>
+                <w:color w:val="000000"/>
+                <w:sz w:val="20"/>
+              </w:rPr>
+              <w:t xml:space="preserve">a partir del mockup del Inicio entregado por el Product Owner, el 03-10-2026 se implementaron el Inicio con sesión, con menú lateral, barra inferior en celular y menú de la cuenta (FS-HU-21); la búsqueda de profesionales por texto con filtros, orden y cercanía (FS-HU-22 y FS-HU-05); los favoritos (FS-HU-23), y las calificaciones y reseñas (FS-HU-24). También se corrigió que el logo llevara al perfil y se quitó del encabezado el falso buscador (el acceso a Profesionales queda en el menú lateral, la barra inferior y los accesos rápidos del Inicio). El sistema suma 229 pruebas automatizadas (129 en el backend y 100 en el frontend) y 49 casos de prueba en la planilla. El 03-10-2026 Luis Méndez aprobó la revisión de código de estas historias (PR #10, ya fusionado) y la de las historias del Sprint 2 (PR #9), y el Product Owner aceptó las historias del Sprint 2.</w:t>
             </w:r>
           </w:p>
           <w:p>
@@ -903,7 +769,15 @@
                 <w:color w:val="000000"/>
                 <w:sz w:val="20"/>
               </w:rPr>
-              <w:t>Perfil y espacio del profesional (Sprint 3): la ficha editable del profesional (FS-HU-04) se fusionó el 08-10-2026 (PR #12, de Luis Méndez con ajustes de Rodrigo Cárcamo Rojas) y el 09-10-2026 se agregó la elección del perfil después del registro y un espacio propio para el profesional (PR #13). El Product Owner aceptó FS-HU-04 el 12-10-2026.</w:t>
+              <w:t xml:space="preserve">Perfil y espacio del profesional (Sprint 3): </w:t>
+            </w:r>
+            <w:r>
+              <w:rPr>
+                <w:rFonts w:ascii="Calibri" w:hAnsi="Calibri"/>
+                <w:color w:val="000000"/>
+                <w:sz w:val="20"/>
+              </w:rPr>
+              <w:t xml:space="preserve">la ficha editable del profesional (FS-HU-04) se fusionó el 08-10-2026 (PR #12, de Luis Méndez con ajustes de Rodrigo Cárcamo Rojas) y el 09-10-2026 se agregó la elección del perfil después del registro y un espacio propio para el profesional (PR #13). El Product Owner aceptó FS-HU-04 el 12-10-2026.</w:t>
             </w:r>
           </w:p>
           <w:p>
@@ -917,7 +791,15 @@
                 <w:color w:val="000000"/>
                 <w:sz w:val="20"/>
               </w:rPr>
-              <w:t>Verificación de profesionales y panel del administrador (FS-HU-12): Luis Méndez la implementó durante el Sprint 3 (PR #15, #19 y #20, fusionados el 10 y el 11-10-2026): solicitud de verificación con documentos, revisión con aprobación, rechazo o revocación con motivo, insignia «Verificado» y un panel con Dashboard, Profesionales, Verificaciones, Usuarios y Reportes. El Product Owner la reubicó del Sprint 5 al Sprint 3 y la aceptó el 12-10-2026, con observación.</w:t>
+              <w:t xml:space="preserve">Verificación de profesionales y panel del administrador (FS-HU-12): </w:t>
+            </w:r>
+            <w:r>
+              <w:rPr>
+                <w:rFonts w:ascii="Calibri" w:hAnsi="Calibri"/>
+                <w:color w:val="000000"/>
+                <w:sz w:val="20"/>
+              </w:rPr>
+              <w:t xml:space="preserve">Luis Méndez la implementó durante el Sprint 3 (PR #15, #19 y #20, fusionados el 10 y el 11-10-2026): solicitud de verificación con documentos, revisión con aprobación, rechazo o revocación con motivo, insignia «Verificado» y un panel con Dashboard, Profesionales, Verificaciones, Usuarios y Reportes. El Product Owner la reubicó del Sprint 5 al Sprint 3 y la aceptó el 12-10-2026, con observación.</w:t>
             </w:r>
           </w:p>
           <w:p>
@@ -931,7 +813,15 @@
                 <w:color w:val="000000"/>
                 <w:sz w:val="20"/>
               </w:rPr>
-              <w:t>Agenda, reservas y mapa (FS-HU-13, FS-HU-14 y FS-HU-06): Luis Méndez las implementó y se fusionaron el 12-10-2026 (PR #21). El profesional publica horarios sin superposiciones, el usuario reserva con un mensaje obligatorio, el profesional confirma y cualquiera de los dos puede cancelar; si dos personas reservan el mismo horario a la vez, solo una lo obtiene. La búsqueda alterna entre lista y mapa. Se verificó contra MySQL real con 39 comprobaciones; en la revisión se detectó y corrigió un error con las horas en punto (defecto 25). Las correcciones posteriores y el límite de una reserva activa por usuario con cada profesional (sin contar las citas pasadas, defecto 26) se fusionaron el 12-10-2026 (PR #22).</w:t>
+              <w:t xml:space="preserve">Agenda, reservas y mapa (FS-HU-13, FS-HU-14 y FS-HU-06): </w:t>
+            </w:r>
+            <w:r>
+              <w:rPr>
+                <w:rFonts w:ascii="Calibri" w:hAnsi="Calibri"/>
+                <w:color w:val="000000"/>
+                <w:sz w:val="20"/>
+              </w:rPr>
+              <w:t xml:space="preserve">Luis Méndez las implementó y se fusionaron el 12-10-2026 (PR #21). El profesional publica horarios sin superposiciones, el usuario reserva con un mensaje obligatorio, el profesional confirma y cualquiera de los dos puede cancelar; si dos personas reservan el mismo horario a la vez, solo una lo obtiene. La búsqueda alterna entre lista y mapa. Se verificó contra MySQL real con 39 comprobaciones; en la revisión se detectó y corrigió un error con las horas en punto (defecto 25). Las correcciones posteriores y el límite de una reserva activa por usuario con cada profesional (sin contar las citas pasadas, defecto 26) se fusionaron el 12-10-2026 (PR #22).</w:t>
             </w:r>
           </w:p>
           <w:p>
@@ -945,7 +835,15 @@
                 <w:color w:val="000000"/>
                 <w:sz w:val="20"/>
               </w:rPr>
-              <w:t>Estado al 12-10-2026: el sistema suma 416 pruebas automatizadas (233 en el backend y 183 en el frontend) y 80 casos de prueba en la planilla (77 aprobados y 3 pendientes de ejecutar: CP-024, CP-025 y CP-078). Las evidencias se versionan en GitHub, se publican en el Drive del equipo y su avance se sigue en el tablero Trello.</w:t>
+              <w:t xml:space="preserve">Estado al 12-10-2026: </w:t>
+            </w:r>
+            <w:r>
+              <w:rPr>
+                <w:rFonts w:ascii="Calibri" w:hAnsi="Calibri"/>
+                <w:color w:val="000000"/>
+                <w:sz w:val="20"/>
+              </w:rPr>
+              <w:t xml:space="preserve">el sistema suma 416 pruebas automatizadas (233 en el backend y 183 en el frontend) y 80 casos de prueba en la planilla (77 aprobados y 3 pendientes de ejecutar: CP-024, CP-025 y CP-078). Las evidencias se versionan en GitHub, se publican en el Drive del equipo y su avance se sigue en el tablero Trello.</w:t>
             </w:r>
           </w:p>
         </w:tc>
@@ -988,19 +886,177 @@
             <w:r>
               <w:rPr>
                 <w:rFonts w:ascii="Calibri" w:hAnsi="Calibri"/>
+                <w:color w:val="000000"/>
+                <w:sz w:val="20"/>
+              </w:rPr>
+              <w:t xml:space="preserve">Se mantienen el objetivo general y los siete objetivos específicos definidos en la Fase 1. Se agregó un octavo objetivo específico por la incorporación de la épica E7 Reservas (FS-HU-13 y FS-HU-14), cuya justificación se detalla en la sección 3; ambas historias ya están implementadas y aceptadas por el Product Owner.</w:t>
+            </w:r>
+          </w:p>
+          <w:p>
+            <w:pPr>
+              <w:spacing w:after="80"/>
+              <w:jc w:val="both"/>
+            </w:pPr>
+            <w:r>
+              <w:rPr>
+                <w:rFonts w:ascii="Calibri" w:hAnsi="Calibri"/>
                 <w:b/>
                 <w:color w:val="000000"/>
                 <w:sz w:val="20"/>
               </w:rPr>
-              <w:t xml:space="preserve">Ajuste: </w:t>
-            </w:r>
-            <w:r>
-              <w:rPr>
-                <w:rFonts w:ascii="Calibri" w:hAnsi="Calibri"/>
-                <w:color w:val="000000"/>
-                <w:sz w:val="20"/>
-              </w:rPr>
-              <w:t>se agrega el objetivo específico "Implementar un módulo básico de reservas que permita a los profesionales publicar su disponibilidad y a los usuarios reservar una hora indicando brevemente su necesidad". El objetivo general y los demás objetivos específicos se mantienen.</w:t>
+              <w:t xml:space="preserve">Objetivo general: </w:t>
+            </w:r>
+            <w:r>
+              <w:rPr>
+                <w:rFonts w:ascii="Calibri" w:hAnsi="Calibri"/>
+                <w:color w:val="000000"/>
+                <w:sz w:val="20"/>
+              </w:rPr>
+              <w:t xml:space="preserve">Desarrollar FitSearch, una plataforma web responsiva que permita a los usuarios encontrar de manera rápida y geolocalizada profesionales y establecimientos de salud, deporte y bienestar, apoyada por un asistente de inteligencia artificial y por herramientas de seguimiento nutricional personal.</w:t>
+            </w:r>
+          </w:p>
+          <w:p>
+            <w:pPr>
+              <w:spacing w:after="80"/>
+              <w:jc w:val="both"/>
+            </w:pPr>
+            <w:r>
+              <w:rPr>
+                <w:rFonts w:ascii="Calibri" w:hAnsi="Calibri"/>
+                <w:b/>
+                <w:color w:val="000000"/>
+                <w:sz w:val="20"/>
+              </w:rPr>
+              <w:t xml:space="preserve">Objetivos específicos:</w:t>
+            </w:r>
+          </w:p>
+          <w:p>
+            <w:pPr>
+              <w:spacing w:after="40"/>
+              <w:ind w:left="284" w:hanging="284"/>
+              <w:jc w:val="both"/>
+            </w:pPr>
+            <w:r>
+              <w:rPr>
+                <w:rFonts w:ascii="Calibri" w:hAnsi="Calibri"/>
+                <w:color w:val="000000"/>
+                <w:sz w:val="20"/>
+              </w:rPr>
+              <w:t xml:space="preserve">•	Implementar el sistema de registro, autenticación y perfiles para usuarios y profesionales.</w:t>
+            </w:r>
+          </w:p>
+          <w:p>
+            <w:pPr>
+              <w:spacing w:after="40"/>
+              <w:ind w:left="284" w:hanging="284"/>
+              <w:jc w:val="both"/>
+            </w:pPr>
+            <w:r>
+              <w:rPr>
+                <w:rFonts w:ascii="Calibri" w:hAnsi="Calibri"/>
+                <w:color w:val="000000"/>
+                <w:sz w:val="20"/>
+              </w:rPr>
+              <w:t xml:space="preserve">•	Desarrollar el directorio y buscador geolocalizado de profesionales y establecimientos, con filtros por especialidad, distancia y disponibilidad.</w:t>
+            </w:r>
+          </w:p>
+          <w:p>
+            <w:pPr>
+              <w:spacing w:after="40"/>
+              <w:ind w:left="284" w:hanging="284"/>
+              <w:jc w:val="both"/>
+            </w:pPr>
+            <w:r>
+              <w:rPr>
+                <w:rFonts w:ascii="Calibri" w:hAnsi="Calibri"/>
+                <w:color w:val="000000"/>
+                <w:sz w:val="20"/>
+              </w:rPr>
+              <w:t xml:space="preserve">•	Integrar una visualización en mapa y en lista de los resultados de búsqueda mediante Google Maps Platform.</w:t>
+            </w:r>
+          </w:p>
+          <w:p>
+            <w:pPr>
+              <w:spacing w:after="40"/>
+              <w:ind w:left="284" w:hanging="284"/>
+              <w:jc w:val="both"/>
+            </w:pPr>
+            <w:r>
+              <w:rPr>
+                <w:rFonts w:ascii="Calibri" w:hAnsi="Calibri"/>
+                <w:color w:val="000000"/>
+                <w:sz w:val="20"/>
+              </w:rPr>
+              <w:t xml:space="preserve">•	Construir un asistente de inteligencia artificial, integrado con la API de Claude, que oriente al usuario y recomiende categorías de profesionales.</w:t>
+            </w:r>
+          </w:p>
+          <w:p>
+            <w:pPr>
+              <w:spacing w:after="40"/>
+              <w:ind w:left="284" w:hanging="284"/>
+              <w:jc w:val="both"/>
+            </w:pPr>
+            <w:r>
+              <w:rPr>
+                <w:rFonts w:ascii="Calibri" w:hAnsi="Calibri"/>
+                <w:color w:val="000000"/>
+                <w:sz w:val="20"/>
+              </w:rPr>
+              <w:t xml:space="preserve">•	Implementar el gestor de alimentación, incluyendo el registro de comidas mediante lenguaje natural y el cálculo estimado de calorías y macronutrientes.</w:t>
+            </w:r>
+          </w:p>
+          <w:p>
+            <w:pPr>
+              <w:spacing w:after="40"/>
+              <w:ind w:left="284" w:hanging="284"/>
+              <w:jc w:val="both"/>
+            </w:pPr>
+            <w:r>
+              <w:rPr>
+                <w:rFonts w:ascii="Calibri" w:hAnsi="Calibri"/>
+                <w:color w:val="000000"/>
+                <w:sz w:val="20"/>
+              </w:rPr>
+              <w:t xml:space="preserve">•	Diseñar un modelo de datos relacional y escalable en MySQL que soporte usuarios, profesionales, establecimientos, conversaciones y registros nutricionales.</w:t>
+            </w:r>
+          </w:p>
+          <w:p>
+            <w:pPr>
+              <w:spacing w:after="40"/>
+              <w:ind w:left="284" w:hanging="284"/>
+              <w:jc w:val="both"/>
+            </w:pPr>
+            <w:r>
+              <w:rPr>
+                <w:rFonts w:ascii="Calibri" w:hAnsi="Calibri"/>
+                <w:color w:val="000000"/>
+                <w:sz w:val="20"/>
+              </w:rPr>
+              <w:t xml:space="preserve">•	Desplegar la solución utilizando contenedores Docker, asegurando portabilidad y facilidad de instalación.</w:t>
+            </w:r>
+          </w:p>
+          <w:p>
+            <w:pPr>
+              <w:spacing w:after="40"/>
+              <w:ind w:left="284" w:hanging="284"/>
+              <w:jc w:val="both"/>
+            </w:pPr>
+            <w:r>
+              <w:rPr>
+                <w:rFonts w:ascii="Calibri" w:hAnsi="Calibri"/>
+                <w:color w:val="000000"/>
+                <w:sz w:val="20"/>
+              </w:rPr>
+              <w:t xml:space="preserve">•	Implementar un módulo básico de reservas que permita a los profesionales publicar su disponibilidad y a los usuarios reservar una hora indicando brevemente su necesidad. </w:t>
+            </w:r>
+            <w:r>
+              <w:rPr>
+                <w:rFonts w:ascii="Calibri" w:hAnsi="Calibri"/>
+                <w:b/>
+                <w:color w:val="000000"/>
+                <w:sz w:val="20"/>
+              </w:rPr>
+              <w:t xml:space="preserve">(nuevo en la Fase 2)</w:t>
             </w:r>
           </w:p>
         </w:tc>
@@ -1309,11 +1365,12 @@
         </w:tc>
       </w:tr>
     </w:tbl>
+    <w:p/>
     <w:tbl>
       <w:tblPr>
         <w:tblStyle w:val="Tablaconcuadrcula"/>
-        <w:tblpPr w:leftFromText="141" w:rightFromText="141" w:vertAnchor="text" w:horzAnchor="margin" w:tblpX="-719" w:tblpY="-116"/>
         <w:tblW w:w="9640" w:type="dxa"/>
+        <w:tblInd w:w="-719" w:type="dxa"/>
         <w:tblBorders>
           <w:top w:val="single" w:sz="4" w:space="0" w:color="BFBFBF" w:themeColor="background1" w:themeShade="BF"/>
           <w:left w:val="single" w:sz="4" w:space="0" w:color="BFBFBF" w:themeColor="background1" w:themeShade="BF"/>
@@ -1353,25 +1410,7 @@
                 <w:szCs w:val="28"/>
               </w:rPr>
               <w:lastRenderedPageBreak/>
-              <w:t>2</w:t>
-            </w:r>
-            <w:r>
-              <w:rPr>
-                <w:b/>
-                <w:color w:val="1F3864" w:themeColor="accent1" w:themeShade="80"/>
-                <w:sz w:val="28"/>
-                <w:szCs w:val="28"/>
-              </w:rPr>
-              <w:t xml:space="preserve">. </w:t>
-            </w:r>
-            <w:r>
-              <w:rPr>
-                <w:b/>
-                <w:color w:val="1F3864" w:themeColor="accent1" w:themeShade="80"/>
-                <w:sz w:val="28"/>
-                <w:szCs w:val="28"/>
-              </w:rPr>
-              <w:t xml:space="preserve">Monitoreo del Plan de Trabajo </w:t>
+              <w:t xml:space="preserve">2. Monitoreo del Plan de Trabajo </w:t>
             </w:r>
           </w:p>
         </w:tc>
@@ -1399,21 +1438,7 @@
                 <w:rFonts w:ascii="Calibri" w:hAnsi="Calibri"/>
                 <w:color w:val="1F3864" w:themeColor="accent1" w:themeShade="80"/>
               </w:rPr>
-              <w:t xml:space="preserve">Examina cuidadosamente tu plan de trabajo, enfocándote especialmente en la columna de </w:t>
-            </w:r>
-            <w:r>
-              <w:rPr>
-                <w:rFonts w:ascii="Calibri" w:hAnsi="Calibri"/>
-                <w:color w:val="1F3864" w:themeColor="accent1" w:themeShade="80"/>
-              </w:rPr>
-              <w:t xml:space="preserve">estado de avance </w:t>
-            </w:r>
-            <w:r>
-              <w:rPr>
-                <w:rFonts w:ascii="Calibri" w:hAnsi="Calibri"/>
-                <w:color w:val="1F3864" w:themeColor="accent1" w:themeShade="80"/>
-              </w:rPr>
-              <w:t>y ajustes.</w:t>
+              <w:t xml:space="preserve">Examina cuidadosamente tu plan de trabajo, enfocándote especialmente en la columna de estado de avance y ajustes.</w:t>
             </w:r>
           </w:p>
         </w:tc>
@@ -1434,8 +1459,8 @@
     <w:tbl>
       <w:tblPr>
         <w:tblStyle w:val="Tablaconcuadrcula"/>
-        <w:tblpPr w:leftFromText="180" w:rightFromText="180" w:vertAnchor="page" w:horzAnchor="margin" w:tblpXSpec="center" w:tblpY="3517"/>
         <w:tblW w:w="9776" w:type="dxa"/>
+        <w:jc w:val="center"/>
         <w:tblBorders>
           <w:top w:val="single" w:sz="4" w:space="0" w:color="BFBFBF" w:themeColor="background1" w:themeShade="BF"/>
           <w:left w:val="single" w:sz="4" w:space="0" w:color="BFBFBF" w:themeColor="background1" w:themeShade="BF"/>
@@ -1449,13 +1474,13 @@
       </w:tblPr>
       <w:tblGrid>
         <w:gridCol w:w="1328"/>
-        <w:gridCol w:w="1077"/>
-        <w:gridCol w:w="1276"/>
-        <w:gridCol w:w="1276"/>
-        <w:gridCol w:w="1275"/>
-        <w:gridCol w:w="1276"/>
-        <w:gridCol w:w="1418"/>
-        <w:gridCol w:w="850"/>
+        <w:gridCol w:w="1150"/>
+        <w:gridCol w:w="950"/>
+        <w:gridCol w:w="1000"/>
+        <w:gridCol w:w="1250"/>
+        <w:gridCol w:w="1350"/>
+        <w:gridCol w:w="1076"/>
+        <w:gridCol w:w="1672"/>
       </w:tblGrid>
       <w:tr>
         <w:trPr>
@@ -1511,29 +1536,37 @@
                 <w:color w:val="1F3864" w:themeColor="accent1" w:themeShade="80"/>
                 <w:sz w:val="18"/>
               </w:rPr>
-              <w:t>C</w:t>
-            </w:r>
-            <w:r>
+              <w:t xml:space="preserve">Competencia o unidades de competencias</w:t>
+            </w:r>
+          </w:p>
+        </w:tc>
+        <w:tc>
+          <w:tcPr>
+            <w:tcW w:w="1150" w:type="dxa"/>
+            <w:vAlign w:val="center"/>
+          </w:tcPr>
+          <w:p>
+            <w:pPr>
+              <w:jc w:val="center"/>
               <w:rPr>
                 <w:rFonts w:ascii="Calibri" w:hAnsi="Calibri"/>
                 <w:color w:val="1F3864" w:themeColor="accent1" w:themeShade="80"/>
                 <w:sz w:val="18"/>
               </w:rPr>
-              <w:t>ompetencia</w:t>
-            </w:r>
+            </w:pPr>
             <w:r>
               <w:rPr>
                 <w:rFonts w:ascii="Calibri" w:hAnsi="Calibri"/>
                 <w:color w:val="1F3864" w:themeColor="accent1" w:themeShade="80"/>
                 <w:sz w:val="18"/>
               </w:rPr>
-              <w:t xml:space="preserve"> o unidades de competencias</w:t>
-            </w:r>
-          </w:p>
-        </w:tc>
-        <w:tc>
-          <w:tcPr>
-            <w:tcW w:w="1077" w:type="dxa"/>
+              <w:t>Actividades</w:t>
+            </w:r>
+          </w:p>
+        </w:tc>
+        <w:tc>
+          <w:tcPr>
+            <w:tcW w:w="950" w:type="dxa"/>
             <w:vAlign w:val="center"/>
           </w:tcPr>
           <w:p>
@@ -1551,13 +1584,13 @@
                 <w:color w:val="1F3864" w:themeColor="accent1" w:themeShade="80"/>
                 <w:sz w:val="18"/>
               </w:rPr>
-              <w:t>Actividades</w:t>
-            </w:r>
-          </w:p>
-        </w:tc>
-        <w:tc>
-          <w:tcPr>
-            <w:tcW w:w="1276" w:type="dxa"/>
+              <w:t>Recursos</w:t>
+            </w:r>
+          </w:p>
+        </w:tc>
+        <w:tc>
+          <w:tcPr>
+            <w:tcW w:w="1000" w:type="dxa"/>
             <w:vAlign w:val="center"/>
           </w:tcPr>
           <w:p>
@@ -1575,13 +1608,13 @@
                 <w:color w:val="1F3864" w:themeColor="accent1" w:themeShade="80"/>
                 <w:sz w:val="18"/>
               </w:rPr>
-              <w:t>Recursos</w:t>
-            </w:r>
-          </w:p>
-        </w:tc>
-        <w:tc>
-          <w:tcPr>
-            <w:tcW w:w="1276" w:type="dxa"/>
+              <w:t>Duración de la actividad</w:t>
+            </w:r>
+          </w:p>
+        </w:tc>
+        <w:tc>
+          <w:tcPr>
+            <w:tcW w:w="1250" w:type="dxa"/>
             <w:vAlign w:val="center"/>
           </w:tcPr>
           <w:p>
@@ -1599,46 +1632,46 @@
                 <w:color w:val="1F3864" w:themeColor="accent1" w:themeShade="80"/>
                 <w:sz w:val="18"/>
               </w:rPr>
-              <w:t>Duración de la actividad</w:t>
-            </w:r>
-          </w:p>
-        </w:tc>
-        <w:tc>
-          <w:tcPr>
-            <w:tcW w:w="1275" w:type="dxa"/>
-            <w:vAlign w:val="center"/>
-          </w:tcPr>
-          <w:p>
-            <w:pPr>
-              <w:jc w:val="center"/>
-              <w:rPr>
+              <w:t>Responsable</w:t>
+            </w:r>
+            <w:r>
+              <w:rPr>
+                <w:rStyle w:val="Refdenotaalpie"/>
                 <w:rFonts w:ascii="Calibri" w:hAnsi="Calibri"/>
                 <w:color w:val="1F3864" w:themeColor="accent1" w:themeShade="80"/>
                 <w:sz w:val="18"/>
               </w:rPr>
-            </w:pPr>
-            <w:r>
+              <w:footnoteReference w:id="1"/>
+            </w:r>
+          </w:p>
+        </w:tc>
+        <w:tc>
+          <w:tcPr>
+            <w:tcW w:w="1350" w:type="dxa"/>
+            <w:vAlign w:val="center"/>
+          </w:tcPr>
+          <w:p>
+            <w:pPr>
+              <w:jc w:val="center"/>
               <w:rPr>
                 <w:rFonts w:ascii="Calibri" w:hAnsi="Calibri"/>
                 <w:color w:val="1F3864" w:themeColor="accent1" w:themeShade="80"/>
                 <w:sz w:val="18"/>
               </w:rPr>
-              <w:t>Responsable</w:t>
-            </w:r>
-            <w:r>
-              <w:rPr>
-                <w:rStyle w:val="Refdenotaalpie"/>
+            </w:pPr>
+            <w:r>
+              <w:rPr>
                 <w:rFonts w:ascii="Calibri" w:hAnsi="Calibri"/>
                 <w:color w:val="1F3864" w:themeColor="accent1" w:themeShade="80"/>
                 <w:sz w:val="18"/>
               </w:rPr>
-              <w:footnoteReference w:id="1"/>
-            </w:r>
-          </w:p>
-        </w:tc>
-        <w:tc>
-          <w:tcPr>
-            <w:tcW w:w="1276" w:type="dxa"/>
+              <w:t>Observaciones</w:t>
+            </w:r>
+          </w:p>
+        </w:tc>
+        <w:tc>
+          <w:tcPr>
+            <w:tcW w:w="1076" w:type="dxa"/>
             <w:vAlign w:val="center"/>
           </w:tcPr>
           <w:p>
@@ -1656,13 +1689,13 @@
                 <w:color w:val="1F3864" w:themeColor="accent1" w:themeShade="80"/>
                 <w:sz w:val="18"/>
               </w:rPr>
-              <w:t>Observaciones</w:t>
-            </w:r>
-          </w:p>
-        </w:tc>
-        <w:tc>
-          <w:tcPr>
-            <w:tcW w:w="1418" w:type="dxa"/>
+              <w:t>Estado de avance</w:t>
+            </w:r>
+          </w:p>
+        </w:tc>
+        <w:tc>
+          <w:tcPr>
+            <w:tcW w:w="1672" w:type="dxa"/>
             <w:vAlign w:val="center"/>
           </w:tcPr>
           <w:p>
@@ -1680,39 +1713,7 @@
                 <w:color w:val="1F3864" w:themeColor="accent1" w:themeShade="80"/>
                 <w:sz w:val="18"/>
               </w:rPr>
-              <w:t>Estado de avance</w:t>
-            </w:r>
-          </w:p>
-        </w:tc>
-        <w:tc>
-          <w:tcPr>
-            <w:tcW w:w="850" w:type="dxa"/>
-            <w:vAlign w:val="center"/>
-          </w:tcPr>
-          <w:p>
-            <w:pPr>
-              <w:jc w:val="center"/>
-              <w:rPr>
-                <w:rFonts w:ascii="Calibri" w:hAnsi="Calibri"/>
-                <w:color w:val="1F3864" w:themeColor="accent1" w:themeShade="80"/>
-                <w:sz w:val="18"/>
-              </w:rPr>
-            </w:pPr>
-            <w:r>
-              <w:rPr>
-                <w:rFonts w:ascii="Calibri" w:hAnsi="Calibri"/>
-                <w:color w:val="1F3864" w:themeColor="accent1" w:themeShade="80"/>
-                <w:sz w:val="18"/>
-              </w:rPr>
-              <w:t>A</w:t>
-            </w:r>
-            <w:r>
-              <w:rPr>
-                <w:rFonts w:ascii="Calibri" w:hAnsi="Calibri"/>
-                <w:color w:val="1F3864" w:themeColor="accent1" w:themeShade="80"/>
-                <w:sz w:val="18"/>
-              </w:rPr>
-              <w:t>justes</w:t>
+              <w:t>Ajustes</w:t>
             </w:r>
           </w:p>
         </w:tc>
@@ -1743,9 +1744,17 @@
                 <w:szCs w:val="20"/>
                 <w:lang w:eastAsia="es-CL"/>
               </w:rPr>
-              <w:t xml:space="preserve">Nombra las competencias o unidades de competencias </w:t>
-            </w:r>
-            <w:r>
+              <w:t xml:space="preserve">Nombra las competencias o unidades de competencias que se relacionan con las diferentes actividades requeridas para el desarrollo del proyecto APT.</w:t>
+            </w:r>
+          </w:p>
+        </w:tc>
+        <w:tc>
+          <w:tcPr>
+            <w:tcW w:w="1150" w:type="dxa"/>
+          </w:tcPr>
+          <w:p>
+            <w:pPr>
+              <w:jc w:val="both"/>
               <w:rPr>
                 <w:rFonts w:ascii="Calibri" w:hAnsi="Calibri" w:cs="Arial"/>
                 <w:i/>
@@ -1754,8 +1763,7 @@
                 <w:szCs w:val="20"/>
                 <w:lang w:eastAsia="es-CL"/>
               </w:rPr>
-              <w:t xml:space="preserve">que se relacionan con las diferentes actividades </w:t>
-            </w:r>
+            </w:pPr>
             <w:r>
               <w:rPr>
                 <w:rFonts w:ascii="Calibri" w:hAnsi="Calibri" w:cs="Arial"/>
@@ -1765,8 +1773,23 @@
                 <w:szCs w:val="20"/>
                 <w:lang w:eastAsia="es-CL"/>
               </w:rPr>
-              <w:t>requeridas para el desarrollo de</w:t>
-            </w:r>
+              <w:t xml:space="preserve">Nombra las actividades que se necesitan para desarrollar el proyecto APT. </w:t>
+            </w:r>
+          </w:p>
+        </w:tc>
+        <w:tc>
+          <w:tcPr>
+            <w:tcW w:w="950" w:type="dxa"/>
+          </w:tcPr>
+          <w:p>
+            <w:pPr>
+              <w:jc w:val="both"/>
+              <w:rPr>
+                <w:b/>
+                <w:sz w:val="18"/>
+                <w:szCs w:val="24"/>
+              </w:rPr>
+            </w:pPr>
             <w:r>
               <w:rPr>
                 <w:rFonts w:ascii="Calibri" w:hAnsi="Calibri" w:cs="Arial"/>
@@ -1776,8 +1799,23 @@
                 <w:szCs w:val="20"/>
                 <w:lang w:eastAsia="es-CL"/>
               </w:rPr>
-              <w:t>l proyecto APT</w:t>
-            </w:r>
+              <w:t xml:space="preserve">Nombra los recursos necesarios para llevar a cabo las actividades definidas.</w:t>
+            </w:r>
+          </w:p>
+        </w:tc>
+        <w:tc>
+          <w:tcPr>
+            <w:tcW w:w="1000" w:type="dxa"/>
+          </w:tcPr>
+          <w:p>
+            <w:pPr>
+              <w:jc w:val="both"/>
+              <w:rPr>
+                <w:b/>
+                <w:sz w:val="18"/>
+                <w:szCs w:val="24"/>
+              </w:rPr>
+            </w:pPr>
             <w:r>
               <w:rPr>
                 <w:rFonts w:ascii="Calibri" w:hAnsi="Calibri" w:cs="Arial"/>
@@ -1787,13 +1825,13 @@
                 <w:szCs w:val="20"/>
                 <w:lang w:eastAsia="es-CL"/>
               </w:rPr>
-              <w:t>.</w:t>
-            </w:r>
-          </w:p>
-        </w:tc>
-        <w:tc>
-          <w:tcPr>
-            <w:tcW w:w="1077" w:type="dxa"/>
+              <w:t xml:space="preserve">Señala la duración de cada actividad. </w:t>
+            </w:r>
+          </w:p>
+        </w:tc>
+        <w:tc>
+          <w:tcPr>
+            <w:tcW w:w="1250" w:type="dxa"/>
           </w:tcPr>
           <w:p>
             <w:pPr>
@@ -1816,9 +1854,17 @@
                 <w:szCs w:val="20"/>
                 <w:lang w:eastAsia="es-CL"/>
               </w:rPr>
-              <w:t>Nombra</w:t>
-            </w:r>
-            <w:r>
+              <w:t xml:space="preserve">Escribe el nombre del integrante del equipo responsable de cada actividad.</w:t>
+            </w:r>
+          </w:p>
+        </w:tc>
+        <w:tc>
+          <w:tcPr>
+            <w:tcW w:w="1350" w:type="dxa"/>
+          </w:tcPr>
+          <w:p>
+            <w:pPr>
+              <w:jc w:val="both"/>
               <w:rPr>
                 <w:rFonts w:ascii="Calibri" w:hAnsi="Calibri" w:cs="Arial"/>
                 <w:i/>
@@ -1827,8 +1873,7 @@
                 <w:szCs w:val="20"/>
                 <w:lang w:eastAsia="es-CL"/>
               </w:rPr>
-              <w:t xml:space="preserve"> la</w:t>
-            </w:r>
+            </w:pPr>
             <w:r>
               <w:rPr>
                 <w:rFonts w:ascii="Calibri" w:hAnsi="Calibri" w:cs="Arial"/>
@@ -1838,9 +1883,17 @@
                 <w:szCs w:val="20"/>
                 <w:lang w:eastAsia="es-CL"/>
               </w:rPr>
-              <w:t>s</w:t>
-            </w:r>
-            <w:r>
+              <w:t xml:space="preserve">Señala las dificultades o facilitadores que se podrían presentar durante la ejecución de cada una de las actividades propuestas.</w:t>
+            </w:r>
+          </w:p>
+        </w:tc>
+        <w:tc>
+          <w:tcPr>
+            <w:tcW w:w="1076" w:type="dxa"/>
+          </w:tcPr>
+          <w:p>
+            <w:pPr>
+              <w:jc w:val="both"/>
               <w:rPr>
                 <w:rFonts w:ascii="Calibri" w:hAnsi="Calibri" w:cs="Arial"/>
                 <w:i/>
@@ -1849,8 +1902,7 @@
                 <w:szCs w:val="20"/>
                 <w:lang w:eastAsia="es-CL"/>
               </w:rPr>
-              <w:t xml:space="preserve"> </w:t>
-            </w:r>
+            </w:pPr>
             <w:r>
               <w:rPr>
                 <w:rFonts w:ascii="Calibri" w:hAnsi="Calibri" w:cs="Arial"/>
@@ -1860,24 +1912,25 @@
                 <w:szCs w:val="20"/>
                 <w:lang w:eastAsia="es-CL"/>
               </w:rPr>
-              <w:t xml:space="preserve">actividades que se necesitan para desarrollar el proyecto APT. </w:t>
-            </w:r>
-          </w:p>
-        </w:tc>
-        <w:tc>
-          <w:tcPr>
-            <w:tcW w:w="1276" w:type="dxa"/>
-          </w:tcPr>
-          <w:p>
-            <w:pPr>
-              <w:jc w:val="both"/>
-              <w:rPr>
-                <w:b/>
-                <w:sz w:val="18"/>
-                <w:szCs w:val="24"/>
-              </w:rPr>
-            </w:pPr>
-            <w:r>
+              <w:t xml:space="preserve">Describe el estado de avance de cada actividad.</w:t>
+            </w:r>
+          </w:p>
+          <w:p>
+            <w:pPr>
+              <w:jc w:val="both"/>
+              <w:rPr>
+                <w:rFonts w:ascii="Calibri" w:hAnsi="Calibri" w:cs="Arial"/>
+                <w:i/>
+                <w:color w:val="C00000"/>
+                <w:sz w:val="16"/>
+                <w:szCs w:val="20"/>
+                <w:lang w:eastAsia="es-CL"/>
+              </w:rPr>
+            </w:pPr>
+          </w:p>
+          <w:p>
+            <w:pPr>
+              <w:jc w:val="both"/>
               <w:rPr>
                 <w:rFonts w:ascii="Calibri" w:hAnsi="Calibri" w:cs="Arial"/>
                 <w:i/>
@@ -1886,8 +1939,7 @@
                 <w:szCs w:val="20"/>
                 <w:lang w:eastAsia="es-CL"/>
               </w:rPr>
-              <w:t>Nombra los recursos necesarios para llevar a cabo las actividades</w:t>
-            </w:r>
+            </w:pPr>
             <w:r>
               <w:rPr>
                 <w:rFonts w:ascii="Calibri" w:hAnsi="Calibri" w:cs="Arial"/>
@@ -1897,8 +1949,21 @@
                 <w:szCs w:val="20"/>
                 <w:lang w:eastAsia="es-CL"/>
               </w:rPr>
-              <w:t xml:space="preserve"> </w:t>
-            </w:r>
+              <w:t xml:space="preserve">Tipos de estado: </w:t>
+            </w:r>
+          </w:p>
+          <w:p>
+            <w:pPr>
+              <w:jc w:val="both"/>
+              <w:rPr>
+                <w:rFonts w:ascii="Calibri" w:hAnsi="Calibri" w:cs="Arial"/>
+                <w:i/>
+                <w:color w:val="C00000"/>
+                <w:sz w:val="16"/>
+                <w:szCs w:val="20"/>
+                <w:lang w:eastAsia="es-CL"/>
+              </w:rPr>
+            </w:pPr>
             <w:r>
               <w:rPr>
                 <w:rFonts w:ascii="Calibri" w:hAnsi="Calibri" w:cs="Arial"/>
@@ -1908,24 +1973,28 @@
                 <w:szCs w:val="20"/>
                 <w:lang w:eastAsia="es-CL"/>
               </w:rPr>
-              <w:t>definidas.</w:t>
-            </w:r>
-          </w:p>
-        </w:tc>
-        <w:tc>
-          <w:tcPr>
-            <w:tcW w:w="1276" w:type="dxa"/>
-          </w:tcPr>
-          <w:p>
-            <w:pPr>
-              <w:jc w:val="both"/>
-              <w:rPr>
-                <w:b/>
-                <w:sz w:val="18"/>
-                <w:szCs w:val="24"/>
-              </w:rPr>
-            </w:pPr>
-            <w:r>
+              <w:t>En curso/ Con retraso/ No iniciado/ Completado/ Ajustada</w:t>
+            </w:r>
+            <w:r>
+              <w:rPr>
+                <w:rFonts w:ascii="Calibri" w:hAnsi="Calibri" w:cs="Arial"/>
+                <w:i/>
+                <w:color w:val="C00000"/>
+                <w:sz w:val="16"/>
+                <w:szCs w:val="20"/>
+                <w:lang w:eastAsia="es-CL"/>
+              </w:rPr>
+              <w:t xml:space="preserve"> </w:t>
+            </w:r>
+          </w:p>
+        </w:tc>
+        <w:tc>
+          <w:tcPr>
+            <w:tcW w:w="1672" w:type="dxa"/>
+          </w:tcPr>
+          <w:p>
+            <w:pPr>
+              <w:jc w:val="both"/>
               <w:rPr>
                 <w:rFonts w:ascii="Calibri" w:hAnsi="Calibri" w:cs="Arial"/>
                 <w:i/>
@@ -1934,8 +2003,7 @@
                 <w:szCs w:val="20"/>
                 <w:lang w:eastAsia="es-CL"/>
               </w:rPr>
-              <w:t xml:space="preserve">Señala </w:t>
-            </w:r>
+            </w:pPr>
             <w:r>
               <w:rPr>
                 <w:rFonts w:ascii="Calibri" w:hAnsi="Calibri" w:cs="Arial"/>
@@ -1945,371 +2013,7 @@
                 <w:szCs w:val="20"/>
                 <w:lang w:eastAsia="es-CL"/>
               </w:rPr>
-              <w:t>la duración de</w:t>
-            </w:r>
-            <w:r>
-              <w:rPr>
-                <w:rFonts w:ascii="Calibri" w:hAnsi="Calibri" w:cs="Arial"/>
-                <w:i/>
-                <w:color w:val="548DD4"/>
-                <w:sz w:val="18"/>
-                <w:szCs w:val="20"/>
-                <w:lang w:eastAsia="es-CL"/>
-              </w:rPr>
-              <w:t xml:space="preserve"> cada </w:t>
-            </w:r>
-            <w:r>
-              <w:rPr>
-                <w:rFonts w:ascii="Calibri" w:hAnsi="Calibri" w:cs="Arial"/>
-                <w:i/>
-                <w:color w:val="548DD4"/>
-                <w:sz w:val="18"/>
-                <w:szCs w:val="20"/>
-                <w:lang w:eastAsia="es-CL"/>
-              </w:rPr>
-              <w:t>actividad</w:t>
-            </w:r>
-            <w:r>
-              <w:rPr>
-                <w:rFonts w:ascii="Calibri" w:hAnsi="Calibri" w:cs="Arial"/>
-                <w:i/>
-                <w:color w:val="548DD4"/>
-                <w:sz w:val="18"/>
-                <w:szCs w:val="20"/>
-                <w:lang w:eastAsia="es-CL"/>
-              </w:rPr>
-              <w:t xml:space="preserve">. </w:t>
-            </w:r>
-          </w:p>
-        </w:tc>
-        <w:tc>
-          <w:tcPr>
-            <w:tcW w:w="1275" w:type="dxa"/>
-          </w:tcPr>
-          <w:p>
-            <w:pPr>
-              <w:jc w:val="both"/>
-              <w:rPr>
-                <w:rFonts w:ascii="Calibri" w:hAnsi="Calibri" w:cs="Arial"/>
-                <w:i/>
-                <w:color w:val="548DD4"/>
-                <w:sz w:val="18"/>
-                <w:szCs w:val="20"/>
-                <w:lang w:eastAsia="es-CL"/>
-              </w:rPr>
-            </w:pPr>
-            <w:r>
-              <w:rPr>
-                <w:rFonts w:ascii="Calibri" w:hAnsi="Calibri" w:cs="Arial"/>
-                <w:i/>
-                <w:color w:val="548DD4"/>
-                <w:sz w:val="18"/>
-                <w:szCs w:val="20"/>
-                <w:lang w:eastAsia="es-CL"/>
-              </w:rPr>
-              <w:t xml:space="preserve">Escribe el </w:t>
-            </w:r>
-            <w:r>
-              <w:rPr>
-                <w:rFonts w:ascii="Calibri" w:hAnsi="Calibri" w:cs="Arial"/>
-                <w:i/>
-                <w:color w:val="548DD4"/>
-                <w:sz w:val="18"/>
-                <w:szCs w:val="20"/>
-                <w:lang w:eastAsia="es-CL"/>
-              </w:rPr>
-              <w:t xml:space="preserve">nombre del integrante del equipo responsable de </w:t>
-            </w:r>
-            <w:r>
-              <w:rPr>
-                <w:rFonts w:ascii="Calibri" w:hAnsi="Calibri" w:cs="Arial"/>
-                <w:i/>
-                <w:color w:val="548DD4"/>
-                <w:sz w:val="18"/>
-                <w:szCs w:val="20"/>
-                <w:lang w:eastAsia="es-CL"/>
-              </w:rPr>
-              <w:t xml:space="preserve">cada </w:t>
-            </w:r>
-            <w:r>
-              <w:rPr>
-                <w:rFonts w:ascii="Calibri" w:hAnsi="Calibri" w:cs="Arial"/>
-                <w:i/>
-                <w:color w:val="548DD4"/>
-                <w:sz w:val="18"/>
-                <w:szCs w:val="20"/>
-                <w:lang w:eastAsia="es-CL"/>
-              </w:rPr>
-              <w:t>actividad.</w:t>
-            </w:r>
-          </w:p>
-        </w:tc>
-        <w:tc>
-          <w:tcPr>
-            <w:tcW w:w="1276" w:type="dxa"/>
-          </w:tcPr>
-          <w:p>
-            <w:pPr>
-              <w:jc w:val="both"/>
-              <w:rPr>
-                <w:rFonts w:ascii="Calibri" w:hAnsi="Calibri" w:cs="Arial"/>
-                <w:i/>
-                <w:color w:val="548DD4"/>
-                <w:sz w:val="18"/>
-                <w:szCs w:val="20"/>
-                <w:lang w:eastAsia="es-CL"/>
-              </w:rPr>
-            </w:pPr>
-            <w:r>
-              <w:rPr>
-                <w:rFonts w:ascii="Calibri" w:hAnsi="Calibri" w:cs="Arial"/>
-                <w:i/>
-                <w:color w:val="548DD4"/>
-                <w:sz w:val="18"/>
-                <w:szCs w:val="20"/>
-                <w:lang w:eastAsia="es-CL"/>
-              </w:rPr>
-              <w:t xml:space="preserve">Señala </w:t>
-            </w:r>
-            <w:r>
-              <w:rPr>
-                <w:rFonts w:ascii="Calibri" w:hAnsi="Calibri" w:cs="Arial"/>
-                <w:i/>
-                <w:color w:val="548DD4"/>
-                <w:sz w:val="18"/>
-                <w:szCs w:val="20"/>
-                <w:lang w:eastAsia="es-CL"/>
-              </w:rPr>
-              <w:t>las dific</w:t>
-            </w:r>
-            <w:r>
-              <w:rPr>
-                <w:rFonts w:ascii="Calibri" w:hAnsi="Calibri" w:cs="Arial"/>
-                <w:i/>
-                <w:color w:val="548DD4"/>
-                <w:sz w:val="18"/>
-                <w:szCs w:val="20"/>
-                <w:lang w:eastAsia="es-CL"/>
-              </w:rPr>
-              <w:t>ult</w:t>
-            </w:r>
-            <w:r>
-              <w:rPr>
-                <w:rFonts w:ascii="Calibri" w:hAnsi="Calibri" w:cs="Arial"/>
-                <w:i/>
-                <w:color w:val="548DD4"/>
-                <w:sz w:val="18"/>
-                <w:szCs w:val="20"/>
-                <w:lang w:eastAsia="es-CL"/>
-              </w:rPr>
-              <w:t>ades o facilitadores que se podrían presentar durante la ejecución de cada una de las actividades propuestas.</w:t>
-            </w:r>
-          </w:p>
-        </w:tc>
-        <w:tc>
-          <w:tcPr>
-            <w:tcW w:w="1418" w:type="dxa"/>
-          </w:tcPr>
-          <w:p>
-            <w:pPr>
-              <w:jc w:val="both"/>
-              <w:rPr>
-                <w:rFonts w:ascii="Calibri" w:hAnsi="Calibri" w:cs="Arial"/>
-                <w:i/>
-                <w:color w:val="548DD4"/>
-                <w:sz w:val="18"/>
-                <w:szCs w:val="20"/>
-                <w:lang w:eastAsia="es-CL"/>
-              </w:rPr>
-            </w:pPr>
-            <w:r>
-              <w:rPr>
-                <w:rFonts w:ascii="Calibri" w:hAnsi="Calibri" w:cs="Arial"/>
-                <w:i/>
-                <w:color w:val="548DD4"/>
-                <w:sz w:val="18"/>
-                <w:szCs w:val="20"/>
-                <w:lang w:eastAsia="es-CL"/>
-              </w:rPr>
-              <w:t>D</w:t>
-            </w:r>
-            <w:r>
-              <w:rPr>
-                <w:rFonts w:ascii="Calibri" w:hAnsi="Calibri" w:cs="Arial"/>
-                <w:i/>
-                <w:color w:val="548DD4"/>
-                <w:sz w:val="18"/>
-                <w:szCs w:val="20"/>
-                <w:lang w:eastAsia="es-CL"/>
-              </w:rPr>
-              <w:t>escribe</w:t>
-            </w:r>
-            <w:r>
-              <w:rPr>
-                <w:rFonts w:ascii="Calibri" w:hAnsi="Calibri" w:cs="Arial"/>
-                <w:i/>
-                <w:color w:val="548DD4"/>
-                <w:sz w:val="18"/>
-                <w:szCs w:val="20"/>
-                <w:lang w:eastAsia="es-CL"/>
-              </w:rPr>
-              <w:t xml:space="preserve"> el estado de avance </w:t>
-            </w:r>
-            <w:r>
-              <w:rPr>
-                <w:rFonts w:ascii="Calibri" w:hAnsi="Calibri" w:cs="Arial"/>
-                <w:i/>
-                <w:color w:val="548DD4"/>
-                <w:sz w:val="18"/>
-                <w:szCs w:val="20"/>
-                <w:lang w:eastAsia="es-CL"/>
-              </w:rPr>
-              <w:t>de cada actividad.</w:t>
-            </w:r>
-          </w:p>
-          <w:p>
-            <w:pPr>
-              <w:jc w:val="both"/>
-              <w:rPr>
-                <w:rFonts w:ascii="Calibri" w:hAnsi="Calibri" w:cs="Arial"/>
-                <w:i/>
-                <w:color w:val="C00000"/>
-                <w:sz w:val="16"/>
-                <w:szCs w:val="20"/>
-                <w:lang w:eastAsia="es-CL"/>
-              </w:rPr>
-            </w:pPr>
-          </w:p>
-          <w:p>
-            <w:pPr>
-              <w:jc w:val="both"/>
-              <w:rPr>
-                <w:rFonts w:ascii="Calibri" w:hAnsi="Calibri" w:cs="Arial"/>
-                <w:i/>
-                <w:color w:val="548DD4"/>
-                <w:sz w:val="18"/>
-                <w:szCs w:val="20"/>
-                <w:lang w:eastAsia="es-CL"/>
-              </w:rPr>
-            </w:pPr>
-            <w:r>
-              <w:rPr>
-                <w:rFonts w:ascii="Calibri" w:hAnsi="Calibri" w:cs="Arial"/>
-                <w:i/>
-                <w:color w:val="548DD4"/>
-                <w:sz w:val="18"/>
-                <w:szCs w:val="20"/>
-                <w:lang w:eastAsia="es-CL"/>
-              </w:rPr>
-              <w:t xml:space="preserve">Tipos de estado: </w:t>
-            </w:r>
-          </w:p>
-          <w:p>
-            <w:pPr>
-              <w:jc w:val="both"/>
-              <w:rPr>
-                <w:rFonts w:ascii="Calibri" w:hAnsi="Calibri" w:cs="Arial"/>
-                <w:i/>
-                <w:color w:val="C00000"/>
-                <w:sz w:val="16"/>
-                <w:szCs w:val="20"/>
-                <w:lang w:eastAsia="es-CL"/>
-              </w:rPr>
-            </w:pPr>
-            <w:r>
-              <w:rPr>
-                <w:rFonts w:ascii="Calibri" w:hAnsi="Calibri" w:cs="Arial"/>
-                <w:i/>
-                <w:color w:val="548DD4"/>
-                <w:sz w:val="18"/>
-                <w:szCs w:val="20"/>
-                <w:lang w:eastAsia="es-CL"/>
-              </w:rPr>
-              <w:t>En curso/ Con retraso/ No iniciado/ Completado/ Ajustada</w:t>
-            </w:r>
-            <w:r>
-              <w:rPr>
-                <w:rFonts w:ascii="Calibri" w:hAnsi="Calibri" w:cs="Arial"/>
-                <w:i/>
-                <w:color w:val="C00000"/>
-                <w:sz w:val="16"/>
-                <w:szCs w:val="20"/>
-                <w:lang w:eastAsia="es-CL"/>
-              </w:rPr>
-              <w:t xml:space="preserve"> </w:t>
-            </w:r>
-          </w:p>
-        </w:tc>
-        <w:tc>
-          <w:tcPr>
-            <w:tcW w:w="850" w:type="dxa"/>
-          </w:tcPr>
-          <w:p>
-            <w:pPr>
-              <w:jc w:val="both"/>
-              <w:rPr>
-                <w:rFonts w:ascii="Calibri" w:hAnsi="Calibri" w:cs="Arial"/>
-                <w:i/>
-                <w:color w:val="548DD4"/>
-                <w:sz w:val="18"/>
-                <w:szCs w:val="20"/>
-                <w:lang w:eastAsia="es-CL"/>
-              </w:rPr>
-            </w:pPr>
-            <w:r>
-              <w:rPr>
-                <w:rFonts w:ascii="Calibri" w:hAnsi="Calibri" w:cs="Arial"/>
-                <w:i/>
-                <w:color w:val="548DD4"/>
-                <w:sz w:val="18"/>
-                <w:szCs w:val="20"/>
-                <w:lang w:eastAsia="es-CL"/>
-              </w:rPr>
-              <w:t>S</w:t>
-            </w:r>
-            <w:r>
-              <w:rPr>
-                <w:rFonts w:ascii="Calibri" w:hAnsi="Calibri" w:cs="Arial"/>
-                <w:i/>
-                <w:color w:val="548DD4"/>
-                <w:sz w:val="18"/>
-                <w:szCs w:val="20"/>
-                <w:lang w:eastAsia="es-CL"/>
-              </w:rPr>
-              <w:t>e</w:t>
-            </w:r>
-            <w:r>
-              <w:rPr>
-                <w:rFonts w:ascii="Calibri" w:hAnsi="Calibri" w:cs="Arial"/>
-                <w:i/>
-                <w:color w:val="548DD4"/>
-                <w:sz w:val="18"/>
-                <w:szCs w:val="20"/>
-                <w:lang w:eastAsia="es-CL"/>
-              </w:rPr>
-              <w:t xml:space="preserve">ñala los ajustes o reformulaciones </w:t>
-            </w:r>
-            <w:r>
-              <w:rPr>
-                <w:rFonts w:ascii="Calibri" w:hAnsi="Calibri" w:cs="Arial"/>
-                <w:i/>
-                <w:color w:val="548DD4"/>
-                <w:sz w:val="18"/>
-                <w:szCs w:val="20"/>
-                <w:lang w:eastAsia="es-CL"/>
-              </w:rPr>
-              <w:t>que has realiza</w:t>
-            </w:r>
-            <w:r>
-              <w:rPr>
-                <w:rFonts w:ascii="Calibri" w:hAnsi="Calibri" w:cs="Arial"/>
-                <w:i/>
-                <w:color w:val="548DD4"/>
-                <w:sz w:val="18"/>
-                <w:szCs w:val="20"/>
-                <w:lang w:eastAsia="es-CL"/>
-              </w:rPr>
-              <w:t xml:space="preserve">do. </w:t>
+              <w:t xml:space="preserve">Señala los ajustes o reformulaciones que has realizado. </w:t>
             </w:r>
           </w:p>
         </w:tc>
@@ -2339,7 +2043,7 @@
         </w:tc>
         <w:tc>
           <w:tcPr>
-            <w:tcW w:w="1077" w:type="dxa"/>
+            <w:tcW w:w="1150" w:type="dxa"/>
           </w:tcPr>
           <w:p>
             <w:pPr>
@@ -2358,7 +2062,7 @@
         </w:tc>
         <w:tc>
           <w:tcPr>
-            <w:tcW w:w="1276" w:type="dxa"/>
+            <w:tcW w:w="950" w:type="dxa"/>
           </w:tcPr>
           <w:p>
             <w:pPr>
@@ -2377,7 +2081,7 @@
         </w:tc>
         <w:tc>
           <w:tcPr>
-            <w:tcW w:w="1276" w:type="dxa"/>
+            <w:tcW w:w="1000" w:type="dxa"/>
           </w:tcPr>
           <w:p>
             <w:pPr>
@@ -2396,7 +2100,7 @@
         </w:tc>
         <w:tc>
           <w:tcPr>
-            <w:tcW w:w="1275" w:type="dxa"/>
+            <w:tcW w:w="1250" w:type="dxa"/>
           </w:tcPr>
           <w:p>
             <w:pPr>
@@ -2415,7 +2119,7 @@
         </w:tc>
         <w:tc>
           <w:tcPr>
-            <w:tcW w:w="1276" w:type="dxa"/>
+            <w:tcW w:w="1350" w:type="dxa"/>
           </w:tcPr>
           <w:p>
             <w:pPr>
@@ -2434,7 +2138,7 @@
         </w:tc>
         <w:tc>
           <w:tcPr>
-            <w:tcW w:w="1418" w:type="dxa"/>
+            <w:tcW w:w="1076" w:type="dxa"/>
           </w:tcPr>
           <w:p>
             <w:pPr>
@@ -2453,7 +2157,7 @@
         </w:tc>
         <w:tc>
           <w:tcPr>
-            <w:tcW w:w="850" w:type="dxa"/>
+            <w:tcW w:w="1672" w:type="dxa"/>
           </w:tcPr>
           <w:p>
             <w:pPr>
@@ -2496,7 +2200,7 @@
         </w:tc>
         <w:tc>
           <w:tcPr>
-            <w:tcW w:w="1077" w:type="dxa"/>
+            <w:tcW w:w="1150" w:type="dxa"/>
           </w:tcPr>
           <w:p>
             <w:pPr>
@@ -2515,7 +2219,7 @@
         </w:tc>
         <w:tc>
           <w:tcPr>
-            <w:tcW w:w="1276" w:type="dxa"/>
+            <w:tcW w:w="950" w:type="dxa"/>
           </w:tcPr>
           <w:p>
             <w:pPr>
@@ -2534,7 +2238,7 @@
         </w:tc>
         <w:tc>
           <w:tcPr>
-            <w:tcW w:w="1276" w:type="dxa"/>
+            <w:tcW w:w="1000" w:type="dxa"/>
           </w:tcPr>
           <w:p>
             <w:pPr>
@@ -2553,7 +2257,7 @@
         </w:tc>
         <w:tc>
           <w:tcPr>
-            <w:tcW w:w="1275" w:type="dxa"/>
+            <w:tcW w:w="1250" w:type="dxa"/>
           </w:tcPr>
           <w:p>
             <w:pPr>
@@ -2572,7 +2276,7 @@
         </w:tc>
         <w:tc>
           <w:tcPr>
-            <w:tcW w:w="1276" w:type="dxa"/>
+            <w:tcW w:w="1350" w:type="dxa"/>
           </w:tcPr>
           <w:p>
             <w:pPr>
@@ -2591,7 +2295,7 @@
         </w:tc>
         <w:tc>
           <w:tcPr>
-            <w:tcW w:w="1418" w:type="dxa"/>
+            <w:tcW w:w="1076" w:type="dxa"/>
           </w:tcPr>
           <w:p>
             <w:pPr>
@@ -2610,7 +2314,7 @@
         </w:tc>
         <w:tc>
           <w:tcPr>
-            <w:tcW w:w="850" w:type="dxa"/>
+            <w:tcW w:w="1672" w:type="dxa"/>
           </w:tcPr>
           <w:p>
             <w:pPr>
@@ -2653,7 +2357,7 @@
         </w:tc>
         <w:tc>
           <w:tcPr>
-            <w:tcW w:w="1077" w:type="dxa"/>
+            <w:tcW w:w="1150" w:type="dxa"/>
           </w:tcPr>
           <w:p>
             <w:pPr>
@@ -2672,7 +2376,7 @@
         </w:tc>
         <w:tc>
           <w:tcPr>
-            <w:tcW w:w="1276" w:type="dxa"/>
+            <w:tcW w:w="950" w:type="dxa"/>
           </w:tcPr>
           <w:p>
             <w:pPr>
@@ -2691,7 +2395,7 @@
         </w:tc>
         <w:tc>
           <w:tcPr>
-            <w:tcW w:w="1276" w:type="dxa"/>
+            <w:tcW w:w="1000" w:type="dxa"/>
           </w:tcPr>
           <w:p>
             <w:pPr>
@@ -2710,7 +2414,7 @@
         </w:tc>
         <w:tc>
           <w:tcPr>
-            <w:tcW w:w="1275" w:type="dxa"/>
+            <w:tcW w:w="1250" w:type="dxa"/>
           </w:tcPr>
           <w:p>
             <w:pPr>
@@ -2729,7 +2433,7 @@
         </w:tc>
         <w:tc>
           <w:tcPr>
-            <w:tcW w:w="1276" w:type="dxa"/>
+            <w:tcW w:w="1350" w:type="dxa"/>
           </w:tcPr>
           <w:p>
             <w:pPr>
@@ -2748,7 +2452,7 @@
         </w:tc>
         <w:tc>
           <w:tcPr>
-            <w:tcW w:w="1418" w:type="dxa"/>
+            <w:tcW w:w="1076" w:type="dxa"/>
           </w:tcPr>
           <w:p>
             <w:pPr>
@@ -2767,7 +2471,7 @@
         </w:tc>
         <w:tc>
           <w:tcPr>
-            <w:tcW w:w="850" w:type="dxa"/>
+            <w:tcW w:w="1672" w:type="dxa"/>
           </w:tcPr>
           <w:p>
             <w:pPr>
@@ -2824,7 +2528,7 @@
         </w:tc>
         <w:tc>
           <w:tcPr>
-            <w:tcW w:w="1077" w:type="dxa"/>
+            <w:tcW w:w="1150" w:type="dxa"/>
           </w:tcPr>
           <w:p>
             <w:pPr>
@@ -2843,7 +2547,7 @@
         </w:tc>
         <w:tc>
           <w:tcPr>
-            <w:tcW w:w="1276" w:type="dxa"/>
+            <w:tcW w:w="950" w:type="dxa"/>
           </w:tcPr>
           <w:p>
             <w:pPr>
@@ -2862,7 +2566,7 @@
         </w:tc>
         <w:tc>
           <w:tcPr>
-            <w:tcW w:w="1276" w:type="dxa"/>
+            <w:tcW w:w="1000" w:type="dxa"/>
           </w:tcPr>
           <w:p>
             <w:pPr>
@@ -2881,7 +2585,7 @@
         </w:tc>
         <w:tc>
           <w:tcPr>
-            <w:tcW w:w="1275" w:type="dxa"/>
+            <w:tcW w:w="1250" w:type="dxa"/>
           </w:tcPr>
           <w:p>
             <w:pPr>
@@ -2900,7 +2604,7 @@
         </w:tc>
         <w:tc>
           <w:tcPr>
-            <w:tcW w:w="1276" w:type="dxa"/>
+            <w:tcW w:w="1350" w:type="dxa"/>
           </w:tcPr>
           <w:p>
             <w:pPr>
@@ -2919,7 +2623,7 @@
         </w:tc>
         <w:tc>
           <w:tcPr>
-            <w:tcW w:w="1418" w:type="dxa"/>
+            <w:tcW w:w="1076" w:type="dxa"/>
           </w:tcPr>
           <w:p>
             <w:pPr>
@@ -2938,7 +2642,7 @@
         </w:tc>
         <w:tc>
           <w:tcPr>
-            <w:tcW w:w="850" w:type="dxa"/>
+            <w:tcW w:w="1672" w:type="dxa"/>
           </w:tcPr>
           <w:p>
             <w:pPr>
@@ -2981,7 +2685,7 @@
         </w:tc>
         <w:tc>
           <w:tcPr>
-            <w:tcW w:w="1077" w:type="dxa"/>
+            <w:tcW w:w="1150" w:type="dxa"/>
           </w:tcPr>
           <w:p>
             <w:pPr>
@@ -3000,7 +2704,7 @@
         </w:tc>
         <w:tc>
           <w:tcPr>
-            <w:tcW w:w="1276" w:type="dxa"/>
+            <w:tcW w:w="950" w:type="dxa"/>
           </w:tcPr>
           <w:p>
             <w:pPr>
@@ -3019,7 +2723,7 @@
         </w:tc>
         <w:tc>
           <w:tcPr>
-            <w:tcW w:w="1276" w:type="dxa"/>
+            <w:tcW w:w="1000" w:type="dxa"/>
           </w:tcPr>
           <w:p>
             <w:pPr>
@@ -3038,7 +2742,7 @@
         </w:tc>
         <w:tc>
           <w:tcPr>
-            <w:tcW w:w="1275" w:type="dxa"/>
+            <w:tcW w:w="1250" w:type="dxa"/>
           </w:tcPr>
           <w:p>
             <w:pPr>
@@ -3057,7 +2761,7 @@
         </w:tc>
         <w:tc>
           <w:tcPr>
-            <w:tcW w:w="1276" w:type="dxa"/>
+            <w:tcW w:w="1350" w:type="dxa"/>
           </w:tcPr>
           <w:p>
             <w:pPr>
@@ -3076,7 +2780,7 @@
         </w:tc>
         <w:tc>
           <w:tcPr>
-            <w:tcW w:w="1418" w:type="dxa"/>
+            <w:tcW w:w="1076" w:type="dxa"/>
           </w:tcPr>
           <w:p>
             <w:pPr>
@@ -3095,7 +2799,7 @@
         </w:tc>
         <w:tc>
           <w:tcPr>
-            <w:tcW w:w="850" w:type="dxa"/>
+            <w:tcW w:w="1672" w:type="dxa"/>
           </w:tcPr>
           <w:p>
             <w:pPr>
@@ -3138,7 +2842,7 @@
         </w:tc>
         <w:tc>
           <w:tcPr>
-            <w:tcW w:w="1077" w:type="dxa"/>
+            <w:tcW w:w="1150" w:type="dxa"/>
           </w:tcPr>
           <w:p>
             <w:pPr>
@@ -3157,7 +2861,7 @@
         </w:tc>
         <w:tc>
           <w:tcPr>
-            <w:tcW w:w="1276" w:type="dxa"/>
+            <w:tcW w:w="950" w:type="dxa"/>
           </w:tcPr>
           <w:p>
             <w:pPr>
@@ -3176,7 +2880,7 @@
         </w:tc>
         <w:tc>
           <w:tcPr>
-            <w:tcW w:w="1276" w:type="dxa"/>
+            <w:tcW w:w="1000" w:type="dxa"/>
           </w:tcPr>
           <w:p>
             <w:pPr>
@@ -3195,7 +2899,7 @@
         </w:tc>
         <w:tc>
           <w:tcPr>
-            <w:tcW w:w="1275" w:type="dxa"/>
+            <w:tcW w:w="1250" w:type="dxa"/>
           </w:tcPr>
           <w:p>
             <w:pPr>
@@ -3214,7 +2918,7 @@
         </w:tc>
         <w:tc>
           <w:tcPr>
-            <w:tcW w:w="1276" w:type="dxa"/>
+            <w:tcW w:w="1350" w:type="dxa"/>
           </w:tcPr>
           <w:p>
             <w:pPr>
@@ -3233,7 +2937,7 @@
         </w:tc>
         <w:tc>
           <w:tcPr>
-            <w:tcW w:w="1418" w:type="dxa"/>
+            <w:tcW w:w="1076" w:type="dxa"/>
           </w:tcPr>
           <w:p>
             <w:pPr>
@@ -3252,7 +2956,7 @@
         </w:tc>
         <w:tc>
           <w:tcPr>
-            <w:tcW w:w="850" w:type="dxa"/>
+            <w:tcW w:w="1672" w:type="dxa"/>
           </w:tcPr>
           <w:p>
             <w:pPr>
@@ -3295,7 +2999,7 @@
         </w:tc>
         <w:tc>
           <w:tcPr>
-            <w:tcW w:w="1077" w:type="dxa"/>
+            <w:tcW w:w="1150" w:type="dxa"/>
           </w:tcPr>
           <w:p>
             <w:pPr>
@@ -3314,7 +3018,7 @@
         </w:tc>
         <w:tc>
           <w:tcPr>
-            <w:tcW w:w="1276" w:type="dxa"/>
+            <w:tcW w:w="950" w:type="dxa"/>
           </w:tcPr>
           <w:p>
             <w:pPr>
@@ -3333,7 +3037,7 @@
         </w:tc>
         <w:tc>
           <w:tcPr>
-            <w:tcW w:w="1276" w:type="dxa"/>
+            <w:tcW w:w="1000" w:type="dxa"/>
           </w:tcPr>
           <w:p>
             <w:pPr>
@@ -3352,26 +3056,26 @@
         </w:tc>
         <w:tc>
           <w:tcPr>
-            <w:tcW w:w="1275" w:type="dxa"/>
-          </w:tcPr>
-          <w:p>
-            <w:pPr>
-              <w:spacing w:after="80"/>
-              <w:jc w:val="both"/>
-            </w:pPr>
-            <w:r>
-              <w:rPr>
-                <w:rFonts w:ascii="Calibri" w:hAnsi="Calibri"/>
-                <w:color w:val="000000"/>
-                <w:sz w:val="16"/>
-              </w:rPr>
-              <w:t>Luis Méndez</w:t>
-            </w:r>
-          </w:p>
-        </w:tc>
-        <w:tc>
-          <w:tcPr>
-            <w:tcW w:w="1276" w:type="dxa"/>
+            <w:tcW w:w="1250" w:type="dxa"/>
+          </w:tcPr>
+          <w:p>
+            <w:pPr>
+              <w:spacing w:after="80"/>
+              <w:jc w:val="both"/>
+            </w:pPr>
+            <w:r>
+              <w:rPr>
+                <w:rFonts w:ascii="Calibri" w:hAnsi="Calibri"/>
+                <w:color w:val="000000"/>
+                <w:sz w:val="16"/>
+              </w:rPr>
+              <w:t>Luis Méndez (ficha, FS-HU-04) y Nicolás Silva (listado, FS-HU-03)</w:t>
+            </w:r>
+          </w:p>
+        </w:tc>
+        <w:tc>
+          <w:tcPr>
+            <w:tcW w:w="1350" w:type="dxa"/>
           </w:tcPr>
           <w:p>
             <w:pPr>
@@ -3390,7 +3094,7 @@
         </w:tc>
         <w:tc>
           <w:tcPr>
-            <w:tcW w:w="1418" w:type="dxa"/>
+            <w:tcW w:w="1076" w:type="dxa"/>
           </w:tcPr>
           <w:p>
             <w:pPr>
@@ -3409,7 +3113,7 @@
         </w:tc>
         <w:tc>
           <w:tcPr>
-            <w:tcW w:w="850" w:type="dxa"/>
+            <w:tcW w:w="1672" w:type="dxa"/>
           </w:tcPr>
           <w:p>
             <w:pPr>
@@ -3466,7 +3170,7 @@
         </w:tc>
         <w:tc>
           <w:tcPr>
-            <w:tcW w:w="1077" w:type="dxa"/>
+            <w:tcW w:w="1150" w:type="dxa"/>
           </w:tcPr>
           <w:p>
             <w:pPr>
@@ -3485,7 +3189,7 @@
         </w:tc>
         <w:tc>
           <w:tcPr>
-            <w:tcW w:w="1276" w:type="dxa"/>
+            <w:tcW w:w="950" w:type="dxa"/>
           </w:tcPr>
           <w:p>
             <w:pPr>
@@ -3504,7 +3208,7 @@
         </w:tc>
         <w:tc>
           <w:tcPr>
-            <w:tcW w:w="1276" w:type="dxa"/>
+            <w:tcW w:w="1000" w:type="dxa"/>
           </w:tcPr>
           <w:p>
             <w:pPr>
@@ -3523,7 +3227,7 @@
         </w:tc>
         <w:tc>
           <w:tcPr>
-            <w:tcW w:w="1275" w:type="dxa"/>
+            <w:tcW w:w="1250" w:type="dxa"/>
           </w:tcPr>
           <w:p>
             <w:pPr>
@@ -3542,7 +3246,7 @@
         </w:tc>
         <w:tc>
           <w:tcPr>
-            <w:tcW w:w="1276" w:type="dxa"/>
+            <w:tcW w:w="1350" w:type="dxa"/>
           </w:tcPr>
           <w:p>
             <w:pPr>
@@ -3561,7 +3265,7 @@
         </w:tc>
         <w:tc>
           <w:tcPr>
-            <w:tcW w:w="1418" w:type="dxa"/>
+            <w:tcW w:w="1076" w:type="dxa"/>
           </w:tcPr>
           <w:p>
             <w:pPr>
@@ -3580,7 +3284,7 @@
         </w:tc>
         <w:tc>
           <w:tcPr>
-            <w:tcW w:w="850" w:type="dxa"/>
+            <w:tcW w:w="1672" w:type="dxa"/>
           </w:tcPr>
           <w:p>
             <w:pPr>
@@ -3637,7 +3341,7 @@
         </w:tc>
         <w:tc>
           <w:tcPr>
-            <w:tcW w:w="1077" w:type="dxa"/>
+            <w:tcW w:w="1150" w:type="dxa"/>
           </w:tcPr>
           <w:p>
             <w:pPr>
@@ -3656,7 +3360,7 @@
         </w:tc>
         <w:tc>
           <w:tcPr>
-            <w:tcW w:w="1276" w:type="dxa"/>
+            <w:tcW w:w="950" w:type="dxa"/>
           </w:tcPr>
           <w:p>
             <w:pPr>
@@ -3675,7 +3379,7 @@
         </w:tc>
         <w:tc>
           <w:tcPr>
-            <w:tcW w:w="1276" w:type="dxa"/>
+            <w:tcW w:w="1000" w:type="dxa"/>
           </w:tcPr>
           <w:p>
             <w:pPr>
@@ -3694,7 +3398,7 @@
         </w:tc>
         <w:tc>
           <w:tcPr>
-            <w:tcW w:w="1275" w:type="dxa"/>
+            <w:tcW w:w="1250" w:type="dxa"/>
           </w:tcPr>
           <w:p>
             <w:pPr>
@@ -3713,7 +3417,7 @@
         </w:tc>
         <w:tc>
           <w:tcPr>
-            <w:tcW w:w="1276" w:type="dxa"/>
+            <w:tcW w:w="1350" w:type="dxa"/>
           </w:tcPr>
           <w:p>
             <w:pPr>
@@ -3732,7 +3436,7 @@
         </w:tc>
         <w:tc>
           <w:tcPr>
-            <w:tcW w:w="1418" w:type="dxa"/>
+            <w:tcW w:w="1076" w:type="dxa"/>
           </w:tcPr>
           <w:p>
             <w:pPr>
@@ -3751,7 +3455,7 @@
         </w:tc>
         <w:tc>
           <w:tcPr>
-            <w:tcW w:w="850" w:type="dxa"/>
+            <w:tcW w:w="1672" w:type="dxa"/>
           </w:tcPr>
           <w:p>
             <w:pPr>
@@ -3794,7 +3498,7 @@
         </w:tc>
         <w:tc>
           <w:tcPr>
-            <w:tcW w:w="1077" w:type="dxa"/>
+            <w:tcW w:w="1150" w:type="dxa"/>
           </w:tcPr>
           <w:p>
             <w:pPr>
@@ -3813,7 +3517,7 @@
         </w:tc>
         <w:tc>
           <w:tcPr>
-            <w:tcW w:w="1276" w:type="dxa"/>
+            <w:tcW w:w="950" w:type="dxa"/>
           </w:tcPr>
           <w:p>
             <w:pPr>
@@ -3832,7 +3536,7 @@
         </w:tc>
         <w:tc>
           <w:tcPr>
-            <w:tcW w:w="1276" w:type="dxa"/>
+            <w:tcW w:w="1000" w:type="dxa"/>
           </w:tcPr>
           <w:p>
             <w:pPr>
@@ -3851,26 +3555,26 @@
         </w:tc>
         <w:tc>
           <w:tcPr>
-            <w:tcW w:w="1275" w:type="dxa"/>
-          </w:tcPr>
-          <w:p>
-            <w:pPr>
-              <w:spacing w:after="80"/>
-              <w:jc w:val="both"/>
-            </w:pPr>
-            <w:r>
-              <w:rPr>
-                <w:rFonts w:ascii="Calibri" w:hAnsi="Calibri"/>
-                <w:color w:val="000000"/>
-                <w:sz w:val="16"/>
-              </w:rPr>
-              <w:t>Nicolás Silva</w:t>
-            </w:r>
-          </w:p>
-        </w:tc>
-        <w:tc>
-          <w:tcPr>
-            <w:tcW w:w="1276" w:type="dxa"/>
+            <w:tcW w:w="1250" w:type="dxa"/>
+          </w:tcPr>
+          <w:p>
+            <w:pPr>
+              <w:spacing w:after="80"/>
+              <w:jc w:val="both"/>
+            </w:pPr>
+            <w:r>
+              <w:rPr>
+                <w:rFonts w:ascii="Calibri" w:hAnsi="Calibri"/>
+                <w:color w:val="000000"/>
+                <w:sz w:val="16"/>
+              </w:rPr>
+              <w:t>Nicolás Silva (planificado); implementada por Rodrigo Cárcamo Rojas (filtros) y Luis Méndez (mapa)</w:t>
+            </w:r>
+          </w:p>
+        </w:tc>
+        <w:tc>
+          <w:tcPr>
+            <w:tcW w:w="1350" w:type="dxa"/>
           </w:tcPr>
           <w:p>
             <w:pPr>
@@ -3889,7 +3593,7 @@
         </w:tc>
         <w:tc>
           <w:tcPr>
-            <w:tcW w:w="1418" w:type="dxa"/>
+            <w:tcW w:w="1076" w:type="dxa"/>
           </w:tcPr>
           <w:p>
             <w:pPr>
@@ -3908,7 +3612,7 @@
         </w:tc>
         <w:tc>
           <w:tcPr>
-            <w:tcW w:w="850" w:type="dxa"/>
+            <w:tcW w:w="1672" w:type="dxa"/>
           </w:tcPr>
           <w:p>
             <w:pPr>
@@ -3965,7 +3669,7 @@
         </w:tc>
         <w:tc>
           <w:tcPr>
-            <w:tcW w:w="1077" w:type="dxa"/>
+            <w:tcW w:w="1150" w:type="dxa"/>
           </w:tcPr>
           <w:p>
             <w:pPr>
@@ -3984,7 +3688,7 @@
         </w:tc>
         <w:tc>
           <w:tcPr>
-            <w:tcW w:w="1276" w:type="dxa"/>
+            <w:tcW w:w="950" w:type="dxa"/>
           </w:tcPr>
           <w:p>
             <w:pPr>
@@ -4003,7 +3707,7 @@
         </w:tc>
         <w:tc>
           <w:tcPr>
-            <w:tcW w:w="1276" w:type="dxa"/>
+            <w:tcW w:w="1000" w:type="dxa"/>
           </w:tcPr>
           <w:p>
             <w:pPr>
@@ -4022,7 +3726,7 @@
         </w:tc>
         <w:tc>
           <w:tcPr>
-            <w:tcW w:w="1275" w:type="dxa"/>
+            <w:tcW w:w="1250" w:type="dxa"/>
           </w:tcPr>
           <w:p>
             <w:pPr>
@@ -4041,7 +3745,7 @@
         </w:tc>
         <w:tc>
           <w:tcPr>
-            <w:tcW w:w="1276" w:type="dxa"/>
+            <w:tcW w:w="1350" w:type="dxa"/>
           </w:tcPr>
           <w:p>
             <w:pPr>
@@ -4060,7 +3764,7 @@
         </w:tc>
         <w:tc>
           <w:tcPr>
-            <w:tcW w:w="1418" w:type="dxa"/>
+            <w:tcW w:w="1076" w:type="dxa"/>
           </w:tcPr>
           <w:p>
             <w:pPr>
@@ -4079,7 +3783,7 @@
         </w:tc>
         <w:tc>
           <w:tcPr>
-            <w:tcW w:w="850" w:type="dxa"/>
+            <w:tcW w:w="1672" w:type="dxa"/>
           </w:tcPr>
           <w:p>
             <w:pPr>
@@ -4122,7 +3826,7 @@
         </w:tc>
         <w:tc>
           <w:tcPr>
-            <w:tcW w:w="1077" w:type="dxa"/>
+            <w:tcW w:w="1150" w:type="dxa"/>
           </w:tcPr>
           <w:p>
             <w:pPr>
@@ -4141,7 +3845,7 @@
         </w:tc>
         <w:tc>
           <w:tcPr>
-            <w:tcW w:w="1276" w:type="dxa"/>
+            <w:tcW w:w="950" w:type="dxa"/>
           </w:tcPr>
           <w:p>
             <w:pPr>
@@ -4160,7 +3864,7 @@
         </w:tc>
         <w:tc>
           <w:tcPr>
-            <w:tcW w:w="1276" w:type="dxa"/>
+            <w:tcW w:w="1000" w:type="dxa"/>
           </w:tcPr>
           <w:p>
             <w:pPr>
@@ -4179,7 +3883,7 @@
         </w:tc>
         <w:tc>
           <w:tcPr>
-            <w:tcW w:w="1275" w:type="dxa"/>
+            <w:tcW w:w="1250" w:type="dxa"/>
           </w:tcPr>
           <w:p>
             <w:pPr>
@@ -4198,7 +3902,7 @@
         </w:tc>
         <w:tc>
           <w:tcPr>
-            <w:tcW w:w="1276" w:type="dxa"/>
+            <w:tcW w:w="1350" w:type="dxa"/>
           </w:tcPr>
           <w:p>
             <w:pPr>
@@ -4217,7 +3921,7 @@
         </w:tc>
         <w:tc>
           <w:tcPr>
-            <w:tcW w:w="1418" w:type="dxa"/>
+            <w:tcW w:w="1076" w:type="dxa"/>
           </w:tcPr>
           <w:p>
             <w:pPr>
@@ -4236,7 +3940,7 @@
         </w:tc>
         <w:tc>
           <w:tcPr>
-            <w:tcW w:w="850" w:type="dxa"/>
+            <w:tcW w:w="1672" w:type="dxa"/>
           </w:tcPr>
           <w:p>
             <w:pPr>
@@ -4279,7 +3983,7 @@
         </w:tc>
         <w:tc>
           <w:tcPr>
-            <w:tcW w:w="1077" w:type="dxa"/>
+            <w:tcW w:w="1150" w:type="dxa"/>
           </w:tcPr>
           <w:p>
             <w:pPr>
@@ -4298,7 +4002,7 @@
         </w:tc>
         <w:tc>
           <w:tcPr>
-            <w:tcW w:w="1276" w:type="dxa"/>
+            <w:tcW w:w="950" w:type="dxa"/>
           </w:tcPr>
           <w:p>
             <w:pPr>
@@ -4317,7 +4021,7 @@
         </w:tc>
         <w:tc>
           <w:tcPr>
-            <w:tcW w:w="1276" w:type="dxa"/>
+            <w:tcW w:w="1000" w:type="dxa"/>
           </w:tcPr>
           <w:p>
             <w:pPr>
@@ -4336,7 +4040,7 @@
         </w:tc>
         <w:tc>
           <w:tcPr>
-            <w:tcW w:w="1275" w:type="dxa"/>
+            <w:tcW w:w="1250" w:type="dxa"/>
           </w:tcPr>
           <w:p>
             <w:pPr>
@@ -4355,7 +4059,7 @@
         </w:tc>
         <w:tc>
           <w:tcPr>
-            <w:tcW w:w="1276" w:type="dxa"/>
+            <w:tcW w:w="1350" w:type="dxa"/>
           </w:tcPr>
           <w:p>
             <w:pPr>
@@ -4374,7 +4078,7 @@
         </w:tc>
         <w:tc>
           <w:tcPr>
-            <w:tcW w:w="1418" w:type="dxa"/>
+            <w:tcW w:w="1076" w:type="dxa"/>
           </w:tcPr>
           <w:p>
             <w:pPr>
@@ -4393,7 +4097,7 @@
         </w:tc>
         <w:tc>
           <w:tcPr>
-            <w:tcW w:w="850" w:type="dxa"/>
+            <w:tcW w:w="1672" w:type="dxa"/>
           </w:tcPr>
           <w:p>
             <w:pPr>
@@ -4436,7 +4140,7 @@
         </w:tc>
         <w:tc>
           <w:tcPr>
-            <w:tcW w:w="1077" w:type="dxa"/>
+            <w:tcW w:w="1150" w:type="dxa"/>
           </w:tcPr>
           <w:p>
             <w:pPr>
@@ -4455,7 +4159,7 @@
         </w:tc>
         <w:tc>
           <w:tcPr>
-            <w:tcW w:w="1276" w:type="dxa"/>
+            <w:tcW w:w="950" w:type="dxa"/>
           </w:tcPr>
           <w:p>
             <w:pPr>
@@ -4474,7 +4178,7 @@
         </w:tc>
         <w:tc>
           <w:tcPr>
-            <w:tcW w:w="1276" w:type="dxa"/>
+            <w:tcW w:w="1000" w:type="dxa"/>
           </w:tcPr>
           <w:p>
             <w:pPr>
@@ -4493,7 +4197,7 @@
         </w:tc>
         <w:tc>
           <w:tcPr>
-            <w:tcW w:w="1275" w:type="dxa"/>
+            <w:tcW w:w="1250" w:type="dxa"/>
           </w:tcPr>
           <w:p>
             <w:pPr>
@@ -4512,7 +4216,7 @@
         </w:tc>
         <w:tc>
           <w:tcPr>
-            <w:tcW w:w="1276" w:type="dxa"/>
+            <w:tcW w:w="1350" w:type="dxa"/>
           </w:tcPr>
           <w:p>
             <w:pPr>
@@ -4531,7 +4235,7 @@
         </w:tc>
         <w:tc>
           <w:tcPr>
-            <w:tcW w:w="1418" w:type="dxa"/>
+            <w:tcW w:w="1076" w:type="dxa"/>
           </w:tcPr>
           <w:p>
             <w:pPr>
@@ -4550,7 +4254,7 @@
         </w:tc>
         <w:tc>
           <w:tcPr>
-            <w:tcW w:w="850" w:type="dxa"/>
+            <w:tcW w:w="1672" w:type="dxa"/>
           </w:tcPr>
           <w:p>
             <w:pPr>
@@ -4593,7 +4297,7 @@
         </w:tc>
         <w:tc>
           <w:tcPr>
-            <w:tcW w:w="1077" w:type="dxa"/>
+            <w:tcW w:w="1150" w:type="dxa"/>
           </w:tcPr>
           <w:p>
             <w:pPr>
@@ -4612,7 +4316,7 @@
         </w:tc>
         <w:tc>
           <w:tcPr>
-            <w:tcW w:w="1276" w:type="dxa"/>
+            <w:tcW w:w="950" w:type="dxa"/>
           </w:tcPr>
           <w:p>
             <w:pPr>
@@ -4631,7 +4335,7 @@
         </w:tc>
         <w:tc>
           <w:tcPr>
-            <w:tcW w:w="1276" w:type="dxa"/>
+            <w:tcW w:w="1000" w:type="dxa"/>
           </w:tcPr>
           <w:p>
             <w:pPr>
@@ -4650,7 +4354,7 @@
         </w:tc>
         <w:tc>
           <w:tcPr>
-            <w:tcW w:w="1275" w:type="dxa"/>
+            <w:tcW w:w="1250" w:type="dxa"/>
           </w:tcPr>
           <w:p>
             <w:pPr>
@@ -4669,7 +4373,7 @@
         </w:tc>
         <w:tc>
           <w:tcPr>
-            <w:tcW w:w="1276" w:type="dxa"/>
+            <w:tcW w:w="1350" w:type="dxa"/>
           </w:tcPr>
           <w:p>
             <w:pPr>
@@ -4688,7 +4392,7 @@
         </w:tc>
         <w:tc>
           <w:tcPr>
-            <w:tcW w:w="1418" w:type="dxa"/>
+            <w:tcW w:w="1076" w:type="dxa"/>
           </w:tcPr>
           <w:p>
             <w:pPr>
@@ -4707,7 +4411,7 @@
         </w:tc>
         <w:tc>
           <w:tcPr>
-            <w:tcW w:w="850" w:type="dxa"/>
+            <w:tcW w:w="1672" w:type="dxa"/>
           </w:tcPr>
           <w:p>
             <w:pPr>
@@ -4750,7 +4454,7 @@
         </w:tc>
         <w:tc>
           <w:tcPr>
-            <w:tcW w:w="1077" w:type="dxa"/>
+            <w:tcW w:w="1150" w:type="dxa"/>
           </w:tcPr>
           <w:p>
             <w:pPr>
@@ -4769,7 +4473,7 @@
         </w:tc>
         <w:tc>
           <w:tcPr>
-            <w:tcW w:w="1276" w:type="dxa"/>
+            <w:tcW w:w="950" w:type="dxa"/>
           </w:tcPr>
           <w:p>
             <w:pPr>
@@ -4788,7 +4492,7 @@
         </w:tc>
         <w:tc>
           <w:tcPr>
-            <w:tcW w:w="1276" w:type="dxa"/>
+            <w:tcW w:w="1000" w:type="dxa"/>
           </w:tcPr>
           <w:p>
             <w:pPr>
@@ -4807,7 +4511,7 @@
         </w:tc>
         <w:tc>
           <w:tcPr>
-            <w:tcW w:w="1275" w:type="dxa"/>
+            <w:tcW w:w="1250" w:type="dxa"/>
           </w:tcPr>
           <w:p>
             <w:pPr>
@@ -4826,7 +4530,7 @@
         </w:tc>
         <w:tc>
           <w:tcPr>
-            <w:tcW w:w="1276" w:type="dxa"/>
+            <w:tcW w:w="1350" w:type="dxa"/>
           </w:tcPr>
           <w:p>
             <w:pPr>
@@ -4845,7 +4549,7 @@
         </w:tc>
         <w:tc>
           <w:tcPr>
-            <w:tcW w:w="1418" w:type="dxa"/>
+            <w:tcW w:w="1076" w:type="dxa"/>
           </w:tcPr>
           <w:p>
             <w:pPr>
@@ -4864,7 +4568,7 @@
         </w:tc>
         <w:tc>
           <w:tcPr>
-            <w:tcW w:w="850" w:type="dxa"/>
+            <w:tcW w:w="1672" w:type="dxa"/>
           </w:tcPr>
           <w:p>
             <w:pPr>
@@ -4907,7 +4611,7 @@
         </w:tc>
         <w:tc>
           <w:tcPr>
-            <w:tcW w:w="1077" w:type="dxa"/>
+            <w:tcW w:w="1150" w:type="dxa"/>
           </w:tcPr>
           <w:p>
             <w:pPr>
@@ -4926,7 +4630,7 @@
         </w:tc>
         <w:tc>
           <w:tcPr>
-            <w:tcW w:w="1276" w:type="dxa"/>
+            <w:tcW w:w="950" w:type="dxa"/>
           </w:tcPr>
           <w:p>
             <w:pPr>
@@ -4945,7 +4649,7 @@
         </w:tc>
         <w:tc>
           <w:tcPr>
-            <w:tcW w:w="1276" w:type="dxa"/>
+            <w:tcW w:w="1000" w:type="dxa"/>
           </w:tcPr>
           <w:p>
             <w:pPr>
@@ -4964,7 +4668,7 @@
         </w:tc>
         <w:tc>
           <w:tcPr>
-            <w:tcW w:w="1275" w:type="dxa"/>
+            <w:tcW w:w="1250" w:type="dxa"/>
           </w:tcPr>
           <w:p>
             <w:pPr>
@@ -4983,7 +4687,7 @@
         </w:tc>
         <w:tc>
           <w:tcPr>
-            <w:tcW w:w="1276" w:type="dxa"/>
+            <w:tcW w:w="1350" w:type="dxa"/>
           </w:tcPr>
           <w:p>
             <w:pPr>
@@ -5002,7 +4706,7 @@
         </w:tc>
         <w:tc>
           <w:tcPr>
-            <w:tcW w:w="1418" w:type="dxa"/>
+            <w:tcW w:w="1076" w:type="dxa"/>
           </w:tcPr>
           <w:p>
             <w:pPr>
@@ -5021,7 +4725,7 @@
         </w:tc>
         <w:tc>
           <w:tcPr>
-            <w:tcW w:w="850" w:type="dxa"/>
+            <w:tcW w:w="1672" w:type="dxa"/>
           </w:tcPr>
           <w:p>
             <w:pPr>
@@ -5078,7 +4782,7 @@
         </w:tc>
         <w:tc>
           <w:tcPr>
-            <w:tcW w:w="1077" w:type="dxa"/>
+            <w:tcW w:w="1150" w:type="dxa"/>
           </w:tcPr>
           <w:p>
             <w:pPr>
@@ -5097,7 +4801,7 @@
         </w:tc>
         <w:tc>
           <w:tcPr>
-            <w:tcW w:w="1276" w:type="dxa"/>
+            <w:tcW w:w="950" w:type="dxa"/>
           </w:tcPr>
           <w:p>
             <w:pPr>
@@ -5116,7 +4820,7 @@
         </w:tc>
         <w:tc>
           <w:tcPr>
-            <w:tcW w:w="1276" w:type="dxa"/>
+            <w:tcW w:w="1000" w:type="dxa"/>
           </w:tcPr>
           <w:p>
             <w:pPr>
@@ -5135,7 +4839,7 @@
         </w:tc>
         <w:tc>
           <w:tcPr>
-            <w:tcW w:w="1275" w:type="dxa"/>
+            <w:tcW w:w="1250" w:type="dxa"/>
           </w:tcPr>
           <w:p>
             <w:pPr>
@@ -5154,7 +4858,7 @@
         </w:tc>
         <w:tc>
           <w:tcPr>
-            <w:tcW w:w="1276" w:type="dxa"/>
+            <w:tcW w:w="1350" w:type="dxa"/>
           </w:tcPr>
           <w:p>
             <w:pPr>
@@ -5173,7 +4877,7 @@
         </w:tc>
         <w:tc>
           <w:tcPr>
-            <w:tcW w:w="1418" w:type="dxa"/>
+            <w:tcW w:w="1076" w:type="dxa"/>
           </w:tcPr>
           <w:p>
             <w:pPr>
@@ -5192,7 +4896,7 @@
         </w:tc>
         <w:tc>
           <w:tcPr>
-            <w:tcW w:w="850" w:type="dxa"/>
+            <w:tcW w:w="1672" w:type="dxa"/>
           </w:tcPr>
           <w:p>
             <w:pPr>
@@ -5249,7 +4953,7 @@
         </w:tc>
         <w:tc>
           <w:tcPr>
-            <w:tcW w:w="1077" w:type="dxa"/>
+            <w:tcW w:w="1150" w:type="dxa"/>
           </w:tcPr>
           <w:p>
             <w:pPr>
@@ -5268,7 +4972,7 @@
         </w:tc>
         <w:tc>
           <w:tcPr>
-            <w:tcW w:w="1276" w:type="dxa"/>
+            <w:tcW w:w="950" w:type="dxa"/>
           </w:tcPr>
           <w:p>
             <w:pPr>
@@ -5287,7 +4991,7 @@
         </w:tc>
         <w:tc>
           <w:tcPr>
-            <w:tcW w:w="1276" w:type="dxa"/>
+            <w:tcW w:w="1000" w:type="dxa"/>
           </w:tcPr>
           <w:p>
             <w:pPr>
@@ -5306,7 +5010,7 @@
         </w:tc>
         <w:tc>
           <w:tcPr>
-            <w:tcW w:w="1275" w:type="dxa"/>
+            <w:tcW w:w="1250" w:type="dxa"/>
           </w:tcPr>
           <w:p>
             <w:pPr>
@@ -5325,7 +5029,7 @@
         </w:tc>
         <w:tc>
           <w:tcPr>
-            <w:tcW w:w="1276" w:type="dxa"/>
+            <w:tcW w:w="1350" w:type="dxa"/>
           </w:tcPr>
           <w:p>
             <w:pPr>
@@ -5344,7 +5048,7 @@
         </w:tc>
         <w:tc>
           <w:tcPr>
-            <w:tcW w:w="1418" w:type="dxa"/>
+            <w:tcW w:w="1076" w:type="dxa"/>
           </w:tcPr>
           <w:p>
             <w:pPr>
@@ -5363,7 +5067,7 @@
         </w:tc>
         <w:tc>
           <w:tcPr>
-            <w:tcW w:w="850" w:type="dxa"/>
+            <w:tcW w:w="1672" w:type="dxa"/>
           </w:tcPr>
           <w:p>
             <w:pPr>
@@ -5406,7 +5110,7 @@
         </w:tc>
         <w:tc>
           <w:tcPr>
-            <w:tcW w:w="1077" w:type="dxa"/>
+            <w:tcW w:w="1150" w:type="dxa"/>
           </w:tcPr>
           <w:p>
             <w:pPr>
@@ -5425,7 +5129,7 @@
         </w:tc>
         <w:tc>
           <w:tcPr>
-            <w:tcW w:w="1276" w:type="dxa"/>
+            <w:tcW w:w="950" w:type="dxa"/>
           </w:tcPr>
           <w:p>
             <w:pPr>
@@ -5444,7 +5148,7 @@
         </w:tc>
         <w:tc>
           <w:tcPr>
-            <w:tcW w:w="1276" w:type="dxa"/>
+            <w:tcW w:w="1000" w:type="dxa"/>
           </w:tcPr>
           <w:p>
             <w:pPr>
@@ -5463,7 +5167,7 @@
         </w:tc>
         <w:tc>
           <w:tcPr>
-            <w:tcW w:w="1275" w:type="dxa"/>
+            <w:tcW w:w="1250" w:type="dxa"/>
           </w:tcPr>
           <w:p>
             <w:pPr>
@@ -5482,7 +5186,7 @@
         </w:tc>
         <w:tc>
           <w:tcPr>
-            <w:tcW w:w="1276" w:type="dxa"/>
+            <w:tcW w:w="1350" w:type="dxa"/>
           </w:tcPr>
           <w:p>
             <w:pPr>
@@ -5501,7 +5205,7 @@
         </w:tc>
         <w:tc>
           <w:tcPr>
-            <w:tcW w:w="1418" w:type="dxa"/>
+            <w:tcW w:w="1076" w:type="dxa"/>
           </w:tcPr>
           <w:p>
             <w:pPr>
@@ -5520,7 +5224,7 @@
         </w:tc>
         <w:tc>
           <w:tcPr>
-            <w:tcW w:w="850" w:type="dxa"/>
+            <w:tcW w:w="1672" w:type="dxa"/>
           </w:tcPr>
           <w:p>
             <w:pPr>
@@ -5563,7 +5267,7 @@
         </w:tc>
         <w:tc>
           <w:tcPr>
-            <w:tcW w:w="1077" w:type="dxa"/>
+            <w:tcW w:w="1150" w:type="dxa"/>
           </w:tcPr>
           <w:p>
             <w:pPr>
@@ -5582,7 +5286,7 @@
         </w:tc>
         <w:tc>
           <w:tcPr>
-            <w:tcW w:w="1276" w:type="dxa"/>
+            <w:tcW w:w="950" w:type="dxa"/>
           </w:tcPr>
           <w:p>
             <w:pPr>
@@ -5601,7 +5305,7 @@
         </w:tc>
         <w:tc>
           <w:tcPr>
-            <w:tcW w:w="1276" w:type="dxa"/>
+            <w:tcW w:w="1000" w:type="dxa"/>
           </w:tcPr>
           <w:p>
             <w:pPr>
@@ -5620,7 +5324,7 @@
         </w:tc>
         <w:tc>
           <w:tcPr>
-            <w:tcW w:w="1275" w:type="dxa"/>
+            <w:tcW w:w="1250" w:type="dxa"/>
           </w:tcPr>
           <w:p>
             <w:pPr>
@@ -5639,7 +5343,7 @@
         </w:tc>
         <w:tc>
           <w:tcPr>
-            <w:tcW w:w="1276" w:type="dxa"/>
+            <w:tcW w:w="1350" w:type="dxa"/>
           </w:tcPr>
           <w:p>
             <w:pPr>
@@ -5658,7 +5362,7 @@
         </w:tc>
         <w:tc>
           <w:tcPr>
-            <w:tcW w:w="1418" w:type="dxa"/>
+            <w:tcW w:w="1076" w:type="dxa"/>
           </w:tcPr>
           <w:p>
             <w:pPr>
@@ -5677,7 +5381,7 @@
         </w:tc>
         <w:tc>
           <w:tcPr>
-            <w:tcW w:w="850" w:type="dxa"/>
+            <w:tcW w:w="1672" w:type="dxa"/>
           </w:tcPr>
           <w:p>
             <w:pPr>
@@ -5720,7 +5424,7 @@
         </w:tc>
         <w:tc>
           <w:tcPr>
-            <w:tcW w:w="1077" w:type="dxa"/>
+            <w:tcW w:w="1150" w:type="dxa"/>
           </w:tcPr>
           <w:p>
             <w:pPr>
@@ -5739,7 +5443,7 @@
         </w:tc>
         <w:tc>
           <w:tcPr>
-            <w:tcW w:w="1276" w:type="dxa"/>
+            <w:tcW w:w="950" w:type="dxa"/>
           </w:tcPr>
           <w:p>
             <w:pPr>
@@ -5758,7 +5462,7 @@
         </w:tc>
         <w:tc>
           <w:tcPr>
-            <w:tcW w:w="1276" w:type="dxa"/>
+            <w:tcW w:w="1000" w:type="dxa"/>
           </w:tcPr>
           <w:p>
             <w:pPr>
@@ -5777,7 +5481,7 @@
         </w:tc>
         <w:tc>
           <w:tcPr>
-            <w:tcW w:w="1275" w:type="dxa"/>
+            <w:tcW w:w="1250" w:type="dxa"/>
           </w:tcPr>
           <w:p>
             <w:pPr>
@@ -5796,7 +5500,7 @@
         </w:tc>
         <w:tc>
           <w:tcPr>
-            <w:tcW w:w="1276" w:type="dxa"/>
+            <w:tcW w:w="1350" w:type="dxa"/>
           </w:tcPr>
           <w:p>
             <w:pPr>
@@ -5815,7 +5519,7 @@
         </w:tc>
         <w:tc>
           <w:tcPr>
-            <w:tcW w:w="1418" w:type="dxa"/>
+            <w:tcW w:w="1076" w:type="dxa"/>
           </w:tcPr>
           <w:p>
             <w:pPr>
@@ -5834,7 +5538,7 @@
         </w:tc>
         <w:tc>
           <w:tcPr>
-            <w:tcW w:w="850" w:type="dxa"/>
+            <w:tcW w:w="1672" w:type="dxa"/>
           </w:tcPr>
           <w:p>
             <w:pPr>
@@ -5891,7 +5595,7 @@
         </w:tc>
         <w:tc>
           <w:tcPr>
-            <w:tcW w:w="1077" w:type="dxa"/>
+            <w:tcW w:w="1150" w:type="dxa"/>
           </w:tcPr>
           <w:p>
             <w:pPr>
@@ -5910,7 +5614,7 @@
         </w:tc>
         <w:tc>
           <w:tcPr>
-            <w:tcW w:w="1276" w:type="dxa"/>
+            <w:tcW w:w="950" w:type="dxa"/>
           </w:tcPr>
           <w:p>
             <w:pPr>
@@ -5929,7 +5633,7 @@
         </w:tc>
         <w:tc>
           <w:tcPr>
-            <w:tcW w:w="1276" w:type="dxa"/>
+            <w:tcW w:w="1000" w:type="dxa"/>
           </w:tcPr>
           <w:p>
             <w:pPr>
@@ -5948,7 +5652,7 @@
         </w:tc>
         <w:tc>
           <w:tcPr>
-            <w:tcW w:w="1275" w:type="dxa"/>
+            <w:tcW w:w="1250" w:type="dxa"/>
           </w:tcPr>
           <w:p>
             <w:pPr>
@@ -5967,7 +5671,7 @@
         </w:tc>
         <w:tc>
           <w:tcPr>
-            <w:tcW w:w="1276" w:type="dxa"/>
+            <w:tcW w:w="1350" w:type="dxa"/>
           </w:tcPr>
           <w:p>
             <w:pPr>
@@ -5986,7 +5690,7 @@
         </w:tc>
         <w:tc>
           <w:tcPr>
-            <w:tcW w:w="1418" w:type="dxa"/>
+            <w:tcW w:w="1076" w:type="dxa"/>
           </w:tcPr>
           <w:p>
             <w:pPr>
@@ -6005,7 +5709,7 @@
         </w:tc>
         <w:tc>
           <w:tcPr>
-            <w:tcW w:w="850" w:type="dxa"/>
+            <w:tcW w:w="1672" w:type="dxa"/>
           </w:tcPr>
           <w:p>
             <w:pPr>
@@ -6062,7 +5766,7 @@
         </w:tc>
         <w:tc>
           <w:tcPr>
-            <w:tcW w:w="1077" w:type="dxa"/>
+            <w:tcW w:w="1150" w:type="dxa"/>
           </w:tcPr>
           <w:p>
             <w:pPr>
@@ -6081,7 +5785,7 @@
         </w:tc>
         <w:tc>
           <w:tcPr>
-            <w:tcW w:w="1276" w:type="dxa"/>
+            <w:tcW w:w="950" w:type="dxa"/>
           </w:tcPr>
           <w:p>
             <w:pPr>
@@ -6100,7 +5804,7 @@
         </w:tc>
         <w:tc>
           <w:tcPr>
-            <w:tcW w:w="1276" w:type="dxa"/>
+            <w:tcW w:w="1000" w:type="dxa"/>
           </w:tcPr>
           <w:p>
             <w:pPr>
@@ -6119,7 +5823,7 @@
         </w:tc>
         <w:tc>
           <w:tcPr>
-            <w:tcW w:w="1275" w:type="dxa"/>
+            <w:tcW w:w="1250" w:type="dxa"/>
           </w:tcPr>
           <w:p>
             <w:pPr>
@@ -6138,7 +5842,7 @@
         </w:tc>
         <w:tc>
           <w:tcPr>
-            <w:tcW w:w="1276" w:type="dxa"/>
+            <w:tcW w:w="1350" w:type="dxa"/>
           </w:tcPr>
           <w:p>
             <w:pPr>
@@ -6157,7 +5861,7 @@
         </w:tc>
         <w:tc>
           <w:tcPr>
-            <w:tcW w:w="1418" w:type="dxa"/>
+            <w:tcW w:w="1076" w:type="dxa"/>
           </w:tcPr>
           <w:p>
             <w:pPr>
@@ -6176,7 +5880,7 @@
         </w:tc>
         <w:tc>
           <w:tcPr>
-            <w:tcW w:w="850" w:type="dxa"/>
+            <w:tcW w:w="1672" w:type="dxa"/>
           </w:tcPr>
           <w:p>
             <w:pPr>
@@ -6219,7 +5923,7 @@
         </w:tc>
         <w:tc>
           <w:tcPr>
-            <w:tcW w:w="1077" w:type="dxa"/>
+            <w:tcW w:w="1150" w:type="dxa"/>
           </w:tcPr>
           <w:p>
             <w:pPr>
@@ -6238,7 +5942,7 @@
         </w:tc>
         <w:tc>
           <w:tcPr>
-            <w:tcW w:w="1276" w:type="dxa"/>
+            <w:tcW w:w="950" w:type="dxa"/>
           </w:tcPr>
           <w:p>
             <w:pPr>
@@ -6257,7 +5961,7 @@
         </w:tc>
         <w:tc>
           <w:tcPr>
-            <w:tcW w:w="1276" w:type="dxa"/>
+            <w:tcW w:w="1000" w:type="dxa"/>
           </w:tcPr>
           <w:p>
             <w:pPr>
@@ -6276,7 +5980,7 @@
         </w:tc>
         <w:tc>
           <w:tcPr>
-            <w:tcW w:w="1275" w:type="dxa"/>
+            <w:tcW w:w="1250" w:type="dxa"/>
           </w:tcPr>
           <w:p>
             <w:pPr>
@@ -6295,7 +5999,7 @@
         </w:tc>
         <w:tc>
           <w:tcPr>
-            <w:tcW w:w="1276" w:type="dxa"/>
+            <w:tcW w:w="1350" w:type="dxa"/>
           </w:tcPr>
           <w:p>
             <w:pPr>
@@ -6314,7 +6018,7 @@
         </w:tc>
         <w:tc>
           <w:tcPr>
-            <w:tcW w:w="1418" w:type="dxa"/>
+            <w:tcW w:w="1076" w:type="dxa"/>
           </w:tcPr>
           <w:p>
             <w:pPr>
@@ -6333,7 +6037,7 @@
         </w:tc>
         <w:tc>
           <w:tcPr>
-            <w:tcW w:w="850" w:type="dxa"/>
+            <w:tcW w:w="1672" w:type="dxa"/>
           </w:tcPr>
           <w:p>
             <w:pPr>
@@ -6406,25 +6110,7 @@
                 <w:sz w:val="28"/>
                 <w:szCs w:val="28"/>
               </w:rPr>
-              <w:t>3</w:t>
-            </w:r>
-            <w:r>
-              <w:rPr>
-                <w:b/>
-                <w:color w:val="1F3864" w:themeColor="accent1" w:themeShade="80"/>
-                <w:sz w:val="28"/>
-                <w:szCs w:val="28"/>
-              </w:rPr>
-              <w:t xml:space="preserve">. </w:t>
-            </w:r>
-            <w:r>
-              <w:rPr>
-                <w:b/>
-                <w:color w:val="1F3864" w:themeColor="accent1" w:themeShade="80"/>
-                <w:sz w:val="28"/>
-                <w:szCs w:val="28"/>
-              </w:rPr>
-              <w:t xml:space="preserve">Ajustes a partir del monitoreo </w:t>
+              <w:t xml:space="preserve">3. Ajustes a partir del monitoreo </w:t>
             </w:r>
           </w:p>
         </w:tc>
@@ -6453,56 +6139,7 @@
                 <w:rFonts w:ascii="Calibri" w:hAnsi="Calibri"/>
                 <w:color w:val="1F3864" w:themeColor="accent1" w:themeShade="80"/>
               </w:rPr>
-              <w:t>Profundiza en las observaciones de tu plan de trabajo</w:t>
-            </w:r>
-            <w:r>
-              <w:rPr>
-                <w:rFonts w:ascii="Calibri" w:hAnsi="Calibri"/>
-                <w:color w:val="1F3864" w:themeColor="accent1" w:themeShade="80"/>
-              </w:rPr>
-              <w:t xml:space="preserve">. Analiza las actividades planificadas y señala </w:t>
-            </w:r>
-            <w:r>
-              <w:rPr>
-                <w:rFonts w:ascii="Calibri" w:hAnsi="Calibri"/>
-                <w:color w:val="1F3864" w:themeColor="accent1" w:themeShade="80"/>
-              </w:rPr>
-              <w:t xml:space="preserve">qué </w:t>
-            </w:r>
-            <w:r>
-              <w:rPr>
-                <w:rFonts w:ascii="Calibri" w:hAnsi="Calibri"/>
-                <w:color w:val="1F3864" w:themeColor="accent1" w:themeShade="80"/>
-              </w:rPr>
-              <w:t xml:space="preserve">aspectos facilitaron u </w:t>
-            </w:r>
-            <w:r>
-              <w:rPr>
-                <w:rFonts w:ascii="Calibri" w:hAnsi="Calibri"/>
-                <w:color w:val="1F3864" w:themeColor="accent1" w:themeShade="80"/>
-              </w:rPr>
-              <w:t>obst</w:t>
-            </w:r>
-            <w:r>
-              <w:rPr>
-                <w:rFonts w:ascii="Calibri" w:hAnsi="Calibri"/>
-                <w:color w:val="1F3864" w:themeColor="accent1" w:themeShade="80"/>
-              </w:rPr>
-              <w:t xml:space="preserve">aculizaron la ejecución del plan. Plantea </w:t>
-            </w:r>
-            <w:r>
-              <w:rPr>
-                <w:rFonts w:ascii="Calibri" w:hAnsi="Calibri"/>
-                <w:color w:val="1F3864" w:themeColor="accent1" w:themeShade="80"/>
-              </w:rPr>
-              <w:t>cómo abordaste y/o abordarás</w:t>
-            </w:r>
-            <w:r>
-              <w:rPr>
-                <w:rFonts w:ascii="Calibri" w:hAnsi="Calibri"/>
-                <w:color w:val="1F3864" w:themeColor="accent1" w:themeShade="80"/>
-              </w:rPr>
-              <w:t xml:space="preserve"> los obstáculos. Por último, señala los ajustes que realizaste al plan de trabajo a partir de este análisis.</w:t>
+              <w:t xml:space="preserve">Profundiza en las observaciones de tu plan de trabajo. Analiza las actividades planificadas y señala qué aspectos facilitaron u obstaculizaron la ejecución del plan. Plantea cómo abordaste y/o abordarás los obstáculos. Por último, señala los ajustes que realizaste al plan de trabajo a partir de este análisis.</w:t>
             </w:r>
           </w:p>
         </w:tc>
@@ -6522,8 +6159,8 @@
     <w:tbl>
       <w:tblPr>
         <w:tblStyle w:val="Tablaconcuadrcula"/>
-        <w:tblpPr w:leftFromText="180" w:rightFromText="180" w:vertAnchor="text" w:horzAnchor="margin" w:tblpX="-572" w:tblpY="1"/>
-        <w:tblW w:w="5590" w:type="pct"/>
+        <w:tblW w:w="9498" w:type="dxa"/>
+        <w:tblInd w:w="-572" w:type="dxa"/>
         <w:tblBorders>
           <w:top w:val="single" w:sz="4" w:space="0" w:color="BFBFBF" w:themeColor="background1" w:themeShade="BF"/>
           <w:left w:val="single" w:sz="4" w:space="0" w:color="BFBFBF" w:themeColor="background1" w:themeShade="BF"/>
@@ -6535,7 +6172,7 @@
         <w:tblLook w:val="04A0" w:firstRow="1" w:lastRow="0" w:firstColumn="1" w:lastColumn="0" w:noHBand="0" w:noVBand="1"/>
       </w:tblPr>
       <w:tblGrid>
-        <w:gridCol w:w="9496"/>
+        <w:gridCol w:w="9498"/>
       </w:tblGrid>
       <w:tr>
         <w:trPr>
@@ -6543,7 +6180,7 @@
         </w:trPr>
         <w:tc>
           <w:tcPr>
-            <w:tcW w:w="5000" w:type="pct"/>
+            <w:tcW w:w="9498" w:type="dxa"/>
             <w:vAlign w:val="center"/>
           </w:tcPr>
           <w:p>
@@ -6564,35 +6201,7 @@
                 <w:rFonts w:ascii="Calibri" w:hAnsi="Calibri"/>
                 <w:color w:val="1F3864" w:themeColor="accent1" w:themeShade="80"/>
               </w:rPr>
-              <w:t>Factores que han f</w:t>
-            </w:r>
-            <w:r>
-              <w:rPr>
-                <w:rFonts w:ascii="Calibri" w:hAnsi="Calibri"/>
-                <w:color w:val="1F3864" w:themeColor="accent1" w:themeShade="80"/>
-              </w:rPr>
-              <w:t>acilita</w:t>
-            </w:r>
-            <w:r>
-              <w:rPr>
-                <w:rFonts w:ascii="Calibri" w:hAnsi="Calibri"/>
-                <w:color w:val="1F3864" w:themeColor="accent1" w:themeShade="80"/>
-              </w:rPr>
-              <w:t>do y/o</w:t>
-            </w:r>
-            <w:r>
-              <w:rPr>
-                <w:rFonts w:ascii="Calibri" w:hAnsi="Calibri"/>
-                <w:color w:val="1F3864" w:themeColor="accent1" w:themeShade="80"/>
-              </w:rPr>
-              <w:t xml:space="preserve"> </w:t>
-            </w:r>
-            <w:r>
-              <w:rPr>
-                <w:rFonts w:ascii="Calibri" w:hAnsi="Calibri"/>
-                <w:color w:val="1F3864" w:themeColor="accent1" w:themeShade="80"/>
-              </w:rPr>
-              <w:t>dificultado el desarrollo de mi plan de trabajo</w:t>
+              <w:t xml:space="preserve">Factores que han facilitado y/o dificultado el desarrollo de mi plan de trabajo</w:t>
             </w:r>
             <w:r>
               <w:rPr>
@@ -6614,67 +6223,7 @@
                 <w:szCs w:val="20"/>
                 <w:lang w:eastAsia="es-CL"/>
               </w:rPr>
-              <w:t>Describe los factores que han facilitado y</w:t>
-            </w:r>
-            <w:r>
-              <w:rPr>
-                <w:rFonts w:ascii="Calibri" w:hAnsi="Calibri" w:cs="Arial"/>
-                <w:i/>
-                <w:iCs/>
-                <w:color w:val="548DD4"/>
-                <w:sz w:val="20"/>
-                <w:szCs w:val="20"/>
-                <w:lang w:eastAsia="es-CL"/>
-              </w:rPr>
-              <w:t>/o</w:t>
-            </w:r>
-            <w:r>
-              <w:rPr>
-                <w:rFonts w:ascii="Calibri" w:hAnsi="Calibri" w:cs="Arial"/>
-                <w:i/>
-                <w:iCs/>
-                <w:color w:val="548DD4"/>
-                <w:sz w:val="20"/>
-                <w:szCs w:val="20"/>
-                <w:lang w:eastAsia="es-CL"/>
-              </w:rPr>
-              <w:t xml:space="preserve"> dificultado el desarrollo de tu Proyecto APT hasta ahora. En el caso de las dificultades</w:t>
-            </w:r>
-            <w:r>
-              <w:rPr>
-                <w:rFonts w:ascii="Calibri" w:hAnsi="Calibri" w:cs="Arial"/>
-                <w:i/>
-                <w:iCs/>
-                <w:color w:val="548DD4"/>
-                <w:sz w:val="20"/>
-                <w:szCs w:val="20"/>
-                <w:lang w:eastAsia="es-CL"/>
-              </w:rPr>
-              <w:t xml:space="preserve"> debes describir</w:t>
-            </w:r>
-            <w:r>
-              <w:rPr>
-                <w:rFonts w:ascii="Calibri" w:hAnsi="Calibri" w:cs="Arial"/>
-                <w:i/>
-                <w:iCs/>
-                <w:color w:val="548DD4"/>
-                <w:sz w:val="20"/>
-                <w:szCs w:val="20"/>
-                <w:lang w:eastAsia="es-CL"/>
-              </w:rPr>
-              <w:t xml:space="preserve"> qué acciones tomaste y/o tomarás para </w:t>
-            </w:r>
-            <w:r>
-              <w:rPr>
-                <w:rFonts w:ascii="Calibri" w:hAnsi="Calibri" w:cs="Arial"/>
-                <w:i/>
-                <w:iCs/>
-                <w:color w:val="548DD4"/>
-                <w:sz w:val="20"/>
-                <w:szCs w:val="20"/>
-                <w:lang w:eastAsia="es-CL"/>
-              </w:rPr>
-              <w:t xml:space="preserve">solucionarlas. </w:t>
+              <w:t xml:space="preserve">Describe los factores que han facilitado y/o dificultado el desarrollo de tu Proyecto APT hasta ahora. En el caso de las dificultades debes describir qué acciones tomaste y/o tomarás para solucionarlas. </w:t>
             </w:r>
             <w:r>
               <w:rPr>
@@ -6768,8 +6317,8 @@
     <w:tbl>
       <w:tblPr>
         <w:tblStyle w:val="Tablaconcuadrcula"/>
-        <w:tblpPr w:leftFromText="180" w:rightFromText="180" w:vertAnchor="text" w:horzAnchor="margin" w:tblpX="-572" w:tblpY="107"/>
-        <w:tblW w:w="5588" w:type="pct"/>
+        <w:tblW w:w="9498" w:type="dxa"/>
+        <w:tblInd w:w="-572" w:type="dxa"/>
         <w:tblBorders>
           <w:top w:val="single" w:sz="4" w:space="0" w:color="BFBFBF" w:themeColor="background1" w:themeShade="BF"/>
           <w:left w:val="single" w:sz="4" w:space="0" w:color="BFBFBF" w:themeColor="background1" w:themeShade="BF"/>
@@ -6781,7 +6330,7 @@
         <w:tblLook w:val="04A0" w:firstRow="1" w:lastRow="0" w:firstColumn="1" w:lastColumn="0" w:noHBand="0" w:noVBand="1"/>
       </w:tblPr>
       <w:tblGrid>
-        <w:gridCol w:w="9493"/>
+        <w:gridCol w:w="9498"/>
       </w:tblGrid>
       <w:tr>
         <w:trPr>
@@ -6789,7 +6338,7 @@
         </w:trPr>
         <w:tc>
           <w:tcPr>
-            <w:tcW w:w="5000" w:type="pct"/>
+            <w:tcW w:w="9498" w:type="dxa"/>
             <w:vAlign w:val="center"/>
           </w:tcPr>
           <w:p>
@@ -6821,7 +6370,10 @@
                 <w:szCs w:val="20"/>
                 <w:lang w:eastAsia="es-CL"/>
               </w:rPr>
-              <w:t>Señalar los ajustes</w:t>
+              <w:t xml:space="preserve">Señalar los ajustes que realizaste a tu plan de trabajo o actividades que eliminaste y, justifica por qué lo hiciste. </w:t>
+            </w:r>
+            <w:r>
+              <w:t xml:space="preserve"> </w:t>
             </w:r>
             <w:r>
               <w:rPr>
@@ -6832,97 +6384,6 @@
                 <w:szCs w:val="20"/>
                 <w:lang w:eastAsia="es-CL"/>
               </w:rPr>
-              <w:t xml:space="preserve"> que realizaste a tu plan de trabajo o </w:t>
-            </w:r>
-            <w:r>
-              <w:rPr>
-                <w:rFonts w:ascii="Calibri" w:hAnsi="Calibri" w:cs="Arial"/>
-                <w:i/>
-                <w:color w:val="548DD4"/>
-                <w:sz w:val="20"/>
-                <w:szCs w:val="20"/>
-                <w:lang w:eastAsia="es-CL"/>
-              </w:rPr>
-              <w:t>actividades que</w:t>
-            </w:r>
-            <w:r>
-              <w:rPr>
-                <w:rFonts w:ascii="Calibri" w:hAnsi="Calibri" w:cs="Arial"/>
-                <w:i/>
-                <w:color w:val="548DD4"/>
-                <w:sz w:val="20"/>
-                <w:szCs w:val="20"/>
-                <w:lang w:eastAsia="es-CL"/>
-              </w:rPr>
-              <w:t xml:space="preserve"> eliminaste</w:t>
-            </w:r>
-            <w:r>
-              <w:rPr>
-                <w:rFonts w:ascii="Calibri" w:hAnsi="Calibri" w:cs="Arial"/>
-                <w:i/>
-                <w:color w:val="548DD4"/>
-                <w:sz w:val="20"/>
-                <w:szCs w:val="20"/>
-                <w:lang w:eastAsia="es-CL"/>
-              </w:rPr>
-              <w:t xml:space="preserve"> y</w:t>
-            </w:r>
-            <w:r>
-              <w:rPr>
-                <w:rFonts w:ascii="Calibri" w:hAnsi="Calibri" w:cs="Arial"/>
-                <w:i/>
-                <w:color w:val="548DD4"/>
-                <w:sz w:val="20"/>
-                <w:szCs w:val="20"/>
-                <w:lang w:eastAsia="es-CL"/>
-              </w:rPr>
-              <w:t>,</w:t>
-            </w:r>
-            <w:r>
-              <w:rPr>
-                <w:rFonts w:ascii="Calibri" w:hAnsi="Calibri" w:cs="Arial"/>
-                <w:i/>
-                <w:color w:val="548DD4"/>
-                <w:sz w:val="20"/>
-                <w:szCs w:val="20"/>
-                <w:lang w:eastAsia="es-CL"/>
-              </w:rPr>
-              <w:t xml:space="preserve"> justifica por</w:t>
-            </w:r>
-            <w:r>
-              <w:rPr>
-                <w:rFonts w:ascii="Calibri" w:hAnsi="Calibri" w:cs="Arial"/>
-                <w:i/>
-                <w:color w:val="548DD4"/>
-                <w:sz w:val="20"/>
-                <w:szCs w:val="20"/>
-                <w:lang w:eastAsia="es-CL"/>
-              </w:rPr>
-              <w:t xml:space="preserve"> </w:t>
-            </w:r>
-            <w:r>
-              <w:rPr>
-                <w:rFonts w:ascii="Calibri" w:hAnsi="Calibri" w:cs="Arial"/>
-                <w:i/>
-                <w:color w:val="548DD4"/>
-                <w:sz w:val="20"/>
-                <w:szCs w:val="20"/>
-                <w:lang w:eastAsia="es-CL"/>
-              </w:rPr>
-              <w:t xml:space="preserve">qué lo hiciste. </w:t>
-            </w:r>
-            <w:r>
-              <w:t xml:space="preserve"> </w:t>
-            </w:r>
-            <w:r>
-              <w:rPr>
-                <w:rFonts w:ascii="Calibri" w:hAnsi="Calibri" w:cs="Arial"/>
-                <w:i/>
-                <w:color w:val="548DD4"/>
-                <w:sz w:val="20"/>
-                <w:szCs w:val="20"/>
-                <w:lang w:eastAsia="es-CL"/>
-              </w:rPr>
               <w:t>En el caso de que tu plan de trabajo no haya requerido ni requiera ajustes, justifica esta decisión a partir de los facilitadores que te han permitido desarrollarlo como fue planeado.</w:t>
             </w:r>
           </w:p>
@@ -7091,7 +6552,15 @@
                 <w:color w:val="000000"/>
                 <w:sz w:val="20"/>
               </w:rPr>
-              <w:t>Inicio con sesión, búsqueda avanzada, favoritos y reseñas (épicas E1, E2 y E3): a partir del mockup del Inicio, el Product Owner incorporó el 03-10-2026 FS-HU-21 "Inicio personalizado y navegación", FS-HU-22 "Búsqueda avanzada de profesionales", FS-HU-23 "Profesionales favoritos" y FS-HU-24 "Calificar y reseñar profesionales" (18 puntos estimados en total, a confirmar en la planificación del Sprint 3), y definió que el sistema de calificaciones y reseñas forma parte del alcance. Se implementaron antes del inicio del Sprint 3, junto con la búsqueda por cercanía de FS-HU-05, para que el Inicio y el buscador queden coherentes con el mockup. Las secciones que aún no existen (centros de salud, gimnasios, farmacias, asistente, historial de chats, citas, pasos y agua) se muestran como "Próximamente" en vez de simular datos, y con la sesión iniciada la portada ahora lleva al Inicio (ajuste de FS-HU-20).</w:t>
+              <w:t xml:space="preserve">Inicio con sesión, búsqueda avanzada, favoritos y reseñas (épicas E1, E2 y E3): </w:t>
+            </w:r>
+            <w:r>
+              <w:rPr>
+                <w:rFonts w:ascii="Calibri" w:hAnsi="Calibri"/>
+                <w:color w:val="000000"/>
+                <w:sz w:val="20"/>
+              </w:rPr>
+              <w:t xml:space="preserve">a partir del mockup del Inicio, el Product Owner incorporó el 03-10-2026 FS-HU-21 "Inicio personalizado y navegación", FS-HU-22 "Búsqueda avanzada de profesionales", FS-HU-23 "Profesionales favoritos" y FS-HU-24 "Calificar y reseñar profesionales" (18 puntos estimados en total, a confirmar en la planificación del Sprint 3), y definió que el sistema de calificaciones y reseñas forma parte del alcance. Se implementaron antes del inicio del Sprint 3, junto con la búsqueda por cercanía de FS-HU-05, para que el Inicio y el buscador queden coherentes con el mockup. Las secciones que aún no existen (centros de salud, gimnasios, farmacias, asistente, historial de chats, citas, pasos y agua) se muestran como "Próximamente" en vez de simular datos, y con la sesión iniciada la portada ahora lleva al Inicio (ajuste de FS-HU-20).</w:t>
             </w:r>
           </w:p>
           <w:p>
@@ -7273,7 +6742,7 @@
     <w:tbl>
       <w:tblPr>
         <w:tblStyle w:val="Tablaconcuadrcula"/>
-        <w:tblW w:w="5591" w:type="pct"/>
+        <w:tblW w:w="9498" w:type="dxa"/>
         <w:tblInd w:w="-572" w:type="dxa"/>
         <w:tblBorders>
           <w:top w:val="single" w:sz="4" w:space="0" w:color="BFBFBF" w:themeColor="background1" w:themeShade="BF"/>
@@ -7294,7 +6763,7 @@
         </w:trPr>
         <w:tc>
           <w:tcPr>
-            <w:tcW w:w="5000" w:type="pct"/>
+            <w:tcW w:w="9498" w:type="dxa"/>
             <w:vAlign w:val="center"/>
           </w:tcPr>
           <w:p>
@@ -7325,40 +6794,7 @@
                 <w:szCs w:val="20"/>
                 <w:lang w:eastAsia="es-CL"/>
               </w:rPr>
-              <w:t xml:space="preserve"> </w:t>
-            </w:r>
-            <w:r>
-              <w:rPr>
-                <w:rFonts w:ascii="Calibri" w:hAnsi="Calibri" w:cs="Arial"/>
-                <w:i/>
-                <w:color w:val="548DD4"/>
-                <w:sz w:val="20"/>
-                <w:szCs w:val="20"/>
-                <w:lang w:eastAsia="es-CL"/>
-              </w:rPr>
-              <w:t>En caso</w:t>
-            </w:r>
-            <w:r>
-              <w:rPr>
-                <w:rFonts w:ascii="Calibri" w:hAnsi="Calibri" w:cs="Arial"/>
-                <w:i/>
-                <w:color w:val="548DD4"/>
-                <w:sz w:val="20"/>
-                <w:szCs w:val="20"/>
-                <w:lang w:eastAsia="es-CL"/>
-              </w:rPr>
-              <w:t xml:space="preserve"> de</w:t>
-            </w:r>
-            <w:r>
-              <w:rPr>
-                <w:rFonts w:ascii="Calibri" w:hAnsi="Calibri" w:cs="Arial"/>
-                <w:i/>
-                <w:color w:val="548DD4"/>
-                <w:sz w:val="20"/>
-                <w:szCs w:val="20"/>
-                <w:lang w:eastAsia="es-CL"/>
-              </w:rPr>
-              <w:t xml:space="preserve"> que </w:t>
+              <w:t xml:space="preserve"> En caso de que </w:t>
             </w:r>
             <w:r>
               <w:rPr>
@@ -7370,55 +6806,7 @@
                 <w:szCs w:val="20"/>
                 <w:lang w:eastAsia="es-CL"/>
               </w:rPr>
-              <w:t>no ha</w:t>
-            </w:r>
-            <w:r>
-              <w:rPr>
-                <w:rFonts w:ascii="Calibri" w:hAnsi="Calibri" w:cs="Arial"/>
-                <w:b/>
-                <w:i/>
-                <w:color w:val="548DD4"/>
-                <w:sz w:val="20"/>
-                <w:szCs w:val="20"/>
-                <w:lang w:eastAsia="es-CL"/>
-              </w:rPr>
-              <w:t>yas</w:t>
-            </w:r>
-            <w:r>
-              <w:rPr>
-                <w:rFonts w:ascii="Calibri" w:hAnsi="Calibri" w:cs="Arial"/>
-                <w:b/>
-                <w:i/>
-                <w:color w:val="548DD4"/>
-                <w:sz w:val="20"/>
-                <w:szCs w:val="20"/>
-                <w:lang w:eastAsia="es-CL"/>
-              </w:rPr>
-              <w:t xml:space="preserve"> iniciado actividades o est</w:t>
-            </w:r>
-            <w:r>
-              <w:rPr>
-                <w:rFonts w:ascii="Calibri" w:hAnsi="Calibri" w:cs="Arial"/>
-                <w:b/>
-                <w:i/>
-                <w:color w:val="548DD4"/>
-                <w:sz w:val="20"/>
-                <w:szCs w:val="20"/>
-                <w:lang w:eastAsia="es-CL"/>
-              </w:rPr>
-              <w:t>é</w:t>
-            </w:r>
-            <w:r>
-              <w:rPr>
-                <w:rFonts w:ascii="Calibri" w:hAnsi="Calibri" w:cs="Arial"/>
-                <w:b/>
-                <w:i/>
-                <w:color w:val="548DD4"/>
-                <w:sz w:val="20"/>
-                <w:szCs w:val="20"/>
-                <w:lang w:eastAsia="es-CL"/>
-              </w:rPr>
-              <w:t>n retrasadas</w:t>
+              <w:t xml:space="preserve">no hayas iniciado actividades o estén retrasadas</w:t>
             </w:r>
             <w:r>
               <w:rPr>
@@ -7429,51 +6817,7 @@
                 <w:szCs w:val="20"/>
                 <w:lang w:eastAsia="es-CL"/>
               </w:rPr>
-              <w:t xml:space="preserve"> de acuerdo a tu planificación</w:t>
-            </w:r>
-            <w:r>
-              <w:rPr>
-                <w:rFonts w:ascii="Calibri" w:hAnsi="Calibri" w:cs="Arial"/>
-                <w:i/>
-                <w:color w:val="548DD4"/>
-                <w:sz w:val="20"/>
-                <w:szCs w:val="20"/>
-                <w:lang w:eastAsia="es-CL"/>
-              </w:rPr>
-              <w:t>,</w:t>
-            </w:r>
-            <w:r>
-              <w:rPr>
-                <w:rFonts w:ascii="Calibri" w:hAnsi="Calibri" w:cs="Arial"/>
-                <w:i/>
-                <w:color w:val="548DD4"/>
-                <w:sz w:val="20"/>
-                <w:szCs w:val="20"/>
-                <w:lang w:eastAsia="es-CL"/>
-              </w:rPr>
-              <w:t xml:space="preserve"> señala los motivos por lo</w:t>
-            </w:r>
-            <w:r>
-              <w:rPr>
-                <w:rFonts w:ascii="Calibri" w:hAnsi="Calibri" w:cs="Arial"/>
-                <w:i/>
-                <w:color w:val="548DD4"/>
-                <w:sz w:val="20"/>
-                <w:szCs w:val="20"/>
-                <w:lang w:eastAsia="es-CL"/>
-              </w:rPr>
-              <w:t>s</w:t>
-            </w:r>
-            <w:r>
-              <w:rPr>
-                <w:rFonts w:ascii="Calibri" w:hAnsi="Calibri" w:cs="Arial"/>
-                <w:i/>
-                <w:color w:val="548DD4"/>
-                <w:sz w:val="20"/>
-                <w:szCs w:val="20"/>
-                <w:lang w:eastAsia="es-CL"/>
-              </w:rPr>
-              <w:t xml:space="preserve"> que no has podido cumplir dichos plazos y qué estrategias utilizarás para avanzar en dichas actividades y no afectar tu proyecto APT. </w:t>
+              <w:t xml:space="preserve"> de acuerdo a tu planificación, señala los motivos por los que no has podido cumplir dichos plazos y qué estrategias utilizarás para avanzar en dichas actividades y no afectar tu proyecto APT. </w:t>
             </w:r>
           </w:p>
           <w:p>
@@ -7509,7 +6853,15 @@
                 <w:color w:val="000000"/>
                 <w:sz w:val="20"/>
               </w:rPr>
-              <w:t>Sprint 2: cerrado el 04-10-2026, dentro de su período. Se realizaron 92 de las 110 horas estimadas (Rodrigo Cárcamo Rojas 51, Nicolás Silva 23 y Luis Méndez 18), registradas al cierre según el trabajo entregado en GitHub. El Product Owner aceptó el 03-10-2026 FS-HU-02 (tipo de cuenta), FS-HU-03 y FS-HU-15 a FS-HU-20, con la revisión de código aprobada en los PR #8 y #9; FS-HU-15 queda con la observación de configurar el correo real y FS-HU-16 con los casos CP-024 y CP-025 pendientes. FS-HU-04 (implementada por Luis Méndez en el PR #11, en corrección antes de fusionar) y FS-HU-13 (no iniciada) pasan al Sprint 3. Evidencias: Documento Sprint Backlog 2, Documento Validando Sprint 2, burndown del Sprint 2 y la retrospectiva del Sprint 2, registrada por escrito el 12-10-2026 con las respuestas de los tres integrantes.</w:t>
+              <w:t xml:space="preserve">Sprint 2: </w:t>
+            </w:r>
+            <w:r>
+              <w:rPr>
+                <w:rFonts w:ascii="Calibri" w:hAnsi="Calibri"/>
+                <w:color w:val="000000"/>
+                <w:sz w:val="20"/>
+              </w:rPr>
+              <w:t xml:space="preserve">cerrado el 04-10-2026, dentro de su período. Se realizaron 92 de las 110 horas estimadas (Rodrigo Cárcamo Rojas 51, Nicolás Silva 23 y Luis Méndez 18), registradas al cierre según el trabajo entregado en GitHub. El Product Owner aceptó el 03-10-2026 FS-HU-02 (tipo de cuenta), FS-HU-03 y FS-HU-15 a FS-HU-20, con la revisión de código aprobada en los PR #8 y #9; FS-HU-15 queda con la observación de configurar el correo real y FS-HU-16 con los casos CP-024 y CP-025 pendientes. FS-HU-04 (implementada por Luis Méndez en el PR #11, en corrección antes de fusionar) y FS-HU-13 (no iniciada) pasan al Sprint 3. Evidencias: Documento Sprint Backlog 2, Documento Validando Sprint 2, burndown del Sprint 2 y la retrospectiva del Sprint 2, registrada por escrito el 12-10-2026 con las respuestas de los tres integrantes.</w:t>
             </w:r>
           </w:p>
           <w:p>
@@ -7523,7 +6875,15 @@
                 <w:color w:val="000000"/>
                 <w:sz w:val="20"/>
               </w:rPr>
-              <w:t xml:space="preserve">Sprint 3 (desde el 05-10-2026): FS-HU-05 y FS-HU-21 a FS-HU-24 ya se implementaron, revisaron y fusionaron el 03-10-2026 (PR #10) y falta su aceptación; FS-HU-04 y FS-HU-13 vienen del Sprint 2, y FS-HU-06 y FS-HU-14 se inician en el sprint. Sprints 4 y 5: aún no se inician porque corresponden a semanas posteriores según la Carta Gantt.</w:t>
+              <w:t xml:space="preserve">Sprint 3 (desde el 05-10-2026): </w:t>
+            </w:r>
+            <w:r>
+              <w:rPr>
+                <w:rFonts w:ascii="Calibri" w:hAnsi="Calibri"/>
+                <w:color w:val="000000"/>
+                <w:sz w:val="20"/>
+              </w:rPr>
+              <w:t xml:space="preserve">FS-HU-05 y FS-HU-21 a FS-HU-24 ya se implementaron, revisaron y fusionaron el 03-10-2026 (PR #10) y falta su aceptación; FS-HU-04 y FS-HU-13 vienen del Sprint 2, y FS-HU-06 y FS-HU-14 se inician en el sprint. Sprints 4 y 5: aún no se inician porque corresponden a semanas posteriores según la Carta Gantt.</w:t>
             </w:r>
           </w:p>
           <w:p>
@@ -7537,7 +6897,15 @@
                 <w:color w:val="000000"/>
                 <w:sz w:val="20"/>
               </w:rPr>
-              <w:t>Actualización del 12-10-2026: el Product Owner aceptó FS-HU-04 y, al cierre del día, FS-HU-05, FS-HU-12, FS-HU-13, FS-HU-14 y FS-HU-21 a FS-HU-24 (FS-HU-12 y FS-HU-14 con observaciones registradas en el Product Backlog): quedan aceptadas 18 historias y 83 de los 117 puntos. FS-HU-06 está implementada y fusionada (PR #21 y #22) y queda pendiente de CP-078 con el mapa real sobre main. Las horas del Sprint 3 se registraron el 12-10-2026 según el trabajo entregado en GitHub: 33 tareas, 65 h estimadas y 63 h registradas al día 8, con un máximo de 5 h por persona y día (Rodrigo Cárcamo Rojas 37, Luis Méndez 23 y Nicolás Silva 3), con su Documento Sprint Backlog 3 y su burndown. La retrospectiva del Sprint 2 quedó registrada el mismo día.</w:t>
+              <w:t xml:space="preserve">Actualización del 12-10-2026: </w:t>
+            </w:r>
+            <w:r>
+              <w:rPr>
+                <w:rFonts w:ascii="Calibri" w:hAnsi="Calibri"/>
+                <w:color w:val="000000"/>
+                <w:sz w:val="20"/>
+              </w:rPr>
+              <w:t xml:space="preserve">el Product Owner aceptó FS-HU-04 y, al cierre del día, FS-HU-05, FS-HU-12, FS-HU-13, FS-HU-14 y FS-HU-21 a FS-HU-24 (FS-HU-12 y FS-HU-14 con observaciones registradas en el Product Backlog): quedan aceptadas 18 historias y 83 de los 117 puntos. FS-HU-06 está implementada y fusionada (PR #21 y #22) y queda pendiente de CP-078 con el mapa real sobre main. Las horas del Sprint 3 se registraron el 12-10-2026 según el trabajo entregado en GitHub: 33 tareas, 65 h estimadas y 63 h registradas al día 8, con un máximo de 5 h por persona y día (Rodrigo Cárcamo Rojas 37, Luis Méndez 23 y Nicolás Silva 3), con su Documento Sprint Backlog 3 y su burndown. La retrospectiva del Sprint 2 quedó registrada el mismo día.</w:t>
             </w:r>
           </w:p>
           <w:p>
@@ -7551,17 +6919,24 @@
                 <w:color w:val="000000"/>
                 <w:sz w:val="20"/>
               </w:rPr>
-              <w:t>Acceso con Google (FS-HU-16): implementada el 24-09-2026 con el ID de cliente OAuth de la cuenta del proyecto; quedan pendientes los casos de prueba manuales CP-024 y CP-025, que requieren iniciar sesión con una cuenta de Google del equipo.</w:t>
-            </w:r>
-          </w:p>
-          <w:p>
-            <w:pPr>
-              <w:spacing w:after="80"/>
-            </w:pPr>
-            <w:r>
-              <w:rPr>
-                <w:rFonts w:ascii="Calibri" w:hAnsi="Calibri"/>
-                <w:b/>
+              <w:t xml:space="preserve">Acceso con Google (FS-HU-16): </w:t>
+            </w:r>
+            <w:r>
+              <w:rPr>
+                <w:rFonts w:ascii="Calibri" w:hAnsi="Calibri"/>
+                <w:color w:val="000000"/>
+                <w:sz w:val="20"/>
+              </w:rPr>
+              <w:t xml:space="preserve">implementada el 24-09-2026 con el ID de cliente OAuth de la cuenta del proyecto; quedan pendientes los casos de prueba manuales CP-024 y CP-025, que requieren iniciar sesión con una cuenta de Google del equipo.</w:t>
+            </w:r>
+          </w:p>
+          <w:p>
+            <w:pPr>
+              <w:spacing w:after="80"/>
+            </w:pPr>
+            <w:r>
+              <w:rPr>
+                <w:rFonts w:ascii="Calibri" w:hAnsi="Calibri"/>
                 <w:color w:val="000000"/>
                 <w:sz w:val="20"/>
               </w:rPr>

</xml_diff>

<commit_message>
SC-18: documenta el mapa con MapLibre y OpenFreeMap (DAS 1.23, matriz, casos, defectos 27 a 29, backlog, Guia 2.4 y control)
</commit_message>
<xml_diff>
--- a/FASE 2/Evidencias Grupales/2.4_GuiaEstudiante_Fase 2_DesarrolloProyecto APT (Español).docx
+++ b/FASE 2/Evidencias Grupales/2.4_GuiaEstudiante_Fase 2_DesarrolloProyecto APT (Español).docx
@@ -478,7 +478,7 @@
                 <w:color w:val="000000"/>
                 <w:sz w:val="20"/>
               </w:rPr>
-              <w:t>Actualizado al 12-10-2026.</w:t>
+              <w:t>Actualizado al 15-10-2026.</w:t>
             </w:r>
           </w:p>
           <w:p>
@@ -821,7 +821,7 @@
                 <w:color w:val="000000"/>
                 <w:sz w:val="20"/>
               </w:rPr>
-              <w:t xml:space="preserve">Luis Méndez las implementó y se fusionaron el 12-10-2026 (PR #21). El profesional publica horarios sin superposiciones, el usuario reserva con un mensaje obligatorio, el profesional confirma y cualquiera de los dos puede cancelar; si dos personas reservan el mismo horario a la vez, solo una lo obtiene. La búsqueda alterna entre lista y mapa. Se verificó contra MySQL real con 39 comprobaciones; en la revisión se detectó y corrigió un error con las horas en punto (defecto 25). Las correcciones posteriores y el límite de una reserva activa por usuario con cada profesional (sin contar las citas pasadas, defecto 26) se fusionaron el 12-10-2026 (PR #22).</w:t>
+              <w:t>Luis Méndez las implementó y se fusionaron el 12-10-2026 (PR #21). El profesional publica horarios sin superposiciones, el usuario reserva con un mensaje obligatorio, el profesional confirma y cualquiera de los dos puede cancelar; si dos personas reservan el mismo horario a la vez, solo una lo obtiene. La búsqueda alterna entre lista y mapa; desde el 15-10-2026 el mapa usa MapLibre GL JS con teselas de OpenFreeMap, sin clave (SC-18, PR #27 de Nicolás Silva). Se verificó contra MySQL real con 39 comprobaciones; en la revisión se detectó y corrigió un error con las horas en punto (defecto 25). Las correcciones posteriores y el límite de una reserva activa por usuario con cada profesional (sin contar las citas pasadas, defecto 26) se fusionaron el 12-10-2026 (PR #22).</w:t>
             </w:r>
           </w:p>
           <w:p>
@@ -835,15 +835,15 @@
                 <w:color w:val="000000"/>
                 <w:sz w:val="20"/>
               </w:rPr>
-              <w:t xml:space="preserve">Estado al 12-10-2026: </w:t>
-            </w:r>
-            <w:r>
-              <w:rPr>
-                <w:rFonts w:ascii="Calibri" w:hAnsi="Calibri"/>
-                <w:color w:val="000000"/>
-                <w:sz w:val="20"/>
-              </w:rPr>
-              <w:t xml:space="preserve">el sistema suma 416 pruebas automatizadas (233 en el backend y 183 en el frontend) y 80 casos de prueba en la planilla (77 aprobados y 3 pendientes de ejecutar: CP-024, CP-025 y CP-078). Las evidencias se versionan en GitHub, se publican en el Drive del equipo y su avance se sigue en el tablero Trello.</w:t>
+              <w:t xml:space="preserve">Estado al 15-10-2026: </w:t>
+            </w:r>
+            <w:r>
+              <w:rPr>
+                <w:rFonts w:ascii="Calibri" w:hAnsi="Calibri"/>
+                <w:color w:val="000000"/>
+                <w:sz w:val="20"/>
+              </w:rPr>
+              <w:t>el sistema suma 422 pruebas automatizadas (233 en el backend y 189 en el frontend) y 80 casos de prueba en la planilla (77 aprobados y 3 pendientes de ejecutar: CP-024, CP-025 y CP-078). Las evidencias se versionan en GitHub, se publican en el Drive del equipo y su avance se sigue en el tablero Trello.</w:t>
             </w:r>
           </w:p>
         </w:tc>
@@ -1280,7 +1280,7 @@
                 <w:color w:val="000000"/>
                 <w:sz w:val="20"/>
               </w:rPr>
-              <w:t>registra las 17 solicitudes de cambio del proyecto al 12-10-2026 (16 aceptadas y 1 rechazada), con su solicitante, tipo, urgencia, impacto, historias de usuario y casos de uso relacionados, y respalda los ajustes descritos en la sección 3 (C2).</w:t>
+              <w:t>registra las 18 solicitudes de cambio del proyecto al 15-10-2026 (17 aceptadas y 1 rechazada), con su solicitante, tipo, urgencia, impacto, historias de usuario y casos de uso relacionados, y respalda los ajustes descritos en la sección 3 (C2).</w:t>
             </w:r>
           </w:p>
           <w:p>
@@ -1346,7 +1346,7 @@
                 <w:color w:val="000000"/>
                 <w:sz w:val="20"/>
               </w:rPr>
-              <w:t>al 12-10-2026 hay 416 pruebas automatizadas y comprobaciones con MySQL real (npm run test:mysql:agenda, 55/55); la Planilla de Casos de Prueba tiene 80 casos (77 aprobados y 3 pendientes de ejecutar) y el Registro de Defectos 26 defectos, todos corregidos (C1).</w:t>
+              <w:t>al 15-10-2026 hay 422 pruebas automatizadas y comprobaciones con MySQL real (npm run test:mysql:agenda, 55/55); la Planilla de Casos de Prueba tiene 80 casos (77 aprobados y 3 pendientes de ejecutar) y el Registro de Defectos 29 defectos: 26 corregidos y 3 abiertos del mapa nuevo (C1).</w:t>
             </w:r>
           </w:p>
           <w:p>
@@ -3373,7 +3373,7 @@
                 <w:color w:val="000000"/>
                 <w:sz w:val="16"/>
               </w:rPr>
-              <w:t>Node.js, Google Maps Platform (Geocoding)</w:t>
+              <w:t>Node.js, MySQL (ST_Distance_Sphere)</w:t>
             </w:r>
           </w:p>
         </w:tc>
@@ -3530,7 +3530,7 @@
                 <w:color w:val="000000"/>
                 <w:sz w:val="16"/>
               </w:rPr>
-              <w:t>React, Google Maps Platform</w:t>
+              <w:t>React, MapLibre GL JS y OpenFreeMap (SC-18)</w:t>
             </w:r>
           </w:p>
         </w:tc>
@@ -3640,6 +3640,20 @@
                 <w:sz w:val="16"/>
               </w:rPr>
               <w:t>12-10-2026: la vista de mapa y lista (FS-HU-06) la implementó Luis Méndez y se fusionó en el PR #21. Falta probarla en main con una clave real de Google Maps (CP-078) y su aceptación.</w:t>
+            </w:r>
+          </w:p>
+          <w:p>
+            <w:pPr>
+              <w:spacing w:after="80"/>
+              <w:jc w:val="both"/>
+            </w:pPr>
+            <w:r>
+              <w:rPr>
+                <w:rFonts w:ascii="Calibri" w:hAnsi="Calibri"/>
+                <w:color w:val="000000"/>
+                <w:sz w:val="16"/>
+              </w:rPr>
+              <w:t>15-10-2026: el mapa se cambió a MapLibre GL JS con teselas de OpenFreeMap, que no requiere clave ni facturación (SC-18, PR #27 de Nicolás Silva, fusionado el 15-10-2026). Falta ejecutar CP-078 sobre main, corregir los defectos 27 a 29 y su aceptación.</w:t>
             </w:r>
           </w:p>
         </w:tc>
@@ -6693,6 +6707,28 @@
                 <w:sz w:val="20"/>
               </w:rPr>
               <w:t>el Product Owner definió que un usuario puede tener como máximo una reserva activa (pendiente o confirmada) con cada profesional, para evitar que una sola cuenta ocupe toda la agenda. Se implementó en el PR #22, fusionado el 12-10-2026; las citas que ya pasaron no cuentan para el límite.</w:t>
+            </w:r>
+          </w:p>
+          <w:p>
+            <w:pPr>
+              <w:spacing w:after="80"/>
+            </w:pPr>
+            <w:r>
+              <w:rPr>
+                <w:rFonts w:ascii="Calibri" w:hAnsi="Calibri"/>
+                <w:b/>
+                <w:color w:val="000000"/>
+                <w:sz w:val="20"/>
+              </w:rPr>
+              <w:t xml:space="preserve">Mapa con MapLibre y OpenFreeMap (15-10-2026): </w:t>
+            </w:r>
+            <w:r>
+              <w:rPr>
+                <w:rFonts w:ascii="Calibri" w:hAnsi="Calibri"/>
+                <w:color w:val="000000"/>
+                <w:sz w:val="20"/>
+              </w:rPr>
+              <w:t>Google Maps exigía una clave con facturación para probar el mapa sobre main (CP-078). Nicolás Silva propuso reemplazarlo por MapLibre GL JS con las teselas gratuitas de OpenFreeMap (SC-18); el Product Owner lo aprobó y se fusionó en el PR #27. El mapa ya no necesita clave ni cuenta, y si el proveedor falla la lista de resultados sigue disponible.</w:t>
             </w:r>
           </w:p>
           <w:p>
@@ -6906,6 +6942,28 @@
                 <w:sz w:val="20"/>
               </w:rPr>
               <w:t xml:space="preserve">el Product Owner aceptó FS-HU-04 y, al cierre del día, FS-HU-05, FS-HU-12, FS-HU-13, FS-HU-14 y FS-HU-21 a FS-HU-24 (FS-HU-12 y FS-HU-14 con observaciones registradas en el Product Backlog): quedan aceptadas 18 historias y 83 de los 117 puntos. FS-HU-06 está implementada y fusionada (PR #21 y #22) y queda pendiente de CP-078 con el mapa real sobre main. Las horas del Sprint 3 se registraron el 12-10-2026 según el trabajo entregado en GitHub: 33 tareas, 65 h estimadas y 63 h registradas al día 8, con un máximo de 5 h por persona y día (Rodrigo Cárcamo Rojas 37, Luis Méndez 23 y Nicolás Silva 3), con su Documento Sprint Backlog 3 y su burndown. La retrospectiva del Sprint 2 quedó registrada el mismo día.</w:t>
+            </w:r>
+          </w:p>
+          <w:p>
+            <w:pPr>
+              <w:spacing w:after="80"/>
+            </w:pPr>
+            <w:r>
+              <w:rPr>
+                <w:rFonts w:ascii="Calibri" w:hAnsi="Calibri"/>
+                <w:b/>
+                <w:color w:val="000000"/>
+                <w:sz w:val="20"/>
+              </w:rPr>
+              <w:t xml:space="preserve">Actualización del 15-10-2026: </w:t>
+            </w:r>
+            <w:r>
+              <w:rPr>
+                <w:rFonts w:ascii="Calibri" w:hAnsi="Calibri"/>
+                <w:color w:val="000000"/>
+                <w:sz w:val="20"/>
+              </w:rPr>
+              <w:t>se fusionaron el PR #25 (matriz de trazabilidad entre historias, PR y casos de prueba) y el PR #27 (mapa con MapLibre y OpenFreeMap, SC-18), ambos de Nicolás Silva. FS-HU-06 sigue pendiente de CP-078 sobre main y de corregir los defectos 27 a 29, registrados el mismo día.</w:t>
             </w:r>
           </w:p>
           <w:p>

</xml_diff>

<commit_message>
SC-19: mejoras de interaccion de la interfaz y defectos 30 a 34
Scroll al cambiar de pantalla, confirmacion de la agenda en su tarjeta, busqueda sin saltos, campos de 16 px, boton principal en la agenda, respuesta al presionar, menus y paneles con transiciones y movimiento reducido. CP-081 a CP-087; Guia 2.4, control, matriz, planilla y registro de defectos al 19-10-2026.
</commit_message>
<xml_diff>
--- a/FASE 2/Evidencias Grupales/2.4_GuiaEstudiante_Fase 2_DesarrolloProyecto APT (Español).docx
+++ b/FASE 2/Evidencias Grupales/2.4_GuiaEstudiante_Fase 2_DesarrolloProyecto APT (Español).docx
@@ -478,7 +478,7 @@
                 <w:color w:val="000000"/>
                 <w:sz w:val="20"/>
               </w:rPr>
-              <w:t>Actualizado al 15-10-2026.</w:t>
+              <w:t>Actualizado al 19-10-2026.</w:t>
             </w:r>
           </w:p>
           <w:p>
@@ -835,15 +835,37 @@
                 <w:color w:val="000000"/>
                 <w:sz w:val="20"/>
               </w:rPr>
-              <w:t xml:space="preserve">Estado al 15-10-2026: </w:t>
-            </w:r>
-            <w:r>
-              <w:rPr>
-                <w:rFonts w:ascii="Calibri" w:hAnsi="Calibri"/>
-                <w:color w:val="000000"/>
-                <w:sz w:val="20"/>
-              </w:rPr>
-              <w:t>el sistema suma 422 pruebas automatizadas (233 en el backend y 189 en el frontend) y 80 casos de prueba en la planilla (77 aprobados y 3 pendientes de ejecutar: CP-024, CP-025 y CP-078). Las evidencias se versionan en GitHub, se publican en el Drive del equipo y su avance se sigue en el tablero Trello.</w:t>
+              <w:t xml:space="preserve">Interfaz más clara y fluida (inicio del Sprint 4): </w:t>
+            </w:r>
+            <w:r>
+              <w:rPr>
+                <w:rFonts w:ascii="Calibri" w:hAnsi="Calibri"/>
+                <w:color w:val="000000"/>
+                <w:sz w:val="20"/>
+              </w:rPr>
+              <w:t>el 19-10-2026 el Product Owner pidió revisar la respuesta y el movimiento de la interfaz (SC-19). Se corrigieron cinco defectos que se notaban al usarla: la página conservaba el scroll al cambiar de pantalla, la confirmación de la agenda aparecía al final de la lista y fuera de la vista, la búsqueda saltaba con cada filtro, algunos campos acercaban la página en iPhone y cinco botones de la agenda no tenían el estilo de la aplicación (defectos 30 a 34). Además, lo que se presiona responde al toque, los menús y paneles del celular se abren y cierran con suavidad sin mover la página de fondo, y se respeta la preferencia «reducir movimiento» del sistema. No se agregaron dependencias; se verificó con 7 casos de prueba nuevos (CP-081 a CP-087).</w:t>
+            </w:r>
+          </w:p>
+          <w:p>
+            <w:pPr>
+              <w:spacing w:after="80"/>
+            </w:pPr>
+            <w:r>
+              <w:rPr>
+                <w:rFonts w:ascii="Calibri" w:hAnsi="Calibri"/>
+                <w:b/>
+                <w:color w:val="000000"/>
+                <w:sz w:val="20"/>
+              </w:rPr>
+              <w:t xml:space="preserve">Estado al 19-10-2026: </w:t>
+            </w:r>
+            <w:r>
+              <w:rPr>
+                <w:rFonts w:ascii="Calibri" w:hAnsi="Calibri"/>
+                <w:color w:val="000000"/>
+                <w:sz w:val="20"/>
+              </w:rPr>
+              <w:t>el sistema suma 428 pruebas automatizadas (233 en el backend y 195 en el frontend) y 87 casos de prueba en la planilla (84 aprobados y 3 pendientes de ejecutar: CP-024, CP-025 y CP-078). Las evidencias se versionan en GitHub, se publican en el Drive del equipo y su avance se sigue en el tablero Trello.</w:t>
             </w:r>
           </w:p>
         </w:tc>
@@ -1280,7 +1302,7 @@
                 <w:color w:val="000000"/>
                 <w:sz w:val="20"/>
               </w:rPr>
-              <w:t>registra las 18 solicitudes de cambio del proyecto al 15-10-2026 (17 aceptadas y 1 rechazada), con su solicitante, tipo, urgencia, impacto, historias de usuario y casos de uso relacionados, y respalda los ajustes descritos en la sección 3 (C2).</w:t>
+              <w:t>registra las 19 solicitudes de cambio del proyecto al 19-10-2026 (18 aceptadas y 1 rechazada), con su solicitante, tipo, urgencia, impacto, historias de usuario y casos de uso relacionados, y respalda los ajustes descritos en la sección 3 (C2).</w:t>
             </w:r>
           </w:p>
           <w:p>
@@ -1346,7 +1368,7 @@
                 <w:color w:val="000000"/>
                 <w:sz w:val="20"/>
               </w:rPr>
-              <w:t>al 15-10-2026 hay 422 pruebas automatizadas y comprobaciones con MySQL real (npm run test:mysql:agenda, 55/55); la Planilla de Casos de Prueba tiene 80 casos (77 aprobados y 3 pendientes de ejecutar) y el Registro de Defectos 29 defectos: 26 corregidos y 3 abiertos del mapa nuevo (C1).</w:t>
+              <w:t>al 19-10-2026 hay 428 pruebas automatizadas y comprobaciones con MySQL real (npm run test:mysql:agenda, 55/55); la Planilla de Casos de Prueba tiene 87 casos (84 aprobados y 3 pendientes de ejecutar) y el Registro de Defectos 34 defectos: 31 corregidos y 3 abiertos del mapa nuevo (C1).</w:t>
             </w:r>
           </w:p>
           <w:p>
@@ -6729,6 +6751,28 @@
                 <w:sz w:val="20"/>
               </w:rPr>
               <w:t>Google Maps exigía una clave con facturación para probar el mapa sobre main (CP-078). Nicolás Silva propuso reemplazarlo por MapLibre GL JS con las teselas gratuitas de OpenFreeMap (SC-18); el Product Owner lo aprobó y se fusionó en el PR #27. El mapa ya no necesita clave ni cuenta, y si el proveedor falla la lista de resultados sigue disponible.</w:t>
+            </w:r>
+          </w:p>
+          <w:p>
+            <w:pPr>
+              <w:spacing w:after="80"/>
+            </w:pPr>
+            <w:r>
+              <w:rPr>
+                <w:rFonts w:ascii="Calibri" w:hAnsi="Calibri"/>
+                <w:b/>
+                <w:color w:val="000000"/>
+                <w:sz w:val="20"/>
+              </w:rPr>
+              <w:t xml:space="preserve">Mejoras de interfaz (19-10-2026): </w:t>
+            </w:r>
+            <w:r>
+              <w:rPr>
+                <w:rFonts w:ascii="Calibri" w:hAnsi="Calibri"/>
+                <w:color w:val="000000"/>
+                <w:sz w:val="20"/>
+              </w:rPr>
+              <w:t>al comenzar el Sprint 4, antes de su planificación, el Product Owner incorporó una revisión de la respuesta y el movimiento de la interfaz (SC-19), que corrigió los defectos 30 a 34. Es trabajo no planificado de bajo impacto: no cambia historias de usuario, endpoints ni el modelo de datos, y queda registrado en la Matriz de Control de Cambio, en el Registro de Defectos y en la Planilla de Casos de Prueba (CP-081 a CP-087).</w:t>
             </w:r>
           </w:p>
           <w:p>

</xml_diff>

<commit_message>
SC-20 y SC-21: reserva con calendario y calendario al publicar horarios
Calendario compartido (CalendarioMes). Reserva: dias con horas, Confirmar en la fila, mensaje obligatorio, solicitud pendiente y archivo .ics. Publicar horario: dia en el calendario, hora de inicio y termino con duracion rapida. CP-088 a CP-093; Guia 2.4, control, matriz, planilla y Product Backlog al 19-10-2026.
</commit_message>
<xml_diff>
--- a/FASE 2/Evidencias Grupales/2.4_GuiaEstudiante_Fase 2_DesarrolloProyecto APT (Español).docx
+++ b/FASE 2/Evidencias Grupales/2.4_GuiaEstudiante_Fase 2_DesarrolloProyecto APT (Español).docx
@@ -857,6 +857,50 @@
                 <w:color w:val="000000"/>
                 <w:sz w:val="20"/>
               </w:rPr>
+              <w:t xml:space="preserve">Reserva con calendario (SC-20): </w:t>
+            </w:r>
+            <w:r>
+              <w:rPr>
+                <w:rFonts w:ascii="Calibri" w:hAnsi="Calibri"/>
+                <w:color w:val="000000"/>
+                <w:sz w:val="20"/>
+              </w:rPr>
+              <w:t>el 19-10-2026 el Product Owner aportó un modelo de reserva con calendario y se rediseñó la reserva de FS-HU-14: calendario del mes con los días que tienen horas, horas del día con «Confirmar» en la misma fila, el mensaje obligatorio en el paso de confirmar y la pantalla «Solicitud enviada, pendiente de confirmación», con un archivo .ics para agregar la cita al calendario personal sin integrar calendarios externos. No cambian la API ni los datos; se verificó contra MySQL real con datos temporales (CP-088 a CP-091).</w:t>
+            </w:r>
+          </w:p>
+          <w:p>
+            <w:pPr>
+              <w:spacing w:after="80"/>
+            </w:pPr>
+            <w:r>
+              <w:rPr>
+                <w:rFonts w:ascii="Calibri" w:hAnsi="Calibri"/>
+                <w:b/>
+                <w:color w:val="000000"/>
+                <w:sz w:val="20"/>
+              </w:rPr>
+              <w:t xml:space="preserve">Publicar horarios con calendario (SC-21): </w:t>
+            </w:r>
+            <w:r>
+              <w:rPr>
+                <w:rFonts w:ascii="Calibri" w:hAnsi="Calibri"/>
+                <w:color w:val="000000"/>
+                <w:sz w:val="20"/>
+              </w:rPr>
+              <w:t>el mismo día, el profesional dejó de escribir la fecha de cada horario: la elige en el mismo calendario de la reserva, que no permite días pasados y marca los días con horarios ya publicados, y al lado indica la hora de inicio y de término, con una duración rápida. Sin cambios en la API ni en los datos (CP-092 y CP-093).</w:t>
+            </w:r>
+          </w:p>
+          <w:p>
+            <w:pPr>
+              <w:spacing w:after="80"/>
+            </w:pPr>
+            <w:r>
+              <w:rPr>
+                <w:rFonts w:ascii="Calibri" w:hAnsi="Calibri"/>
+                <w:b/>
+                <w:color w:val="000000"/>
+                <w:sz w:val="20"/>
+              </w:rPr>
               <w:t xml:space="preserve">Estado al 19-10-2026: </w:t>
             </w:r>
             <w:r>
@@ -865,7 +909,7 @@
                 <w:color w:val="000000"/>
                 <w:sz w:val="20"/>
               </w:rPr>
-              <w:t>el sistema suma 428 pruebas automatizadas (233 en el backend y 195 en el frontend) y 87 casos de prueba en la planilla (84 aprobados y 3 pendientes de ejecutar: CP-024, CP-025 y CP-078). Las evidencias se versionan en GitHub, se publican en el Drive del equipo y su avance se sigue en el tablero Trello.</w:t>
+              <w:t>el sistema suma 441 pruebas automatizadas (233 en el backend y 208 en el frontend) y 93 casos de prueba en la planilla (90 aprobados y 3 pendientes de ejecutar: CP-024, CP-025 y CP-078). Las evidencias se versionan en GitHub, se publican en el Drive del equipo y su avance se sigue en el tablero Trello.</w:t>
             </w:r>
           </w:p>
         </w:tc>
@@ -1302,7 +1346,7 @@
                 <w:color w:val="000000"/>
                 <w:sz w:val="20"/>
               </w:rPr>
-              <w:t>registra las 19 solicitudes de cambio del proyecto al 19-10-2026 (18 aceptadas y 1 rechazada), con su solicitante, tipo, urgencia, impacto, historias de usuario y casos de uso relacionados, y respalda los ajustes descritos en la sección 3 (C2).</w:t>
+              <w:t>registra las 21 solicitudes de cambio del proyecto al 19-10-2026 (20 aceptadas y 1 rechazada), con su solicitante, tipo, urgencia, impacto, historias de usuario y casos de uso relacionados, y respalda los ajustes descritos en la sección 3 (C2).</w:t>
             </w:r>
           </w:p>
           <w:p>
@@ -1368,7 +1412,7 @@
                 <w:color w:val="000000"/>
                 <w:sz w:val="20"/>
               </w:rPr>
-              <w:t>al 19-10-2026 hay 428 pruebas automatizadas y comprobaciones con MySQL real (npm run test:mysql:agenda, 55/55); la Planilla de Casos de Prueba tiene 87 casos (84 aprobados y 3 pendientes de ejecutar) y el Registro de Defectos 34 defectos: 31 corregidos y 3 abiertos del mapa nuevo (C1).</w:t>
+              <w:t>al 19-10-2026 hay 441 pruebas automatizadas y comprobaciones con MySQL real (npm run test:mysql:agenda, 55/55); la Planilla de Casos de Prueba tiene 93 casos (90 aprobados y 3 pendientes de ejecutar) y el Registro de Defectos 34 defectos: 31 corregidos y 3 abiertos del mapa nuevo (C1).</w:t>
             </w:r>
           </w:p>
           <w:p>
@@ -6773,6 +6817,28 @@
                 <w:sz w:val="20"/>
               </w:rPr>
               <w:t>al comenzar el Sprint 4, antes de su planificación, el Product Owner incorporó una revisión de la respuesta y el movimiento de la interfaz (SC-19), que corrigió los defectos 30 a 34. Es trabajo no planificado de bajo impacto: no cambia historias de usuario, endpoints ni el modelo de datos, y queda registrado en la Matriz de Control de Cambio, en el Registro de Defectos y en la Planilla de Casos de Prueba (CP-081 a CP-087).</w:t>
+            </w:r>
+          </w:p>
+          <w:p>
+            <w:pPr>
+              <w:spacing w:after="80"/>
+            </w:pPr>
+            <w:r>
+              <w:rPr>
+                <w:rFonts w:ascii="Calibri" w:hAnsi="Calibri"/>
+                <w:b/>
+                <w:color w:val="000000"/>
+                <w:sz w:val="20"/>
+              </w:rPr>
+              <w:t xml:space="preserve">Reserva con calendario (19-10-2026): </w:t>
+            </w:r>
+            <w:r>
+              <w:rPr>
+                <w:rFonts w:ascii="Calibri" w:hAnsi="Calibri"/>
+                <w:color w:val="000000"/>
+                <w:sz w:val="20"/>
+              </w:rPr>
+              <w:t>también al comenzar el Sprint 4, el Product Owner pidió cambiar la pantalla de reserva de FS-HU-14, ya aceptada, por un flujo de calendario (SC-20). Se mantuvieron sus criterios de aceptación: mensaje obligatorio, estados de la reserva y límite de una reserva activa con cada profesional; por ese límite no se incluyó el botón «Agendar otra» del modelo. El mismo calendario se usa desde entonces para que el profesional publique sus horarios (SC-21, FS-HU-13).</w:t>
             </w:r>
           </w:p>
           <w:p>

</xml_diff>

<commit_message>
Defecto 35, SC-22, SC-23 y SC-24: mapa en Chile, detalle en el mapa, buscador general y direccion de atencion
</commit_message>
<xml_diff>
--- a/FASE 2/Evidencias Grupales/2.4_GuiaEstudiante_Fase 2_DesarrolloProyecto APT (Español).docx
+++ b/FASE 2/Evidencias Grupales/2.4_GuiaEstudiante_Fase 2_DesarrolloProyecto APT (Español).docx
@@ -527,7 +527,7 @@
                 <w:color w:val="000000"/>
                 <w:sz w:val="20"/>
               </w:rPr>
-              <w:t xml:space="preserve">Documento de Arquitectura del Sistema (DAS) v1.22: </w:t>
+              <w:t xml:space="preserve">Documento de Arquitectura del Sistema (DAS) v1.24: </w:t>
             </w:r>
             <w:r>
               <w:rPr>
@@ -821,7 +821,7 @@
                 <w:color w:val="000000"/>
                 <w:sz w:val="20"/>
               </w:rPr>
-              <w:t>Luis Méndez las implementó y se fusionaron el 12-10-2026 (PR #21). El profesional publica horarios sin superposiciones, el usuario reserva con un mensaje obligatorio, el profesional confirma y cualquiera de los dos puede cancelar; si dos personas reservan el mismo horario a la vez, solo una lo obtiene. La búsqueda alterna entre lista y mapa; desde el 15-10-2026 el mapa usa MapLibre GL JS con teselas de OpenFreeMap, sin clave (SC-18, PR #27 de Nicolás Silva). Se verificó contra MySQL real con 39 comprobaciones; en la revisión se detectó y corrigió un error con las horas en punto (defecto 25). Las correcciones posteriores y el límite de una reserva activa por usuario con cada profesional (sin contar las citas pasadas, defecto 26) se fusionaron el 12-10-2026 (PR #22).</w:t>
+              <w:t>Luis Méndez las implementó y se fusionaron el 12-10-2026 (PR #21). El profesional publica horarios sin superposiciones, el usuario reserva con un mensaje obligatorio, el profesional confirma y cualquiera de los dos puede cancelar; si dos personas reservan el mismo horario a la vez, solo una lo obtiene. La búsqueda alterna entre lista y mapa; desde el 15-10-2026 el mapa usa MapLibre GL JS con teselas de OpenFreeMap, sin clave (SC-18, PR #27 de Nicolás Silva). Se verificó contra MySQL real con 39 comprobaciones; en la revisión se detectó y corrigió un error con las horas en punto (defecto 25). Las correcciones posteriores y el límite de una reserva activa por usuario con cada profesional (sin contar las citas pasadas, defecto 26) se fusionaron el 12-10-2026 (PR #22). El 19-10-2026 el mapa quedó limitado a Chile: una ficha de prueba con coordenadas fuera del país lo alejaba hasta mostrar media Sudamérica (defecto 35, corregido). Ese día, además, la ventana de cada marcador pasó a mostrar la especialidad, si el profesional está verificado, dónde atiende y su próxima hora disponible (SC-22), y también se abre con el teclado (defecto 28, corregido).</w:t>
             </w:r>
           </w:p>
           <w:p>
@@ -901,6 +901,50 @@
                 <w:color w:val="000000"/>
                 <w:sz w:val="20"/>
               </w:rPr>
+              <w:t xml:space="preserve">Buscador general del Inicio (SC-23): </w:t>
+            </w:r>
+            <w:r>
+              <w:rPr>
+                <w:rFonts w:ascii="Calibri" w:hAnsi="Calibri"/>
+                <w:color w:val="000000"/>
+                <w:sz w:val="20"/>
+              </w:rPr>
+              <w:t>el buscador «¿Qué necesitas hoy?», que solo buscaba profesionales, ahora sirve para recorrer la aplicación: mientras se escribe sugiere secciones (por ejemplo, «chat» lleva al Asistente IA y «reservas» a Mis citas), especialidades del directorio y, al final, buscar el texto en profesionales. Se usa con el teclado o el mouse (CP-097 y CP-098).</w:t>
+            </w:r>
+          </w:p>
+          <w:p>
+            <w:pPr>
+              <w:spacing w:after="80"/>
+            </w:pPr>
+            <w:r>
+              <w:rPr>
+                <w:rFonts w:ascii="Calibri" w:hAnsi="Calibri"/>
+                <w:b/>
+                <w:color w:val="000000"/>
+                <w:sz w:val="20"/>
+              </w:rPr>
+              <w:t xml:space="preserve">Dirección de atención del profesional (SC-24): </w:t>
+            </w:r>
+            <w:r>
+              <w:rPr>
+                <w:rFonts w:ascii="Calibri" w:hAnsi="Calibri"/>
+                <w:color w:val="000000"/>
+                <w:sz w:val="20"/>
+              </w:rPr>
+              <w:t>la ficha del profesional incorpora su dirección de atención, obligatoria si atiende presencial y opcional si atiende solo online, que se muestra en su ficha, en la ventana del mapa y al reservar; además, las coordenadas de la ficha deben estar en Chile, lo que evita que el mapa vuelva a alejarse por una ubicación errónea. Se registró en el DAS 1.24 (CP-099 y CP-100).</w:t>
+            </w:r>
+          </w:p>
+          <w:p>
+            <w:pPr>
+              <w:spacing w:after="80"/>
+            </w:pPr>
+            <w:r>
+              <w:rPr>
+                <w:rFonts w:ascii="Calibri" w:hAnsi="Calibri"/>
+                <w:b/>
+                <w:color w:val="000000"/>
+                <w:sz w:val="20"/>
+              </w:rPr>
               <w:t xml:space="preserve">Estado al 19-10-2026: </w:t>
             </w:r>
             <w:r>
@@ -909,7 +953,7 @@
                 <w:color w:val="000000"/>
                 <w:sz w:val="20"/>
               </w:rPr>
-              <w:t>el sistema suma 441 pruebas automatizadas (233 en el backend y 208 en el frontend) y 93 casos de prueba en la planilla (90 aprobados y 3 pendientes de ejecutar: CP-024, CP-025 y CP-078). Las evidencias se versionan en GitHub, se publican en el Drive del equipo y su avance se sigue en el tablero Trello.</w:t>
+              <w:t>el sistema suma 472 pruebas automatizadas (241 en el backend y 231 en el frontend) y 100 casos de prueba en la planilla (97 aprobados y 3 pendientes de ejecutar: CP-024, CP-025 y CP-078). Las evidencias se versionan en GitHub, se publican en el Drive del equipo y su avance se sigue en el tablero Trello.</w:t>
             </w:r>
           </w:p>
         </w:tc>
@@ -1346,7 +1390,7 @@
                 <w:color w:val="000000"/>
                 <w:sz w:val="20"/>
               </w:rPr>
-              <w:t>registra las 21 solicitudes de cambio del proyecto al 19-10-2026 (20 aceptadas y 1 rechazada), con su solicitante, tipo, urgencia, impacto, historias de usuario y casos de uso relacionados, y respalda los ajustes descritos en la sección 3 (C2).</w:t>
+              <w:t>registra las 24 solicitudes de cambio del proyecto al 19-10-2026 (23 aceptadas y 1 rechazada), con su solicitante, tipo, urgencia, impacto, historias de usuario y casos de uso relacionados, y respalda los ajustes descritos en la sección 3 (C2).</w:t>
             </w:r>
           </w:p>
           <w:p>
@@ -1412,7 +1456,7 @@
                 <w:color w:val="000000"/>
                 <w:sz w:val="20"/>
               </w:rPr>
-              <w:t>al 19-10-2026 hay 441 pruebas automatizadas y comprobaciones con MySQL real (npm run test:mysql:agenda, 55/55); la Planilla de Casos de Prueba tiene 93 casos (90 aprobados y 3 pendientes de ejecutar) y el Registro de Defectos 34 defectos: 31 corregidos y 3 abiertos del mapa nuevo (C1).</w:t>
+              <w:t>al 19-10-2026 hay 472 pruebas automatizadas y comprobaciones con MySQL real (npm run test:mysql:agenda, 55/55); la Planilla de Casos de Prueba tiene 100 casos (97 aprobados y 3 pendientes de ejecutar) y el Registro de Defectos 35 defectos: 33 corregidos y 2 abiertos del mapa nuevo (C1).</w:t>
             </w:r>
           </w:p>
           <w:p>
@@ -6838,7 +6882,7 @@
                 <w:color w:val="000000"/>
                 <w:sz w:val="20"/>
               </w:rPr>
-              <w:t>también al comenzar el Sprint 4, el Product Owner pidió cambiar la pantalla de reserva de FS-HU-14, ya aceptada, por un flujo de calendario (SC-20). Se mantuvieron sus criterios de aceptación: mensaje obligatorio, estados de la reserva y límite de una reserva activa con cada profesional; por ese límite no se incluyó el botón «Agendar otra» del modelo. El mismo calendario se usa desde entonces para que el profesional publique sus horarios (SC-21, FS-HU-13).</w:t>
+              <w:t>también al comenzar el Sprint 4, el Product Owner pidió cambiar la pantalla de reserva de FS-HU-14, ya aceptada, por un flujo de calendario (SC-20). Se mantuvieron sus criterios de aceptación: mensaje obligatorio, estados de la reserva y límite de una reserva activa con cada profesional; por ese límite no se incluyó el botón «Agendar otra» del modelo. El mismo calendario se usa desde entonces para que el profesional publique sus horarios (SC-21, FS-HU-13), y la ventana de cada marcador del mapa muestra el detalle del profesional (SC-22, FS-HU-06). El buscador del Inicio pasó a recorrer la aplicación (SC-23, FS-HU-21), y la ficha del profesional sumó la dirección de atención con coordenadas limitadas a Chile (SC-24, FS-HU-04; DAS 1.24); es el único de estos cambios que modifica el modelo de datos, con una columna opcional cuya migración no altera las fichas existentes.</w:t>
             </w:r>
           </w:p>
           <w:p>

</xml_diff>